<commit_message>
docs: update OULAD benchmark references
</commit_message>
<xml_diff>
--- a/docs/artikel-ieee/Artikel IEEE - Early Warning OULAD.docx
+++ b/docs/artikel-ieee/Artikel IEEE - Early Warning OULAD.docx
@@ -559,7 +559,7 @@
           <w:color w:val="000000"/>
           <w:sz w:val="18"/>
         </w:rPr>
-        <w:t xml:space="preserve"> cross-validation tertinggi sebesar 0,7126. Pada hold-out test, model tersebut menghasilkan accuracy 0,7592, precision 0,8032, recall 0,7172, F1-score 0,7578, dan ROC-AUC 0,8396. Knowledge-based risk layer menggabungkan prediksi model dengan empat indikator perilaku awal untuk menghasilkan level </w:t>
+        <w:t xml:space="preserve"> cross-validation tertinggi sebesar 0,7107. Pada hold-out test, model tersebut menghasilkan accuracy 0,7594, precision 0,8007, recall 0,7213, F1-score 0,7589, dan ROC-AUC 0,8396. Knowledge-based risk layer menggabungkan prediksi model dengan empat indikator perilaku awal untuk menghasilkan level </w:t>
       </w:r>
       <w:r>
         <w:rPr>
@@ -619,7 +619,7 @@
           <w:color w:val="000000"/>
           <w:sz w:val="18"/>
         </w:rPr>
-        <w:t xml:space="preserve"> beserta alasan dan rekomendasi intervensi. Sistem gabungan meningkatkan recall menjadi 0,7849 dengan precision 0,7039. Hasil analitik disajikan melalui dashboard statis yang memuat indikator risiko, prioritas module-presentation, sinyal dominan, dan daftar mahasiswa untuk mendukung monitoring akademik. Pendekatan ini menyediakan integrasi prediksi, interpretasi berbasis aturan, dan visual decision support untuk intervensi dini.</w:t>
+        <w:t xml:space="preserve"> beserta alasan dan rekomendasi intervensi. Sistem gabungan meningkatkan recall menjadi 0,7866 dengan precision 0,7043. Hasil analitik disajikan melalui dashboard statis yang memuat indikator risiko, prioritas module-presentation, sinyal dominan, dan daftar mahasiswa untuk mendukung monitoring akademik. Pendekatan ini menyediakan integrasi prediksi, interpretasi berbasis aturan, dan visual decision support untuk intervensi dini.</w:t>
       </w:r>
     </w:p>
     <w:p>
@@ -818,7 +818,7 @@
           <w:color w:val="000000"/>
           <w:sz w:val="20"/>
         </w:rPr>
-        <w:t>Penelitian student dropout analytics memanfaatkan data akademik, sosiodemografis, dan aktivitas digital untuk memprediksi keberlanjutan studi. Informasi awal seperti karakteristik sosiodemografis, riwayat akademik, dan engagement digital memiliki nilai prediktif terhadap retensi mahasiswa [1]. Pendekatan hybrid berbasis digital educational history juga menunjukkan manfaat integrasi beberapa sumber data untuk identifikasi mahasiswa berisiko secara dini [5]. Kedua arah penelitian tersebut menempatkan risiko dropout sebagai hasil interaksi faktor akademik, perilaku belajar, dan konteks mahasiswa.</w:t>
+        <w:t>Penelitian student dropout analytics memanfaatkan data akademik, sosiodemografis, dan aktivitas digital untuk memprediksi keberlanjutan studi. Informasi awal seperti karakteristik sosiodemografis, riwayat akademik, dan engagement digital memiliki nilai prediktif terhadap retensi mahasiswa [1]. Risiko dropout terbentuk melalui interaksi faktor akademik, perilaku belajar, dan konteks mahasiswa.</w:t>
       </w:r>
     </w:p>
     <w:p>
@@ -835,7 +835,87 @@
           <w:color w:val="000000"/>
           <w:sz w:val="20"/>
         </w:rPr>
-        <w:t>Early warning system mengarahkan hasil prediksi pada proses intervensi. Plak et al. menunjukkan bahwa informasi risiko perlu disertai rancangan tindak lanjut agar dapat memengaruhi hasil akademik [2]. Temuan tersebut menegaskan peran proses bisnis, kapasitas intervensi, dan komunikasi informasi kepada konselor atau pengelola akademik. Model dengan recall tinggi memberi cakupan deteksi yang luas, sedangkan precision menentukan proporsi alarm yang relevan untuk ditindaklanjuti.</w:t>
+        <w:t xml:space="preserve">Early warning system mengarahkan hasil prediksi pada proses intervensi. Plak et al. menunjukkan bahwa informasi risiko perlu disertai rancangan tindak lanjut agar dapat memengaruhi hasil akademik [2]. Shou et al. menggunakan OULAD untuk memprediksi performa mahasiswa melalui multidimensional time-series yang menggabungkan learning behavior, assessment score, dan informasi demografis. Pada 20% durasi course, model MTAPSP harian mencapai accuracy 0,9179 dan F1-score 0,9180 untuk target biner </w:t>
+      </w:r>
+      <w:r>
+        <w:rPr>
+          <w:rFonts w:ascii="Times New Roman" w:hAnsi="Times New Roman"/>
+          <w:b w:val="0"/>
+          <w:i/>
+          <w:color w:val="000000"/>
+          <w:sz w:val="20"/>
+        </w:rPr>
+        <w:t>Pass</w:t>
+      </w:r>
+      <w:r>
+        <w:rPr>
+          <w:rFonts w:ascii="Times New Roman" w:hAnsi="Times New Roman"/>
+          <w:b w:val="0"/>
+          <w:i w:val="0"/>
+          <w:color w:val="000000"/>
+          <w:sz w:val="20"/>
+        </w:rPr>
+        <w:t xml:space="preserve"> serta </w:t>
+      </w:r>
+      <w:r>
+        <w:rPr>
+          <w:rFonts w:ascii="Times New Roman" w:hAnsi="Times New Roman"/>
+          <w:b w:val="0"/>
+          <w:i/>
+          <w:color w:val="000000"/>
+          <w:sz w:val="20"/>
+        </w:rPr>
+        <w:t>Distinction</w:t>
+      </w:r>
+      <w:r>
+        <w:rPr>
+          <w:rFonts w:ascii="Times New Roman" w:hAnsi="Times New Roman"/>
+          <w:b w:val="0"/>
+          <w:i w:val="0"/>
+          <w:color w:val="000000"/>
+          <w:sz w:val="20"/>
+        </w:rPr>
+        <w:t xml:space="preserve"> terhadap </w:t>
+      </w:r>
+      <w:r>
+        <w:rPr>
+          <w:rFonts w:ascii="Times New Roman" w:hAnsi="Times New Roman"/>
+          <w:b w:val="0"/>
+          <w:i/>
+          <w:color w:val="000000"/>
+          <w:sz w:val="20"/>
+        </w:rPr>
+        <w:t>Fail</w:t>
+      </w:r>
+      <w:r>
+        <w:rPr>
+          <w:rFonts w:ascii="Times New Roman" w:hAnsi="Times New Roman"/>
+          <w:b w:val="0"/>
+          <w:i w:val="0"/>
+          <w:color w:val="000000"/>
+          <w:sz w:val="20"/>
+        </w:rPr>
+        <w:t xml:space="preserve"> serta </w:t>
+      </w:r>
+      <w:r>
+        <w:rPr>
+          <w:rFonts w:ascii="Times New Roman" w:hAnsi="Times New Roman"/>
+          <w:b w:val="0"/>
+          <w:i/>
+          <w:color w:val="000000"/>
+          <w:sz w:val="20"/>
+        </w:rPr>
+        <w:t>Withdrawn</w:t>
+      </w:r>
+      <w:r>
+        <w:rPr>
+          <w:rFonts w:ascii="Times New Roman" w:hAnsi="Times New Roman"/>
+          <w:b w:val="0"/>
+          <w:i w:val="0"/>
+          <w:color w:val="000000"/>
+          <w:sz w:val="20"/>
+        </w:rPr>
+        <w:t xml:space="preserve"> [5]. Temuan tersebut menegaskan bahwa horizon pengamatan menjadi bagian penting dalam membaca performa early warning.</w:t>
       </w:r>
     </w:p>
     <w:p>
@@ -852,7 +932,127 @@
           <w:color w:val="000000"/>
           <w:sz w:val="20"/>
         </w:rPr>
-        <w:t>Aktivitas Learning Management System atau VLE banyak digunakan sebagai sumber fitur karena merepresentasikan pola engagement mahasiswa. Data klik, frekuensi aktivitas, hari aktif, jenis materi, dan pola interaksi dapat mendukung analisis performa akademik [3]. XGBoost telah digunakan untuk early warning berbasis data pra-enrollment [6], AutoML mendukung eksplorasi educational analytics [7], dan statistical learning serta deep learning digunakan pada precision education [8]. Random Forest juga sesuai untuk data tabular yang memuat kombinasi fitur akademik dan sosiodemografis [9].</w:t>
+        <w:t xml:space="preserve">Penelitian berbasis OULAD terus berkembang melalui kombinasi fitur assessment, aktivitas VLE, dan profil mahasiswa. Jawad et al. menerapkan Random Forest dengan SMOTE pada enam horizon dan memperoleh testing accuracy 0,892 serta ROC-AUC 0,96 pada skenario 260 hari [6]. Balabied dan Eid melaporkan accuracy serta F1-score 0,90 menggunakan Random Forest untuk klasifikasi biner [7]. Ujkani et al. menggabungkan </w:t>
+      </w:r>
+      <w:r>
+        <w:rPr>
+          <w:rFonts w:ascii="Times New Roman" w:hAnsi="Times New Roman"/>
+          <w:b w:val="0"/>
+          <w:i/>
+          <w:color w:val="000000"/>
+          <w:sz w:val="20"/>
+        </w:rPr>
+        <w:t>Fail</w:t>
+      </w:r>
+      <w:r>
+        <w:rPr>
+          <w:rFonts w:ascii="Times New Roman" w:hAnsi="Times New Roman"/>
+          <w:b w:val="0"/>
+          <w:i w:val="0"/>
+          <w:color w:val="000000"/>
+          <w:sz w:val="20"/>
+        </w:rPr>
+        <w:t xml:space="preserve"> dan </w:t>
+      </w:r>
+      <w:r>
+        <w:rPr>
+          <w:rFonts w:ascii="Times New Roman" w:hAnsi="Times New Roman"/>
+          <w:b w:val="0"/>
+          <w:i/>
+          <w:color w:val="000000"/>
+          <w:sz w:val="20"/>
+        </w:rPr>
+        <w:t>Withdrawn</w:t>
+      </w:r>
+      <w:r>
+        <w:rPr>
+          <w:rFonts w:ascii="Times New Roman" w:hAnsi="Times New Roman"/>
+          <w:b w:val="0"/>
+          <w:i w:val="0"/>
+          <w:color w:val="000000"/>
+          <w:sz w:val="20"/>
+        </w:rPr>
+        <w:t xml:space="preserve"> sebagai kelas at-risk dan memperoleh accuracy 0,93 menggunakan custom neural network [8]. Alnasyan et al. menggunakan target biner </w:t>
+      </w:r>
+      <w:r>
+        <w:rPr>
+          <w:rFonts w:ascii="Times New Roman" w:hAnsi="Times New Roman"/>
+          <w:b w:val="0"/>
+          <w:i/>
+          <w:color w:val="000000"/>
+          <w:sz w:val="20"/>
+        </w:rPr>
+        <w:t>Pass</w:t>
+      </w:r>
+      <w:r>
+        <w:rPr>
+          <w:rFonts w:ascii="Times New Roman" w:hAnsi="Times New Roman"/>
+          <w:b w:val="0"/>
+          <w:i w:val="0"/>
+          <w:color w:val="000000"/>
+          <w:sz w:val="20"/>
+        </w:rPr>
+        <w:t xml:space="preserve"> dan </w:t>
+      </w:r>
+      <w:r>
+        <w:rPr>
+          <w:rFonts w:ascii="Times New Roman" w:hAnsi="Times New Roman"/>
+          <w:b w:val="0"/>
+          <w:i/>
+          <w:color w:val="000000"/>
+          <w:sz w:val="20"/>
+        </w:rPr>
+        <w:t>Distinction</w:t>
+      </w:r>
+      <w:r>
+        <w:rPr>
+          <w:rFonts w:ascii="Times New Roman" w:hAnsi="Times New Roman"/>
+          <w:b w:val="0"/>
+          <w:i w:val="0"/>
+          <w:color w:val="000000"/>
+          <w:sz w:val="20"/>
+        </w:rPr>
+        <w:t xml:space="preserve"> terhadap </w:t>
+      </w:r>
+      <w:r>
+        <w:rPr>
+          <w:rFonts w:ascii="Times New Roman" w:hAnsi="Times New Roman"/>
+          <w:b w:val="0"/>
+          <w:i/>
+          <w:color w:val="000000"/>
+          <w:sz w:val="20"/>
+        </w:rPr>
+        <w:t>Fail</w:t>
+      </w:r>
+      <w:r>
+        <w:rPr>
+          <w:rFonts w:ascii="Times New Roman" w:hAnsi="Times New Roman"/>
+          <w:b w:val="0"/>
+          <w:i w:val="0"/>
+          <w:color w:val="000000"/>
+          <w:sz w:val="20"/>
+        </w:rPr>
+        <w:t xml:space="preserve"> dan </w:t>
+      </w:r>
+      <w:r>
+        <w:rPr>
+          <w:rFonts w:ascii="Times New Roman" w:hAnsi="Times New Roman"/>
+          <w:b w:val="0"/>
+          <w:i/>
+          <w:color w:val="000000"/>
+          <w:sz w:val="20"/>
+        </w:rPr>
+        <w:t>Withdrawn</w:t>
+      </w:r>
+      <w:r>
+        <w:rPr>
+          <w:rFonts w:ascii="Times New Roman" w:hAnsi="Times New Roman"/>
+          <w:b w:val="0"/>
+          <w:i w:val="0"/>
+          <w:color w:val="000000"/>
+          <w:sz w:val="20"/>
+        </w:rPr>
+        <w:t>; KANFormer mencapai accuracy 0,9459 dan F1-score 0,9481 [9]. Kesamaan dataset menempatkan kelima studi tersebut sebagai benchmark berbasis OULAD. Kesamaan definisi target pada Shou et al., Ujkani et al., dan Alnasyan et al. memperkuat kedekatan skenario, sedangkan perbedaan horizon, split, balancing, dan arsitektur model membentuk konteks perbandingan.</w:t>
       </w:r>
     </w:p>
     <w:p>
@@ -869,7 +1069,7 @@
           <w:color w:val="000000"/>
           <w:sz w:val="20"/>
         </w:rPr>
-        <w:t>Penelitian lain menunjukkan hubungan antara personality, engagement, pola penggunaan LMS, dan performa belajar [10]. Analisis lintas institusi memperluas cakupan prediksi dropout pada level sistem pendidikan tinggi [11]. Keragaman pendekatan tersebut menunjukkan bahwa pemilihan fitur, horizon waktu, dan konteks institusi menentukan interpretasi performa model.</w:t>
+        <w:t>Pendekatan hybrid berbasis digital educational history menunjukkan manfaat integrasi beberapa sumber data untuk identifikasi mahasiswa berisiko [10]. XGBoost telah digunakan untuk early warning berbasis data pra-enrollment [11], AutoML mendukung eksplorasi educational analytics [12], dan statistical learning serta deep learning digunakan pada precision education [13]. Phased prediction memperlihatkan perubahan performa model pada beberapa tahap semester [14]. Penelitian lain menghubungkan personality, pola penggunaan LMS, dan performa belajar [15], sedangkan analisis lintas institusi memperluas cakupan prediksi dropout pada level sistem pendidikan tinggi [16]. Keragaman pendekatan tersebut menunjukkan bahwa pemilihan fitur, horizon waktu, dan konteks institusi menentukan interpretasi performa model.</w:t>
       </w:r>
     </w:p>
     <w:p>
@@ -3260,7 +3460,7 @@
           <w:color w:val="000000"/>
           <w:sz w:val="20"/>
         </w:rPr>
-        <w:t xml:space="preserve"> tertinggi sebesar 0,7126 dan F1-score 0,7536. XGBoost menghasilkan accuracy dan ROC-AUC tertinggi, masing-masing sebesar 0,7582 dan 0,8440. Berdasarkan kriteria pemilihan yang memprioritaskan recall, Random Forest dipilih sebagai model final.</w:t>
+        <w:t xml:space="preserve"> tertinggi sebesar 0,7107. XGBoost menghasilkan accuracy, F1-score, dan ROC-AUC tertinggi, masing-masing sebesar 0,7584, 0,7522, dan 0,8440. Berdasarkan kriteria pemilihan yang memprioritaskan recall, Random Forest dipilih sebagai model final.</w:t>
       </w:r>
     </w:p>
     <w:p>
@@ -3481,7 +3681,7 @@
                 <w:color w:val="000000"/>
                 <w:sz w:val="13"/>
               </w:rPr>
-              <w:t>0,7484 ± 0,0033</w:t>
+              <w:t>0,7496 ± 0,0039</w:t>
             </w:r>
           </w:p>
         </w:tc>
@@ -3510,7 +3710,7 @@
                 <w:color w:val="000000"/>
                 <w:sz w:val="13"/>
               </w:rPr>
-              <w:t>0,7538 ± 0,0033</w:t>
+              <w:t>0,7524 ± 0,0013</w:t>
             </w:r>
           </w:p>
         </w:tc>
@@ -3539,7 +3739,7 @@
                 <w:color w:val="000000"/>
                 <w:sz w:val="13"/>
               </w:rPr>
-              <w:t>0,7582 ± 0,0041</w:t>
+              <w:t>0,7584 ± 0,0024</w:t>
             </w:r>
           </w:p>
         </w:tc>
@@ -3599,7 +3799,7 @@
                 <w:color w:val="000000"/>
                 <w:sz w:val="13"/>
               </w:rPr>
-              <w:t>0,8081 ± 0,0063</w:t>
+              <w:t>0,8090 ± 0,0059</w:t>
             </w:r>
           </w:p>
         </w:tc>
@@ -3628,7 +3828,7 @@
                 <w:color w:val="000000"/>
                 <w:sz w:val="13"/>
               </w:rPr>
-              <w:t>0,7999 ± 0,0148</w:t>
+              <w:t>0,7989 ± 0,0136</w:t>
             </w:r>
           </w:p>
         </w:tc>
@@ -3657,7 +3857,7 @@
                 <w:color w:val="000000"/>
                 <w:sz w:val="13"/>
               </w:rPr>
-              <w:t>0,8217 ± 0,0093</w:t>
+              <w:t>0,8215 ± 0,0096</w:t>
             </w:r>
           </w:p>
         </w:tc>
@@ -3717,7 +3917,7 @@
                 <w:color w:val="000000"/>
                 <w:sz w:val="13"/>
               </w:rPr>
-              <w:t>0,6871 ± 0,0038</w:t>
+              <w:t>0,6889 ± 0,0064</w:t>
             </w:r>
           </w:p>
         </w:tc>
@@ -3746,7 +3946,7 @@
                 <w:color w:val="000000"/>
                 <w:sz w:val="13"/>
               </w:rPr>
-              <w:t>0,7126 ± 0,0040</w:t>
+              <w:t>0,7107 ± 0,0085</w:t>
             </w:r>
           </w:p>
         </w:tc>
@@ -3775,7 +3975,7 @@
                 <w:color w:val="000000"/>
                 <w:sz w:val="13"/>
               </w:rPr>
-              <w:t>0,6931 ± 0,0033</w:t>
+              <w:t>0,6938 ± 0,0029</w:t>
             </w:r>
           </w:p>
         </w:tc>
@@ -3835,7 +4035,7 @@
                 <w:color w:val="000000"/>
                 <w:sz w:val="13"/>
               </w:rPr>
-              <w:t>0,7427 ± 0,0043</w:t>
+              <w:t>0,7442 ± 0,0059</w:t>
             </w:r>
           </w:p>
         </w:tc>
@@ -3859,12 +4059,12 @@
             <w:r>
               <w:rPr>
                 <w:rFonts w:ascii="Times New Roman" w:hAnsi="Times New Roman"/>
-                <w:b/>
+                <w:b w:val="0"/>
                 <w:i w:val="0"/>
                 <w:color w:val="000000"/>
                 <w:sz w:val="13"/>
               </w:rPr>
-              <w:t>0,7536 ± 0,0050</w:t>
+              <w:t>0,7521 ± 0,0030</w:t>
             </w:r>
           </w:p>
         </w:tc>
@@ -3888,12 +4088,12 @@
             <w:r>
               <w:rPr>
                 <w:rFonts w:ascii="Times New Roman" w:hAnsi="Times New Roman"/>
-                <w:b w:val="0"/>
+                <w:b/>
                 <w:i w:val="0"/>
                 <w:color w:val="000000"/>
                 <w:sz w:val="13"/>
               </w:rPr>
-              <w:t>0,7519 ± 0,0028</w:t>
+              <w:t>0,7522 ± 0,0039</w:t>
             </w:r>
           </w:p>
         </w:tc>
@@ -3953,7 +4153,7 @@
                 <w:color w:val="000000"/>
                 <w:sz w:val="13"/>
               </w:rPr>
-              <w:t>0,8324 ± 0,0028</w:t>
+              <w:t>0,8330 ± 0,0027</w:t>
             </w:r>
           </w:p>
         </w:tc>
@@ -3982,7 +4182,7 @@
                 <w:color w:val="000000"/>
                 <w:sz w:val="13"/>
               </w:rPr>
-              <w:t>0,8362 ± 0,0026</w:t>
+              <w:t>0,8362 ± 0,0023</w:t>
             </w:r>
           </w:p>
         </w:tc>
@@ -4011,7 +4211,7 @@
                 <w:color w:val="000000"/>
                 <w:sz w:val="13"/>
               </w:rPr>
-              <w:t>0,8440 ± 0,0020</w:t>
+              <w:t>0,8440 ± 0,0019</w:t>
             </w:r>
           </w:p>
         </w:tc>
@@ -4053,7 +4253,7 @@
           <w:color w:val="000000"/>
           <w:sz w:val="20"/>
         </w:rPr>
-        <w:t xml:space="preserve">Tabel II memperlihatkan performa pada hold-out test. Random Forest mencapai accuracy 0,7592, precision </w:t>
+        <w:t xml:space="preserve">Tabel II memperlihatkan performa pada hold-out test. Random Forest mencapai accuracy 0,7594, precision </w:t>
       </w:r>
       <w:r>
         <w:rPr>
@@ -4073,7 +4273,7 @@
           <w:color w:val="000000"/>
           <w:sz w:val="20"/>
         </w:rPr>
-        <w:t xml:space="preserve"> 0,8032, recall 0,7172, F1-score 0,7578, dan ROC-AUC 0,8396. XGBoost menghasilkan accuracy 0,7633 dan ROC-AUC 0,8440, sedangkan recall </w:t>
+        <w:t xml:space="preserve"> 0,8007, recall 0,7213, F1-score 0,7589, dan ROC-AUC 0,8396. XGBoost menghasilkan accuracy 0,7611 dan ROC-AUC 0,8443, sedangkan recall </w:t>
       </w:r>
       <w:r>
         <w:rPr>
@@ -4093,7 +4293,7 @@
           <w:color w:val="000000"/>
           <w:sz w:val="20"/>
         </w:rPr>
-        <w:t xml:space="preserve"> berada pada 0,7054. Logistic Regression menghasilkan recall terendah sebesar 0,6869.</w:t>
+        <w:t xml:space="preserve"> berada pada 0,7045. Logistic Regression menghasilkan recall 0,6904.</w:t>
       </w:r>
     </w:p>
     <w:p>
@@ -4314,7 +4514,7 @@
                 <w:color w:val="000000"/>
                 <w:sz w:val="13"/>
               </w:rPr>
-              <w:t>0,7476</w:t>
+              <w:t>0,7487</w:t>
             </w:r>
           </w:p>
         </w:tc>
@@ -4343,7 +4543,7 @@
                 <w:color w:val="000000"/>
                 <w:sz w:val="13"/>
               </w:rPr>
-              <w:t>0,7592</w:t>
+              <w:t>0,7594</w:t>
             </w:r>
           </w:p>
         </w:tc>
@@ -4372,7 +4572,7 @@
                 <w:color w:val="000000"/>
                 <w:sz w:val="13"/>
               </w:rPr>
-              <w:t>0,7633</w:t>
+              <w:t>0,7611</w:t>
             </w:r>
           </w:p>
         </w:tc>
@@ -4432,7 +4632,7 @@
                 <w:color w:val="000000"/>
                 <w:sz w:val="13"/>
               </w:rPr>
-              <w:t>0,8040</w:t>
+              <w:t>0,8034</w:t>
             </w:r>
           </w:p>
         </w:tc>
@@ -4461,7 +4661,7 @@
                 <w:color w:val="000000"/>
                 <w:sz w:val="13"/>
               </w:rPr>
-              <w:t>0,8032</w:t>
+              <w:t>0,8007</w:t>
             </w:r>
           </w:p>
         </w:tc>
@@ -4490,7 +4690,7 @@
                 <w:color w:val="000000"/>
                 <w:sz w:val="13"/>
               </w:rPr>
-              <w:t>0,8186</w:t>
+              <w:t>0,8154</w:t>
             </w:r>
           </w:p>
         </w:tc>
@@ -4550,7 +4750,7 @@
                 <w:color w:val="000000"/>
                 <w:sz w:val="13"/>
               </w:rPr>
-              <w:t>0,6869</w:t>
+              <w:t>0,6904</w:t>
             </w:r>
           </w:p>
         </w:tc>
@@ -4579,7 +4779,7 @@
                 <w:color w:val="000000"/>
                 <w:sz w:val="13"/>
               </w:rPr>
-              <w:t>0,7172</w:t>
+              <w:t>0,7213</w:t>
             </w:r>
           </w:p>
         </w:tc>
@@ -4608,7 +4808,7 @@
                 <w:color w:val="000000"/>
                 <w:sz w:val="13"/>
               </w:rPr>
-              <w:t>0,7054</w:t>
+              <w:t>0,7045</w:t>
             </w:r>
           </w:p>
         </w:tc>
@@ -4668,7 +4868,7 @@
                 <w:color w:val="000000"/>
                 <w:sz w:val="13"/>
               </w:rPr>
-              <w:t>0,7408</w:t>
+              <w:t>0,7426</w:t>
             </w:r>
           </w:p>
         </w:tc>
@@ -4697,7 +4897,7 @@
                 <w:color w:val="000000"/>
                 <w:sz w:val="13"/>
               </w:rPr>
-              <w:t>0,7578</w:t>
+              <w:t>0,7589</w:t>
             </w:r>
           </w:p>
         </w:tc>
@@ -4721,12 +4921,12 @@
             <w:r>
               <w:rPr>
                 <w:rFonts w:ascii="Times New Roman" w:hAnsi="Times New Roman"/>
-                <w:b/>
+                <w:b w:val="0"/>
                 <w:i w:val="0"/>
                 <w:color w:val="000000"/>
                 <w:sz w:val="13"/>
               </w:rPr>
-              <w:t>0,7578</w:t>
+              <w:t>0,7559</w:t>
             </w:r>
           </w:p>
         </w:tc>
@@ -4786,7 +4986,7 @@
                 <w:color w:val="000000"/>
                 <w:sz w:val="13"/>
               </w:rPr>
-              <w:t>0,8298</w:t>
+              <w:t>0,8311</w:t>
             </w:r>
           </w:p>
         </w:tc>
@@ -4844,7 +5044,7 @@
                 <w:color w:val="000000"/>
                 <w:sz w:val="13"/>
               </w:rPr>
-              <w:t>0,8440</w:t>
+              <w:t>0,8443</w:t>
             </w:r>
           </w:p>
         </w:tc>
@@ -5004,7 +5204,7 @@
           <w:color w:val="000000"/>
           <w:sz w:val="20"/>
         </w:rPr>
-        <w:t xml:space="preserve">Setelah model dipilih, pola kesalahan Random Forest diperiksa untuk memahami risiko operasionalnya. Model tersebut berhasil mengenali 2.437 kasus </w:t>
+        <w:t xml:space="preserve">Setelah model dipilih, pola kesalahan Random Forest diperiksa untuk memahami risiko operasionalnya. Model tersebut berhasil mengenali 2.451 kasus </w:t>
       </w:r>
       <w:r>
         <w:rPr>
@@ -5024,7 +5224,7 @@
           <w:color w:val="000000"/>
           <w:sz w:val="20"/>
         </w:rPr>
-        <w:t>, tetapi masih melewatkan 961 kasus yang seharusnya masuk kelompok berisiko. Temuan ini menunjukkan bahwa sistem sudah cukup kuat untuk menyaring sebagian besar mahasiswa berisiko, namun tetap membutuhkan lapisan prioritas dan verifikasi agar kasus yang belum terdeteksi dapat diminimalkan.</w:t>
+        <w:t xml:space="preserve"> dan melewatkan 947 kasus yang masuk kelompok berisiko. Hasil ini menggambarkan cakupan deteksi model sebelum keluaran prediksi diterjemahkan menjadi prioritas intervensi.</w:t>
       </w:r>
     </w:p>
     <w:p>
@@ -5186,7 +5386,7 @@
       <w:r>
         <w:drawing>
           <wp:inline xmlns:a="http://schemas.openxmlformats.org/drawingml/2006/main" xmlns:pic="http://schemas.openxmlformats.org/drawingml/2006/picture">
-            <wp:extent cx="2971800" cy="1760174"/>
+            <wp:extent cx="2971800" cy="1763751"/>
             <wp:docPr id="6" name="Picture 6" descr="Fig. 6. Lima belas fitur dengan feature importance tertinggi pada Random Forest." title="Fig"/>
             <wp:cNvGraphicFramePr>
               <a:graphicFrameLocks noChangeAspect="1"/>
@@ -5207,7 +5407,7 @@
                   <pic:spPr>
                     <a:xfrm>
                       <a:off x="0" y="0"/>
-                      <a:ext cx="2971800" cy="1760174"/>
+                      <a:ext cx="2971800" cy="1763751"/>
                     </a:xfrm>
                     <a:prstGeom prst="rect"/>
                   </pic:spPr>
@@ -5249,7 +5449,7 @@
           <w:color w:val="000000"/>
           <w:sz w:val="20"/>
         </w:rPr>
-        <w:t>D. Knowledge-Based Risk Layer</w:t>
+        <w:t>D. Benchmark with OULAD Studies</w:t>
       </w:r>
     </w:p>
     <w:p>
@@ -5266,7 +5466,7 @@
           <w:color w:val="000000"/>
           <w:sz w:val="20"/>
         </w:rPr>
-        <w:t xml:space="preserve">Threshold kuartil bawah data train-validation adalah skor assessment 0, jumlah assessment 0, total klik VLE 47, dan hari aktif VLE 4. Nilai nol pada indikator assessment menunjukkan bahwa sebagian mahasiswa belum mengumpulkan assessment sampai akhir minggu keempat. Knowledge layer menghasilkan 1.795 </w:t>
+        <w:t xml:space="preserve">Tabel III membandingkan hasil penelitian dengan lima studi yang memakai OULAD. Shou et al. mengevaluasi MTAPSP harian pada 20% durasi course dengan target </w:t>
       </w:r>
       <w:r>
         <w:rPr>
@@ -5276,7 +5476,7 @@
           <w:color w:val="000000"/>
           <w:sz w:val="20"/>
         </w:rPr>
-        <w:t>High Risk</w:t>
+        <w:t>Pass</w:t>
       </w:r>
       <w:r>
         <w:rPr>
@@ -5286,7 +5486,7 @@
           <w:color w:val="000000"/>
           <w:sz w:val="20"/>
         </w:rPr>
-        <w:t xml:space="preserve">, 1.994 </w:t>
+        <w:t xml:space="preserve"> serta </w:t>
       </w:r>
       <w:r>
         <w:rPr>
@@ -5296,7 +5496,7 @@
           <w:color w:val="000000"/>
           <w:sz w:val="20"/>
         </w:rPr>
-        <w:t>Medium Risk</w:t>
+        <w:t>Distinction</w:t>
       </w:r>
       <w:r>
         <w:rPr>
@@ -5306,7 +5506,7 @@
           <w:color w:val="000000"/>
           <w:sz w:val="20"/>
         </w:rPr>
-        <w:t xml:space="preserve">, dan 2.682 </w:t>
+        <w:t xml:space="preserve"> terhadap </w:t>
       </w:r>
       <w:r>
         <w:rPr>
@@ -5316,7 +5516,7 @@
           <w:color w:val="000000"/>
           <w:sz w:val="20"/>
         </w:rPr>
-        <w:t>Low Risk</w:t>
+        <w:t>Fail</w:t>
       </w:r>
       <w:r>
         <w:rPr>
@@ -5326,7 +5526,1893 @@
           <w:color w:val="000000"/>
           <w:sz w:val="20"/>
         </w:rPr>
-        <w:t xml:space="preserve"> pada hold-out test.</w:t>
+        <w:t xml:space="preserve"> serta </w:t>
+      </w:r>
+      <w:r>
+        <w:rPr>
+          <w:rFonts w:ascii="Times New Roman" w:hAnsi="Times New Roman"/>
+          <w:b w:val="0"/>
+          <w:i/>
+          <w:color w:val="000000"/>
+          <w:sz w:val="20"/>
+        </w:rPr>
+        <w:t>Withdrawn</w:t>
+      </w:r>
+      <w:r>
+        <w:rPr>
+          <w:rFonts w:ascii="Times New Roman" w:hAnsi="Times New Roman"/>
+          <w:b w:val="0"/>
+          <w:i w:val="0"/>
+          <w:color w:val="000000"/>
+          <w:sz w:val="20"/>
+        </w:rPr>
+        <w:t xml:space="preserve"> [5]. Jawad et al. menggunakan data sampai 260 hari dan SMOTE [6]. Balabied dan Eid menggunakan split 80:20 pada klasifikasi biner [7]. Ujkani et al. dan Alnasyan et al. menggabungkan </w:t>
+      </w:r>
+      <w:r>
+        <w:rPr>
+          <w:rFonts w:ascii="Times New Roman" w:hAnsi="Times New Roman"/>
+          <w:b w:val="0"/>
+          <w:i/>
+          <w:color w:val="000000"/>
+          <w:sz w:val="20"/>
+        </w:rPr>
+        <w:t>Fail</w:t>
+      </w:r>
+      <w:r>
+        <w:rPr>
+          <w:rFonts w:ascii="Times New Roman" w:hAnsi="Times New Roman"/>
+          <w:b w:val="0"/>
+          <w:i w:val="0"/>
+          <w:color w:val="000000"/>
+          <w:sz w:val="20"/>
+        </w:rPr>
+        <w:t xml:space="preserve"> serta </w:t>
+      </w:r>
+      <w:r>
+        <w:rPr>
+          <w:rFonts w:ascii="Times New Roman" w:hAnsi="Times New Roman"/>
+          <w:b w:val="0"/>
+          <w:i/>
+          <w:color w:val="000000"/>
+          <w:sz w:val="20"/>
+        </w:rPr>
+        <w:t>Withdrawn</w:t>
+      </w:r>
+      <w:r>
+        <w:rPr>
+          <w:rFonts w:ascii="Times New Roman" w:hAnsi="Times New Roman"/>
+          <w:b w:val="0"/>
+          <w:i w:val="0"/>
+          <w:color w:val="000000"/>
+          <w:sz w:val="20"/>
+        </w:rPr>
+        <w:t xml:space="preserve"> sebagai kelompok at-risk [8], [9]. Perbedaan horizon, desain split, balancing, dan arsitektur model menjadi konteks pembacaan angka.</w:t>
+      </w:r>
+    </w:p>
+    <w:p>
+      <w:pPr>
+        <w:sectPr>
+          <w:type w:val="continuous"/>
+          <w:pgSz w:w="12240" w:h="15840"/>
+          <w:pgMar w:top="936" w:right="936" w:bottom="936" w:left="936" w:header="432" w:footer="432" w:gutter="0"/>
+          <w:cols w:space="360" w:num="2" w:equalWidth="1"/>
+          <w:docGrid w:linePitch="360"/>
+        </w:sectPr>
+      </w:pPr>
+    </w:p>
+    <w:p>
+      <w:pPr>
+        <w:keepNext/>
+        <w:spacing w:before="80" w:after="40"/>
+        <w:jc w:val="center"/>
+      </w:pPr>
+      <w:r>
+        <w:rPr>
+          <w:rFonts w:ascii="Times New Roman" w:hAnsi="Times New Roman"/>
+          <w:color w:val="000000"/>
+          <w:sz w:val="16"/>
+        </w:rPr>
+        <w:t>TABLE III</w:t>
+        <w:br/>
+      </w:r>
+      <w:r>
+        <w:rPr>
+          <w:rFonts w:ascii="Times New Roman" w:hAnsi="Times New Roman"/>
+          <w:color w:val="000000"/>
+          <w:sz w:val="16"/>
+        </w:rPr>
+        <w:t>BENCHMARK HASIL PADA PENELITIAN BERBASIS OULAD</w:t>
+      </w:r>
+    </w:p>
+    <w:tbl>
+      <w:tblPr>
+        <w:tblStyle w:val="TableGrid"/>
+        <w:tblW w:type="dxa" w:w="10260"/>
+        <w:jc w:val="center"/>
+        <w:tblLayout w:type="fixed"/>
+        <w:tblLook w:firstColumn="1" w:firstRow="1" w:lastColumn="0" w:lastRow="0" w:noHBand="0" w:noVBand="1" w:val="04A0"/>
+      </w:tblPr>
+      <w:tblGrid>
+        <w:gridCol w:w="2600"/>
+        <w:gridCol w:w="1094"/>
+        <w:gridCol w:w="1094"/>
+        <w:gridCol w:w="1094"/>
+        <w:gridCol w:w="1094"/>
+        <w:gridCol w:w="1094"/>
+        <w:gridCol w:w="1094"/>
+        <w:gridCol w:w="1096"/>
+      </w:tblGrid>
+      <w:tr>
+        <w:trPr>
+          <w:tblHeader/>
+        </w:trPr>
+        <w:tc>
+          <w:tcPr>
+            <w:tcW w:type="dxa" w:w="2600"/>
+            <w:tcMar>
+              <w:top w:w="60" w:type="dxa"/>
+              <w:start w:w="80" w:type="dxa"/>
+              <w:bottom w:w="60" w:type="dxa"/>
+              <w:end w:w="80" w:type="dxa"/>
+            </w:tcMar>
+            <w:vAlign w:val="center"/>
+            <w:shd w:fill="E7E6E6"/>
+          </w:tcPr>
+          <w:p>
+            <w:pPr>
+              <w:spacing w:after="0"/>
+              <w:jc w:val="left"/>
+            </w:pPr>
+            <w:r/>
+            <w:r>
+              <w:rPr>
+                <w:rFonts w:ascii="Times New Roman" w:hAnsi="Times New Roman"/>
+                <w:b/>
+                <w:i w:val="0"/>
+                <w:color w:val="000000"/>
+                <w:sz w:val="14"/>
+              </w:rPr>
+              <w:t>Penelitian</w:t>
+            </w:r>
+          </w:p>
+        </w:tc>
+        <w:tc>
+          <w:tcPr>
+            <w:tcW w:type="dxa" w:w="1094"/>
+            <w:tcMar>
+              <w:top w:w="60" w:type="dxa"/>
+              <w:start w:w="80" w:type="dxa"/>
+              <w:bottom w:w="60" w:type="dxa"/>
+              <w:end w:w="80" w:type="dxa"/>
+            </w:tcMar>
+            <w:vAlign w:val="center"/>
+            <w:shd w:fill="E7E6E6"/>
+          </w:tcPr>
+          <w:p>
+            <w:pPr>
+              <w:spacing w:after="0"/>
+              <w:jc w:val="center"/>
+            </w:pPr>
+            <w:r/>
+            <w:r>
+              <w:rPr>
+                <w:rFonts w:ascii="Times New Roman" w:hAnsi="Times New Roman"/>
+                <w:b/>
+                <w:i w:val="0"/>
+                <w:color w:val="000000"/>
+                <w:sz w:val="14"/>
+              </w:rPr>
+              <w:t>Skenario</w:t>
+            </w:r>
+          </w:p>
+        </w:tc>
+        <w:tc>
+          <w:tcPr>
+            <w:tcW w:type="dxa" w:w="1094"/>
+            <w:tcMar>
+              <w:top w:w="60" w:type="dxa"/>
+              <w:start w:w="80" w:type="dxa"/>
+              <w:bottom w:w="60" w:type="dxa"/>
+              <w:end w:w="80" w:type="dxa"/>
+            </w:tcMar>
+            <w:vAlign w:val="center"/>
+            <w:shd w:fill="E7E6E6"/>
+          </w:tcPr>
+          <w:p>
+            <w:pPr>
+              <w:spacing w:after="0"/>
+              <w:jc w:val="center"/>
+            </w:pPr>
+            <w:r/>
+            <w:r>
+              <w:rPr>
+                <w:rFonts w:ascii="Times New Roman" w:hAnsi="Times New Roman"/>
+                <w:b/>
+                <w:i w:val="0"/>
+                <w:color w:val="000000"/>
+                <w:sz w:val="14"/>
+              </w:rPr>
+              <w:t>Model</w:t>
+            </w:r>
+          </w:p>
+        </w:tc>
+        <w:tc>
+          <w:tcPr>
+            <w:tcW w:type="dxa" w:w="1094"/>
+            <w:tcMar>
+              <w:top w:w="60" w:type="dxa"/>
+              <w:start w:w="80" w:type="dxa"/>
+              <w:bottom w:w="60" w:type="dxa"/>
+              <w:end w:w="80" w:type="dxa"/>
+            </w:tcMar>
+            <w:vAlign w:val="center"/>
+            <w:shd w:fill="E7E6E6"/>
+          </w:tcPr>
+          <w:p>
+            <w:pPr>
+              <w:spacing w:after="0"/>
+              <w:jc w:val="center"/>
+            </w:pPr>
+            <w:r/>
+            <w:r>
+              <w:rPr>
+                <w:rFonts w:ascii="Times New Roman" w:hAnsi="Times New Roman"/>
+                <w:b/>
+                <w:i w:val="0"/>
+                <w:color w:val="000000"/>
+                <w:sz w:val="14"/>
+              </w:rPr>
+              <w:t>Accuracy</w:t>
+            </w:r>
+          </w:p>
+        </w:tc>
+        <w:tc>
+          <w:tcPr>
+            <w:tcW w:type="dxa" w:w="1094"/>
+            <w:tcMar>
+              <w:top w:w="60" w:type="dxa"/>
+              <w:start w:w="80" w:type="dxa"/>
+              <w:bottom w:w="60" w:type="dxa"/>
+              <w:end w:w="80" w:type="dxa"/>
+            </w:tcMar>
+            <w:vAlign w:val="center"/>
+            <w:shd w:fill="E7E6E6"/>
+          </w:tcPr>
+          <w:p>
+            <w:pPr>
+              <w:spacing w:after="0"/>
+              <w:jc w:val="center"/>
+            </w:pPr>
+            <w:r/>
+            <w:r>
+              <w:rPr>
+                <w:rFonts w:ascii="Times New Roman" w:hAnsi="Times New Roman"/>
+                <w:b/>
+                <w:i w:val="0"/>
+                <w:color w:val="000000"/>
+                <w:sz w:val="14"/>
+              </w:rPr>
+              <w:t>Precision</w:t>
+            </w:r>
+          </w:p>
+        </w:tc>
+        <w:tc>
+          <w:tcPr>
+            <w:tcW w:type="dxa" w:w="1094"/>
+            <w:tcMar>
+              <w:top w:w="60" w:type="dxa"/>
+              <w:start w:w="80" w:type="dxa"/>
+              <w:bottom w:w="60" w:type="dxa"/>
+              <w:end w:w="80" w:type="dxa"/>
+            </w:tcMar>
+            <w:vAlign w:val="center"/>
+            <w:shd w:fill="E7E6E6"/>
+          </w:tcPr>
+          <w:p>
+            <w:pPr>
+              <w:spacing w:after="0"/>
+              <w:jc w:val="center"/>
+            </w:pPr>
+            <w:r/>
+            <w:r>
+              <w:rPr>
+                <w:rFonts w:ascii="Times New Roman" w:hAnsi="Times New Roman"/>
+                <w:b/>
+                <w:i w:val="0"/>
+                <w:color w:val="000000"/>
+                <w:sz w:val="14"/>
+              </w:rPr>
+              <w:t>Recall</w:t>
+            </w:r>
+          </w:p>
+        </w:tc>
+        <w:tc>
+          <w:tcPr>
+            <w:tcW w:type="dxa" w:w="1094"/>
+            <w:tcMar>
+              <w:top w:w="60" w:type="dxa"/>
+              <w:start w:w="80" w:type="dxa"/>
+              <w:bottom w:w="60" w:type="dxa"/>
+              <w:end w:w="80" w:type="dxa"/>
+            </w:tcMar>
+            <w:vAlign w:val="center"/>
+            <w:shd w:fill="E7E6E6"/>
+          </w:tcPr>
+          <w:p>
+            <w:pPr>
+              <w:spacing w:after="0"/>
+              <w:jc w:val="center"/>
+            </w:pPr>
+            <w:r/>
+            <w:r>
+              <w:rPr>
+                <w:rFonts w:ascii="Times New Roman" w:hAnsi="Times New Roman"/>
+                <w:b/>
+                <w:i w:val="0"/>
+                <w:color w:val="000000"/>
+                <w:sz w:val="14"/>
+              </w:rPr>
+              <w:t>F1</w:t>
+            </w:r>
+          </w:p>
+        </w:tc>
+        <w:tc>
+          <w:tcPr>
+            <w:tcW w:type="dxa" w:w="1096"/>
+            <w:tcMar>
+              <w:top w:w="60" w:type="dxa"/>
+              <w:start w:w="80" w:type="dxa"/>
+              <w:bottom w:w="60" w:type="dxa"/>
+              <w:end w:w="80" w:type="dxa"/>
+            </w:tcMar>
+            <w:vAlign w:val="center"/>
+            <w:shd w:fill="E7E6E6"/>
+          </w:tcPr>
+          <w:p>
+            <w:pPr>
+              <w:spacing w:after="0"/>
+              <w:jc w:val="center"/>
+            </w:pPr>
+            <w:r/>
+            <w:r>
+              <w:rPr>
+                <w:rFonts w:ascii="Times New Roman" w:hAnsi="Times New Roman"/>
+                <w:b/>
+                <w:i w:val="0"/>
+                <w:color w:val="000000"/>
+                <w:sz w:val="14"/>
+              </w:rPr>
+              <w:t>ROC-AUC</w:t>
+            </w:r>
+          </w:p>
+        </w:tc>
+      </w:tr>
+      <w:tr>
+        <w:tc>
+          <w:tcPr>
+            <w:tcW w:type="dxa" w:w="2600"/>
+            <w:tcMar>
+              <w:top w:w="60" w:type="dxa"/>
+              <w:start w:w="80" w:type="dxa"/>
+              <w:bottom w:w="60" w:type="dxa"/>
+              <w:end w:w="80" w:type="dxa"/>
+            </w:tcMar>
+            <w:vAlign w:val="center"/>
+          </w:tcPr>
+          <w:p>
+            <w:pPr>
+              <w:spacing w:after="0"/>
+              <w:jc w:val="left"/>
+            </w:pPr>
+            <w:r/>
+            <w:r>
+              <w:rPr>
+                <w:rFonts w:ascii="Times New Roman" w:hAnsi="Times New Roman"/>
+                <w:b w:val="0"/>
+                <w:i w:val="0"/>
+                <w:color w:val="000000"/>
+                <w:sz w:val="14"/>
+              </w:rPr>
+              <w:t>Shou et al. [5]</w:t>
+            </w:r>
+          </w:p>
+        </w:tc>
+        <w:tc>
+          <w:tcPr>
+            <w:tcW w:type="dxa" w:w="1094"/>
+            <w:tcMar>
+              <w:top w:w="60" w:type="dxa"/>
+              <w:start w:w="80" w:type="dxa"/>
+              <w:bottom w:w="60" w:type="dxa"/>
+              <w:end w:w="80" w:type="dxa"/>
+            </w:tcMar>
+            <w:vAlign w:val="center"/>
+          </w:tcPr>
+          <w:p>
+            <w:pPr>
+              <w:spacing w:after="0"/>
+              <w:jc w:val="center"/>
+            </w:pPr>
+            <w:r/>
+            <w:r>
+              <w:rPr>
+                <w:rFonts w:ascii="Times New Roman" w:hAnsi="Times New Roman"/>
+                <w:b w:val="0"/>
+                <w:i w:val="0"/>
+                <w:color w:val="000000"/>
+                <w:sz w:val="14"/>
+              </w:rPr>
+              <w:t>20% durasi course, target biner</w:t>
+            </w:r>
+          </w:p>
+        </w:tc>
+        <w:tc>
+          <w:tcPr>
+            <w:tcW w:type="dxa" w:w="1094"/>
+            <w:tcMar>
+              <w:top w:w="60" w:type="dxa"/>
+              <w:start w:w="80" w:type="dxa"/>
+              <w:bottom w:w="60" w:type="dxa"/>
+              <w:end w:w="80" w:type="dxa"/>
+            </w:tcMar>
+            <w:vAlign w:val="center"/>
+          </w:tcPr>
+          <w:p>
+            <w:pPr>
+              <w:spacing w:after="0"/>
+              <w:jc w:val="center"/>
+            </w:pPr>
+            <w:r/>
+            <w:r>
+              <w:rPr>
+                <w:rFonts w:ascii="Times New Roman" w:hAnsi="Times New Roman"/>
+                <w:b w:val="0"/>
+                <w:i w:val="0"/>
+                <w:color w:val="000000"/>
+                <w:sz w:val="14"/>
+              </w:rPr>
+              <w:t>MTAPSP (daily)</w:t>
+            </w:r>
+          </w:p>
+        </w:tc>
+        <w:tc>
+          <w:tcPr>
+            <w:tcW w:type="dxa" w:w="1094"/>
+            <w:tcMar>
+              <w:top w:w="60" w:type="dxa"/>
+              <w:start w:w="80" w:type="dxa"/>
+              <w:bottom w:w="60" w:type="dxa"/>
+              <w:end w:w="80" w:type="dxa"/>
+            </w:tcMar>
+            <w:vAlign w:val="center"/>
+          </w:tcPr>
+          <w:p>
+            <w:pPr>
+              <w:spacing w:after="0"/>
+              <w:jc w:val="center"/>
+            </w:pPr>
+            <w:r/>
+            <w:r>
+              <w:rPr>
+                <w:rFonts w:ascii="Times New Roman" w:hAnsi="Times New Roman"/>
+                <w:b w:val="0"/>
+                <w:i w:val="0"/>
+                <w:color w:val="000000"/>
+                <w:sz w:val="14"/>
+              </w:rPr>
+              <w:t>0,9179</w:t>
+            </w:r>
+          </w:p>
+        </w:tc>
+        <w:tc>
+          <w:tcPr>
+            <w:tcW w:type="dxa" w:w="1094"/>
+            <w:tcMar>
+              <w:top w:w="60" w:type="dxa"/>
+              <w:start w:w="80" w:type="dxa"/>
+              <w:bottom w:w="60" w:type="dxa"/>
+              <w:end w:w="80" w:type="dxa"/>
+            </w:tcMar>
+            <w:vAlign w:val="center"/>
+          </w:tcPr>
+          <w:p>
+            <w:pPr>
+              <w:spacing w:after="0"/>
+              <w:jc w:val="center"/>
+            </w:pPr>
+            <w:r/>
+            <w:r>
+              <w:rPr>
+                <w:rFonts w:ascii="Times New Roman" w:hAnsi="Times New Roman"/>
+                <w:b w:val="0"/>
+                <w:i w:val="0"/>
+                <w:color w:val="000000"/>
+                <w:sz w:val="14"/>
+              </w:rPr>
+              <w:t>-</w:t>
+            </w:r>
+          </w:p>
+        </w:tc>
+        <w:tc>
+          <w:tcPr>
+            <w:tcW w:type="dxa" w:w="1094"/>
+            <w:tcMar>
+              <w:top w:w="60" w:type="dxa"/>
+              <w:start w:w="80" w:type="dxa"/>
+              <w:bottom w:w="60" w:type="dxa"/>
+              <w:end w:w="80" w:type="dxa"/>
+            </w:tcMar>
+            <w:vAlign w:val="center"/>
+          </w:tcPr>
+          <w:p>
+            <w:pPr>
+              <w:spacing w:after="0"/>
+              <w:jc w:val="center"/>
+            </w:pPr>
+            <w:r/>
+            <w:r>
+              <w:rPr>
+                <w:rFonts w:ascii="Times New Roman" w:hAnsi="Times New Roman"/>
+                <w:b w:val="0"/>
+                <w:i w:val="0"/>
+                <w:color w:val="000000"/>
+                <w:sz w:val="14"/>
+              </w:rPr>
+              <w:t>-</w:t>
+            </w:r>
+          </w:p>
+        </w:tc>
+        <w:tc>
+          <w:tcPr>
+            <w:tcW w:type="dxa" w:w="1094"/>
+            <w:tcMar>
+              <w:top w:w="60" w:type="dxa"/>
+              <w:start w:w="80" w:type="dxa"/>
+              <w:bottom w:w="60" w:type="dxa"/>
+              <w:end w:w="80" w:type="dxa"/>
+            </w:tcMar>
+            <w:vAlign w:val="center"/>
+          </w:tcPr>
+          <w:p>
+            <w:pPr>
+              <w:spacing w:after="0"/>
+              <w:jc w:val="center"/>
+            </w:pPr>
+            <w:r/>
+            <w:r>
+              <w:rPr>
+                <w:rFonts w:ascii="Times New Roman" w:hAnsi="Times New Roman"/>
+                <w:b w:val="0"/>
+                <w:i w:val="0"/>
+                <w:color w:val="000000"/>
+                <w:sz w:val="14"/>
+              </w:rPr>
+              <w:t>0,9180</w:t>
+            </w:r>
+          </w:p>
+        </w:tc>
+        <w:tc>
+          <w:tcPr>
+            <w:tcW w:type="dxa" w:w="1096"/>
+            <w:tcMar>
+              <w:top w:w="60" w:type="dxa"/>
+              <w:start w:w="80" w:type="dxa"/>
+              <w:bottom w:w="60" w:type="dxa"/>
+              <w:end w:w="80" w:type="dxa"/>
+            </w:tcMar>
+            <w:vAlign w:val="center"/>
+          </w:tcPr>
+          <w:p>
+            <w:pPr>
+              <w:spacing w:after="0"/>
+              <w:jc w:val="center"/>
+            </w:pPr>
+            <w:r/>
+            <w:r>
+              <w:rPr>
+                <w:rFonts w:ascii="Times New Roman" w:hAnsi="Times New Roman"/>
+                <w:b w:val="0"/>
+                <w:i w:val="0"/>
+                <w:color w:val="000000"/>
+                <w:sz w:val="14"/>
+              </w:rPr>
+              <w:t>-</w:t>
+            </w:r>
+          </w:p>
+        </w:tc>
+      </w:tr>
+      <w:tr>
+        <w:tc>
+          <w:tcPr>
+            <w:tcW w:type="dxa" w:w="2600"/>
+            <w:tcMar>
+              <w:top w:w="60" w:type="dxa"/>
+              <w:start w:w="80" w:type="dxa"/>
+              <w:bottom w:w="60" w:type="dxa"/>
+              <w:end w:w="80" w:type="dxa"/>
+            </w:tcMar>
+            <w:vAlign w:val="center"/>
+          </w:tcPr>
+          <w:p>
+            <w:pPr>
+              <w:spacing w:after="0"/>
+              <w:jc w:val="left"/>
+            </w:pPr>
+            <w:r/>
+            <w:r>
+              <w:rPr>
+                <w:rFonts w:ascii="Times New Roman" w:hAnsi="Times New Roman"/>
+                <w:b w:val="0"/>
+                <w:i w:val="0"/>
+                <w:color w:val="000000"/>
+                <w:sz w:val="14"/>
+              </w:rPr>
+              <w:t>Jawad et al. [6]</w:t>
+            </w:r>
+          </w:p>
+        </w:tc>
+        <w:tc>
+          <w:tcPr>
+            <w:tcW w:type="dxa" w:w="1094"/>
+            <w:tcMar>
+              <w:top w:w="60" w:type="dxa"/>
+              <w:start w:w="80" w:type="dxa"/>
+              <w:bottom w:w="60" w:type="dxa"/>
+              <w:end w:w="80" w:type="dxa"/>
+            </w:tcMar>
+            <w:vAlign w:val="center"/>
+          </w:tcPr>
+          <w:p>
+            <w:pPr>
+              <w:spacing w:after="0"/>
+              <w:jc w:val="center"/>
+            </w:pPr>
+            <w:r/>
+            <w:r>
+              <w:rPr>
+                <w:rFonts w:ascii="Times New Roman" w:hAnsi="Times New Roman"/>
+                <w:b w:val="0"/>
+                <w:i w:val="0"/>
+                <w:color w:val="000000"/>
+                <w:sz w:val="14"/>
+              </w:rPr>
+              <w:t>260 hari + SMOTE</w:t>
+            </w:r>
+          </w:p>
+        </w:tc>
+        <w:tc>
+          <w:tcPr>
+            <w:tcW w:type="dxa" w:w="1094"/>
+            <w:tcMar>
+              <w:top w:w="60" w:type="dxa"/>
+              <w:start w:w="80" w:type="dxa"/>
+              <w:bottom w:w="60" w:type="dxa"/>
+              <w:end w:w="80" w:type="dxa"/>
+            </w:tcMar>
+            <w:vAlign w:val="center"/>
+          </w:tcPr>
+          <w:p>
+            <w:pPr>
+              <w:spacing w:after="0"/>
+              <w:jc w:val="center"/>
+            </w:pPr>
+            <w:r/>
+            <w:r>
+              <w:rPr>
+                <w:rFonts w:ascii="Times New Roman" w:hAnsi="Times New Roman"/>
+                <w:b w:val="0"/>
+                <w:i w:val="0"/>
+                <w:color w:val="000000"/>
+                <w:sz w:val="14"/>
+              </w:rPr>
+              <w:t>Random Forest</w:t>
+            </w:r>
+          </w:p>
+        </w:tc>
+        <w:tc>
+          <w:tcPr>
+            <w:tcW w:type="dxa" w:w="1094"/>
+            <w:tcMar>
+              <w:top w:w="60" w:type="dxa"/>
+              <w:start w:w="80" w:type="dxa"/>
+              <w:bottom w:w="60" w:type="dxa"/>
+              <w:end w:w="80" w:type="dxa"/>
+            </w:tcMar>
+            <w:vAlign w:val="center"/>
+          </w:tcPr>
+          <w:p>
+            <w:pPr>
+              <w:spacing w:after="0"/>
+              <w:jc w:val="center"/>
+            </w:pPr>
+            <w:r/>
+            <w:r>
+              <w:rPr>
+                <w:rFonts w:ascii="Times New Roman" w:hAnsi="Times New Roman"/>
+                <w:b w:val="0"/>
+                <w:i w:val="0"/>
+                <w:color w:val="000000"/>
+                <w:sz w:val="14"/>
+              </w:rPr>
+              <w:t>0,8920</w:t>
+            </w:r>
+          </w:p>
+        </w:tc>
+        <w:tc>
+          <w:tcPr>
+            <w:tcW w:type="dxa" w:w="1094"/>
+            <w:tcMar>
+              <w:top w:w="60" w:type="dxa"/>
+              <w:start w:w="80" w:type="dxa"/>
+              <w:bottom w:w="60" w:type="dxa"/>
+              <w:end w:w="80" w:type="dxa"/>
+            </w:tcMar>
+            <w:vAlign w:val="center"/>
+          </w:tcPr>
+          <w:p>
+            <w:pPr>
+              <w:spacing w:after="0"/>
+              <w:jc w:val="center"/>
+            </w:pPr>
+            <w:r/>
+            <w:r>
+              <w:rPr>
+                <w:rFonts w:ascii="Times New Roman" w:hAnsi="Times New Roman"/>
+                <w:b w:val="0"/>
+                <w:i w:val="0"/>
+                <w:color w:val="000000"/>
+                <w:sz w:val="14"/>
+              </w:rPr>
+              <w:t>-</w:t>
+            </w:r>
+          </w:p>
+        </w:tc>
+        <w:tc>
+          <w:tcPr>
+            <w:tcW w:type="dxa" w:w="1094"/>
+            <w:tcMar>
+              <w:top w:w="60" w:type="dxa"/>
+              <w:start w:w="80" w:type="dxa"/>
+              <w:bottom w:w="60" w:type="dxa"/>
+              <w:end w:w="80" w:type="dxa"/>
+            </w:tcMar>
+            <w:vAlign w:val="center"/>
+          </w:tcPr>
+          <w:p>
+            <w:pPr>
+              <w:spacing w:after="0"/>
+              <w:jc w:val="center"/>
+            </w:pPr>
+            <w:r/>
+            <w:r>
+              <w:rPr>
+                <w:rFonts w:ascii="Times New Roman" w:hAnsi="Times New Roman"/>
+                <w:b w:val="0"/>
+                <w:i w:val="0"/>
+                <w:color w:val="000000"/>
+                <w:sz w:val="14"/>
+              </w:rPr>
+              <w:t>-</w:t>
+            </w:r>
+          </w:p>
+        </w:tc>
+        <w:tc>
+          <w:tcPr>
+            <w:tcW w:type="dxa" w:w="1094"/>
+            <w:tcMar>
+              <w:top w:w="60" w:type="dxa"/>
+              <w:start w:w="80" w:type="dxa"/>
+              <w:bottom w:w="60" w:type="dxa"/>
+              <w:end w:w="80" w:type="dxa"/>
+            </w:tcMar>
+            <w:vAlign w:val="center"/>
+          </w:tcPr>
+          <w:p>
+            <w:pPr>
+              <w:spacing w:after="0"/>
+              <w:jc w:val="center"/>
+            </w:pPr>
+            <w:r/>
+            <w:r>
+              <w:rPr>
+                <w:rFonts w:ascii="Times New Roman" w:hAnsi="Times New Roman"/>
+                <w:b w:val="0"/>
+                <w:i w:val="0"/>
+                <w:color w:val="000000"/>
+                <w:sz w:val="14"/>
+              </w:rPr>
+              <w:t>-</w:t>
+            </w:r>
+          </w:p>
+        </w:tc>
+        <w:tc>
+          <w:tcPr>
+            <w:tcW w:type="dxa" w:w="1096"/>
+            <w:tcMar>
+              <w:top w:w="60" w:type="dxa"/>
+              <w:start w:w="80" w:type="dxa"/>
+              <w:bottom w:w="60" w:type="dxa"/>
+              <w:end w:w="80" w:type="dxa"/>
+            </w:tcMar>
+            <w:vAlign w:val="center"/>
+          </w:tcPr>
+          <w:p>
+            <w:pPr>
+              <w:spacing w:after="0"/>
+              <w:jc w:val="center"/>
+            </w:pPr>
+            <w:r/>
+            <w:r>
+              <w:rPr>
+                <w:rFonts w:ascii="Times New Roman" w:hAnsi="Times New Roman"/>
+                <w:b w:val="0"/>
+                <w:i w:val="0"/>
+                <w:color w:val="000000"/>
+                <w:sz w:val="14"/>
+              </w:rPr>
+              <w:t>0,9600</w:t>
+            </w:r>
+          </w:p>
+        </w:tc>
+      </w:tr>
+      <w:tr>
+        <w:tc>
+          <w:tcPr>
+            <w:tcW w:type="dxa" w:w="2600"/>
+            <w:tcMar>
+              <w:top w:w="60" w:type="dxa"/>
+              <w:start w:w="80" w:type="dxa"/>
+              <w:bottom w:w="60" w:type="dxa"/>
+              <w:end w:w="80" w:type="dxa"/>
+            </w:tcMar>
+            <w:vAlign w:val="center"/>
+          </w:tcPr>
+          <w:p>
+            <w:pPr>
+              <w:spacing w:after="0"/>
+              <w:jc w:val="left"/>
+            </w:pPr>
+            <w:r/>
+            <w:r>
+              <w:rPr>
+                <w:rFonts w:ascii="Times New Roman" w:hAnsi="Times New Roman"/>
+                <w:b w:val="0"/>
+                <w:i w:val="0"/>
+                <w:color w:val="000000"/>
+                <w:sz w:val="14"/>
+              </w:rPr>
+              <w:t>Balabied dan Eid [7]</w:t>
+            </w:r>
+          </w:p>
+        </w:tc>
+        <w:tc>
+          <w:tcPr>
+            <w:tcW w:type="dxa" w:w="1094"/>
+            <w:tcMar>
+              <w:top w:w="60" w:type="dxa"/>
+              <w:start w:w="80" w:type="dxa"/>
+              <w:bottom w:w="60" w:type="dxa"/>
+              <w:end w:w="80" w:type="dxa"/>
+            </w:tcMar>
+            <w:vAlign w:val="center"/>
+          </w:tcPr>
+          <w:p>
+            <w:pPr>
+              <w:spacing w:after="0"/>
+              <w:jc w:val="center"/>
+            </w:pPr>
+            <w:r/>
+            <w:r>
+              <w:rPr>
+                <w:rFonts w:ascii="Times New Roman" w:hAnsi="Times New Roman"/>
+                <w:b w:val="0"/>
+                <w:i w:val="0"/>
+                <w:color w:val="000000"/>
+                <w:sz w:val="14"/>
+              </w:rPr>
+              <w:t>Klasifikasi biner</w:t>
+            </w:r>
+          </w:p>
+        </w:tc>
+        <w:tc>
+          <w:tcPr>
+            <w:tcW w:type="dxa" w:w="1094"/>
+            <w:tcMar>
+              <w:top w:w="60" w:type="dxa"/>
+              <w:start w:w="80" w:type="dxa"/>
+              <w:bottom w:w="60" w:type="dxa"/>
+              <w:end w:w="80" w:type="dxa"/>
+            </w:tcMar>
+            <w:vAlign w:val="center"/>
+          </w:tcPr>
+          <w:p>
+            <w:pPr>
+              <w:spacing w:after="0"/>
+              <w:jc w:val="center"/>
+            </w:pPr>
+            <w:r/>
+            <w:r>
+              <w:rPr>
+                <w:rFonts w:ascii="Times New Roman" w:hAnsi="Times New Roman"/>
+                <w:b w:val="0"/>
+                <w:i w:val="0"/>
+                <w:color w:val="000000"/>
+                <w:sz w:val="14"/>
+              </w:rPr>
+              <w:t>Random Forest</w:t>
+            </w:r>
+          </w:p>
+        </w:tc>
+        <w:tc>
+          <w:tcPr>
+            <w:tcW w:type="dxa" w:w="1094"/>
+            <w:tcMar>
+              <w:top w:w="60" w:type="dxa"/>
+              <w:start w:w="80" w:type="dxa"/>
+              <w:bottom w:w="60" w:type="dxa"/>
+              <w:end w:w="80" w:type="dxa"/>
+            </w:tcMar>
+            <w:vAlign w:val="center"/>
+          </w:tcPr>
+          <w:p>
+            <w:pPr>
+              <w:spacing w:after="0"/>
+              <w:jc w:val="center"/>
+            </w:pPr>
+            <w:r/>
+            <w:r>
+              <w:rPr>
+                <w:rFonts w:ascii="Times New Roman" w:hAnsi="Times New Roman"/>
+                <w:b w:val="0"/>
+                <w:i w:val="0"/>
+                <w:color w:val="000000"/>
+                <w:sz w:val="14"/>
+              </w:rPr>
+              <w:t>0,9000</w:t>
+            </w:r>
+          </w:p>
+        </w:tc>
+        <w:tc>
+          <w:tcPr>
+            <w:tcW w:type="dxa" w:w="1094"/>
+            <w:tcMar>
+              <w:top w:w="60" w:type="dxa"/>
+              <w:start w:w="80" w:type="dxa"/>
+              <w:bottom w:w="60" w:type="dxa"/>
+              <w:end w:w="80" w:type="dxa"/>
+            </w:tcMar>
+            <w:vAlign w:val="center"/>
+          </w:tcPr>
+          <w:p>
+            <w:pPr>
+              <w:spacing w:after="0"/>
+              <w:jc w:val="center"/>
+            </w:pPr>
+            <w:r/>
+            <w:r>
+              <w:rPr>
+                <w:rFonts w:ascii="Times New Roman" w:hAnsi="Times New Roman"/>
+                <w:b w:val="0"/>
+                <w:i w:val="0"/>
+                <w:color w:val="000000"/>
+                <w:sz w:val="14"/>
+              </w:rPr>
+              <w:t>0,9000</w:t>
+            </w:r>
+          </w:p>
+        </w:tc>
+        <w:tc>
+          <w:tcPr>
+            <w:tcW w:type="dxa" w:w="1094"/>
+            <w:tcMar>
+              <w:top w:w="60" w:type="dxa"/>
+              <w:start w:w="80" w:type="dxa"/>
+              <w:bottom w:w="60" w:type="dxa"/>
+              <w:end w:w="80" w:type="dxa"/>
+            </w:tcMar>
+            <w:vAlign w:val="center"/>
+          </w:tcPr>
+          <w:p>
+            <w:pPr>
+              <w:spacing w:after="0"/>
+              <w:jc w:val="center"/>
+            </w:pPr>
+            <w:r/>
+            <w:r>
+              <w:rPr>
+                <w:rFonts w:ascii="Times New Roman" w:hAnsi="Times New Roman"/>
+                <w:b w:val="0"/>
+                <w:i w:val="0"/>
+                <w:color w:val="000000"/>
+                <w:sz w:val="14"/>
+              </w:rPr>
+              <w:t>0,9000</w:t>
+            </w:r>
+          </w:p>
+        </w:tc>
+        <w:tc>
+          <w:tcPr>
+            <w:tcW w:type="dxa" w:w="1094"/>
+            <w:tcMar>
+              <w:top w:w="60" w:type="dxa"/>
+              <w:start w:w="80" w:type="dxa"/>
+              <w:bottom w:w="60" w:type="dxa"/>
+              <w:end w:w="80" w:type="dxa"/>
+            </w:tcMar>
+            <w:vAlign w:val="center"/>
+          </w:tcPr>
+          <w:p>
+            <w:pPr>
+              <w:spacing w:after="0"/>
+              <w:jc w:val="center"/>
+            </w:pPr>
+            <w:r/>
+            <w:r>
+              <w:rPr>
+                <w:rFonts w:ascii="Times New Roman" w:hAnsi="Times New Roman"/>
+                <w:b w:val="0"/>
+                <w:i w:val="0"/>
+                <w:color w:val="000000"/>
+                <w:sz w:val="14"/>
+              </w:rPr>
+              <w:t>0,9000</w:t>
+            </w:r>
+          </w:p>
+        </w:tc>
+        <w:tc>
+          <w:tcPr>
+            <w:tcW w:type="dxa" w:w="1096"/>
+            <w:tcMar>
+              <w:top w:w="60" w:type="dxa"/>
+              <w:start w:w="80" w:type="dxa"/>
+              <w:bottom w:w="60" w:type="dxa"/>
+              <w:end w:w="80" w:type="dxa"/>
+            </w:tcMar>
+            <w:vAlign w:val="center"/>
+          </w:tcPr>
+          <w:p>
+            <w:pPr>
+              <w:spacing w:after="0"/>
+              <w:jc w:val="center"/>
+            </w:pPr>
+            <w:r/>
+            <w:r>
+              <w:rPr>
+                <w:rFonts w:ascii="Times New Roman" w:hAnsi="Times New Roman"/>
+                <w:b w:val="0"/>
+                <w:i w:val="0"/>
+                <w:color w:val="000000"/>
+                <w:sz w:val="14"/>
+              </w:rPr>
+              <w:t>-</w:t>
+            </w:r>
+          </w:p>
+        </w:tc>
+      </w:tr>
+      <w:tr>
+        <w:tc>
+          <w:tcPr>
+            <w:tcW w:type="dxa" w:w="2600"/>
+            <w:tcMar>
+              <w:top w:w="60" w:type="dxa"/>
+              <w:start w:w="80" w:type="dxa"/>
+              <w:bottom w:w="60" w:type="dxa"/>
+              <w:end w:w="80" w:type="dxa"/>
+            </w:tcMar>
+            <w:vAlign w:val="center"/>
+          </w:tcPr>
+          <w:p>
+            <w:pPr>
+              <w:spacing w:after="0"/>
+              <w:jc w:val="left"/>
+            </w:pPr>
+            <w:r/>
+            <w:r>
+              <w:rPr>
+                <w:rFonts w:ascii="Times New Roman" w:hAnsi="Times New Roman"/>
+                <w:b w:val="0"/>
+                <w:i w:val="0"/>
+                <w:color w:val="000000"/>
+                <w:sz w:val="14"/>
+              </w:rPr>
+              <w:t>Ujkani et al. [8]</w:t>
+            </w:r>
+          </w:p>
+        </w:tc>
+        <w:tc>
+          <w:tcPr>
+            <w:tcW w:type="dxa" w:w="1094"/>
+            <w:tcMar>
+              <w:top w:w="60" w:type="dxa"/>
+              <w:start w:w="80" w:type="dxa"/>
+              <w:bottom w:w="60" w:type="dxa"/>
+              <w:end w:w="80" w:type="dxa"/>
+            </w:tcMar>
+            <w:vAlign w:val="center"/>
+          </w:tcPr>
+          <w:p>
+            <w:pPr>
+              <w:spacing w:after="0"/>
+              <w:jc w:val="center"/>
+            </w:pPr>
+            <w:r/>
+            <w:r>
+              <w:rPr>
+                <w:rFonts w:ascii="Times New Roman" w:hAnsi="Times New Roman"/>
+                <w:b w:val="0"/>
+                <w:i/>
+                <w:color w:val="000000"/>
+                <w:sz w:val="14"/>
+              </w:rPr>
+              <w:t>Fail</w:t>
+            </w:r>
+            <w:r>
+              <w:rPr>
+                <w:rFonts w:ascii="Times New Roman" w:hAnsi="Times New Roman"/>
+                <w:b w:val="0"/>
+                <w:i w:val="0"/>
+                <w:color w:val="000000"/>
+                <w:sz w:val="14"/>
+              </w:rPr>
+              <w:t xml:space="preserve"> + </w:t>
+            </w:r>
+            <w:r>
+              <w:rPr>
+                <w:rFonts w:ascii="Times New Roman" w:hAnsi="Times New Roman"/>
+                <w:b w:val="0"/>
+                <w:i/>
+                <w:color w:val="000000"/>
+                <w:sz w:val="14"/>
+              </w:rPr>
+              <w:t>Withdrawn</w:t>
+            </w:r>
+            <w:r>
+              <w:rPr>
+                <w:rFonts w:ascii="Times New Roman" w:hAnsi="Times New Roman"/>
+                <w:b w:val="0"/>
+                <w:i w:val="0"/>
+                <w:color w:val="000000"/>
+                <w:sz w:val="14"/>
+              </w:rPr>
+              <w:t xml:space="preserve"> sebagai at-risk</w:t>
+            </w:r>
+          </w:p>
+        </w:tc>
+        <w:tc>
+          <w:tcPr>
+            <w:tcW w:type="dxa" w:w="1094"/>
+            <w:tcMar>
+              <w:top w:w="60" w:type="dxa"/>
+              <w:start w:w="80" w:type="dxa"/>
+              <w:bottom w:w="60" w:type="dxa"/>
+              <w:end w:w="80" w:type="dxa"/>
+            </w:tcMar>
+            <w:vAlign w:val="center"/>
+          </w:tcPr>
+          <w:p>
+            <w:pPr>
+              <w:spacing w:after="0"/>
+              <w:jc w:val="center"/>
+            </w:pPr>
+            <w:r/>
+            <w:r>
+              <w:rPr>
+                <w:rFonts w:ascii="Times New Roman" w:hAnsi="Times New Roman"/>
+                <w:b w:val="0"/>
+                <w:i w:val="0"/>
+                <w:color w:val="000000"/>
+                <w:sz w:val="14"/>
+              </w:rPr>
+              <w:t>Custom Neural Network</w:t>
+            </w:r>
+          </w:p>
+        </w:tc>
+        <w:tc>
+          <w:tcPr>
+            <w:tcW w:type="dxa" w:w="1094"/>
+            <w:tcMar>
+              <w:top w:w="60" w:type="dxa"/>
+              <w:start w:w="80" w:type="dxa"/>
+              <w:bottom w:w="60" w:type="dxa"/>
+              <w:end w:w="80" w:type="dxa"/>
+            </w:tcMar>
+            <w:vAlign w:val="center"/>
+          </w:tcPr>
+          <w:p>
+            <w:pPr>
+              <w:spacing w:after="0"/>
+              <w:jc w:val="center"/>
+            </w:pPr>
+            <w:r/>
+            <w:r>
+              <w:rPr>
+                <w:rFonts w:ascii="Times New Roman" w:hAnsi="Times New Roman"/>
+                <w:b w:val="0"/>
+                <w:i w:val="0"/>
+                <w:color w:val="000000"/>
+                <w:sz w:val="14"/>
+              </w:rPr>
+              <w:t>0,9300</w:t>
+            </w:r>
+          </w:p>
+        </w:tc>
+        <w:tc>
+          <w:tcPr>
+            <w:tcW w:type="dxa" w:w="1094"/>
+            <w:tcMar>
+              <w:top w:w="60" w:type="dxa"/>
+              <w:start w:w="80" w:type="dxa"/>
+              <w:bottom w:w="60" w:type="dxa"/>
+              <w:end w:w="80" w:type="dxa"/>
+            </w:tcMar>
+            <w:vAlign w:val="center"/>
+          </w:tcPr>
+          <w:p>
+            <w:pPr>
+              <w:spacing w:after="0"/>
+              <w:jc w:val="center"/>
+            </w:pPr>
+            <w:r/>
+            <w:r>
+              <w:rPr>
+                <w:rFonts w:ascii="Times New Roman" w:hAnsi="Times New Roman"/>
+                <w:b w:val="0"/>
+                <w:i w:val="0"/>
+                <w:color w:val="000000"/>
+                <w:sz w:val="14"/>
+              </w:rPr>
+              <w:t>0,9500</w:t>
+            </w:r>
+          </w:p>
+        </w:tc>
+        <w:tc>
+          <w:tcPr>
+            <w:tcW w:type="dxa" w:w="1094"/>
+            <w:tcMar>
+              <w:top w:w="60" w:type="dxa"/>
+              <w:start w:w="80" w:type="dxa"/>
+              <w:bottom w:w="60" w:type="dxa"/>
+              <w:end w:w="80" w:type="dxa"/>
+            </w:tcMar>
+            <w:vAlign w:val="center"/>
+          </w:tcPr>
+          <w:p>
+            <w:pPr>
+              <w:spacing w:after="0"/>
+              <w:jc w:val="center"/>
+            </w:pPr>
+            <w:r/>
+            <w:r>
+              <w:rPr>
+                <w:rFonts w:ascii="Times New Roman" w:hAnsi="Times New Roman"/>
+                <w:b w:val="0"/>
+                <w:i w:val="0"/>
+                <w:color w:val="000000"/>
+                <w:sz w:val="14"/>
+              </w:rPr>
+              <w:t>0,9700</w:t>
+            </w:r>
+          </w:p>
+        </w:tc>
+        <w:tc>
+          <w:tcPr>
+            <w:tcW w:type="dxa" w:w="1094"/>
+            <w:tcMar>
+              <w:top w:w="60" w:type="dxa"/>
+              <w:start w:w="80" w:type="dxa"/>
+              <w:bottom w:w="60" w:type="dxa"/>
+              <w:end w:w="80" w:type="dxa"/>
+            </w:tcMar>
+            <w:vAlign w:val="center"/>
+          </w:tcPr>
+          <w:p>
+            <w:pPr>
+              <w:spacing w:after="0"/>
+              <w:jc w:val="center"/>
+            </w:pPr>
+            <w:r/>
+            <w:r>
+              <w:rPr>
+                <w:rFonts w:ascii="Times New Roman" w:hAnsi="Times New Roman"/>
+                <w:b w:val="0"/>
+                <w:i w:val="0"/>
+                <w:color w:val="000000"/>
+                <w:sz w:val="14"/>
+              </w:rPr>
+              <w:t>0,9600</w:t>
+            </w:r>
+          </w:p>
+        </w:tc>
+        <w:tc>
+          <w:tcPr>
+            <w:tcW w:type="dxa" w:w="1096"/>
+            <w:tcMar>
+              <w:top w:w="60" w:type="dxa"/>
+              <w:start w:w="80" w:type="dxa"/>
+              <w:bottom w:w="60" w:type="dxa"/>
+              <w:end w:w="80" w:type="dxa"/>
+            </w:tcMar>
+            <w:vAlign w:val="center"/>
+          </w:tcPr>
+          <w:p>
+            <w:pPr>
+              <w:spacing w:after="0"/>
+              <w:jc w:val="center"/>
+            </w:pPr>
+            <w:r/>
+            <w:r>
+              <w:rPr>
+                <w:rFonts w:ascii="Times New Roman" w:hAnsi="Times New Roman"/>
+                <w:b w:val="0"/>
+                <w:i w:val="0"/>
+                <w:color w:val="000000"/>
+                <w:sz w:val="14"/>
+              </w:rPr>
+              <w:t>-</w:t>
+            </w:r>
+          </w:p>
+        </w:tc>
+      </w:tr>
+      <w:tr>
+        <w:tc>
+          <w:tcPr>
+            <w:tcW w:type="dxa" w:w="2600"/>
+            <w:tcMar>
+              <w:top w:w="60" w:type="dxa"/>
+              <w:start w:w="80" w:type="dxa"/>
+              <w:bottom w:w="60" w:type="dxa"/>
+              <w:end w:w="80" w:type="dxa"/>
+            </w:tcMar>
+            <w:vAlign w:val="center"/>
+          </w:tcPr>
+          <w:p>
+            <w:pPr>
+              <w:spacing w:after="0"/>
+              <w:jc w:val="left"/>
+            </w:pPr>
+            <w:r/>
+            <w:r>
+              <w:rPr>
+                <w:rFonts w:ascii="Times New Roman" w:hAnsi="Times New Roman"/>
+                <w:b w:val="0"/>
+                <w:i w:val="0"/>
+                <w:color w:val="000000"/>
+                <w:sz w:val="14"/>
+              </w:rPr>
+              <w:t>Alnasyan et al. [9]</w:t>
+            </w:r>
+          </w:p>
+        </w:tc>
+        <w:tc>
+          <w:tcPr>
+            <w:tcW w:type="dxa" w:w="1094"/>
+            <w:tcMar>
+              <w:top w:w="60" w:type="dxa"/>
+              <w:start w:w="80" w:type="dxa"/>
+              <w:bottom w:w="60" w:type="dxa"/>
+              <w:end w:w="80" w:type="dxa"/>
+            </w:tcMar>
+            <w:vAlign w:val="center"/>
+          </w:tcPr>
+          <w:p>
+            <w:pPr>
+              <w:spacing w:after="0"/>
+              <w:jc w:val="center"/>
+            </w:pPr>
+            <w:r/>
+            <w:r>
+              <w:rPr>
+                <w:rFonts w:ascii="Times New Roman" w:hAnsi="Times New Roman"/>
+                <w:b w:val="0"/>
+                <w:i/>
+                <w:color w:val="000000"/>
+                <w:sz w:val="14"/>
+              </w:rPr>
+              <w:t>Pass</w:t>
+            </w:r>
+            <w:r>
+              <w:rPr>
+                <w:rFonts w:ascii="Times New Roman" w:hAnsi="Times New Roman"/>
+                <w:b w:val="0"/>
+                <w:i w:val="0"/>
+                <w:color w:val="000000"/>
+                <w:sz w:val="14"/>
+              </w:rPr>
+              <w:t xml:space="preserve"> + </w:t>
+            </w:r>
+            <w:r>
+              <w:rPr>
+                <w:rFonts w:ascii="Times New Roman" w:hAnsi="Times New Roman"/>
+                <w:b w:val="0"/>
+                <w:i/>
+                <w:color w:val="000000"/>
+                <w:sz w:val="14"/>
+              </w:rPr>
+              <w:t>Distinction</w:t>
+            </w:r>
+            <w:r>
+              <w:rPr>
+                <w:rFonts w:ascii="Times New Roman" w:hAnsi="Times New Roman"/>
+                <w:b w:val="0"/>
+                <w:i w:val="0"/>
+                <w:color w:val="000000"/>
+                <w:sz w:val="14"/>
+              </w:rPr>
+              <w:t xml:space="preserve"> vs </w:t>
+            </w:r>
+            <w:r>
+              <w:rPr>
+                <w:rFonts w:ascii="Times New Roman" w:hAnsi="Times New Roman"/>
+                <w:b w:val="0"/>
+                <w:i/>
+                <w:color w:val="000000"/>
+                <w:sz w:val="14"/>
+              </w:rPr>
+              <w:t>Fail</w:t>
+            </w:r>
+            <w:r>
+              <w:rPr>
+                <w:rFonts w:ascii="Times New Roman" w:hAnsi="Times New Roman"/>
+                <w:b w:val="0"/>
+                <w:i w:val="0"/>
+                <w:color w:val="000000"/>
+                <w:sz w:val="14"/>
+              </w:rPr>
+              <w:t xml:space="preserve"> + </w:t>
+            </w:r>
+            <w:r>
+              <w:rPr>
+                <w:rFonts w:ascii="Times New Roman" w:hAnsi="Times New Roman"/>
+                <w:b w:val="0"/>
+                <w:i/>
+                <w:color w:val="000000"/>
+                <w:sz w:val="14"/>
+              </w:rPr>
+              <w:t>Withdrawn</w:t>
+            </w:r>
+          </w:p>
+        </w:tc>
+        <w:tc>
+          <w:tcPr>
+            <w:tcW w:type="dxa" w:w="1094"/>
+            <w:tcMar>
+              <w:top w:w="60" w:type="dxa"/>
+              <w:start w:w="80" w:type="dxa"/>
+              <w:bottom w:w="60" w:type="dxa"/>
+              <w:end w:w="80" w:type="dxa"/>
+            </w:tcMar>
+            <w:vAlign w:val="center"/>
+          </w:tcPr>
+          <w:p>
+            <w:pPr>
+              <w:spacing w:after="0"/>
+              <w:jc w:val="center"/>
+            </w:pPr>
+            <w:r/>
+            <w:r>
+              <w:rPr>
+                <w:rFonts w:ascii="Times New Roman" w:hAnsi="Times New Roman"/>
+                <w:b w:val="0"/>
+                <w:i w:val="0"/>
+                <w:color w:val="000000"/>
+                <w:sz w:val="14"/>
+              </w:rPr>
+              <w:t>KANFormer</w:t>
+            </w:r>
+          </w:p>
+        </w:tc>
+        <w:tc>
+          <w:tcPr>
+            <w:tcW w:type="dxa" w:w="1094"/>
+            <w:tcMar>
+              <w:top w:w="60" w:type="dxa"/>
+              <w:start w:w="80" w:type="dxa"/>
+              <w:bottom w:w="60" w:type="dxa"/>
+              <w:end w:w="80" w:type="dxa"/>
+            </w:tcMar>
+            <w:vAlign w:val="center"/>
+          </w:tcPr>
+          <w:p>
+            <w:pPr>
+              <w:spacing w:after="0"/>
+              <w:jc w:val="center"/>
+            </w:pPr>
+            <w:r/>
+            <w:r>
+              <w:rPr>
+                <w:rFonts w:ascii="Times New Roman" w:hAnsi="Times New Roman"/>
+                <w:b w:val="0"/>
+                <w:i w:val="0"/>
+                <w:color w:val="000000"/>
+                <w:sz w:val="14"/>
+              </w:rPr>
+              <w:t>0,9459</w:t>
+            </w:r>
+          </w:p>
+        </w:tc>
+        <w:tc>
+          <w:tcPr>
+            <w:tcW w:type="dxa" w:w="1094"/>
+            <w:tcMar>
+              <w:top w:w="60" w:type="dxa"/>
+              <w:start w:w="80" w:type="dxa"/>
+              <w:bottom w:w="60" w:type="dxa"/>
+              <w:end w:w="80" w:type="dxa"/>
+            </w:tcMar>
+            <w:vAlign w:val="center"/>
+          </w:tcPr>
+          <w:p>
+            <w:pPr>
+              <w:spacing w:after="0"/>
+              <w:jc w:val="center"/>
+            </w:pPr>
+            <w:r/>
+            <w:r>
+              <w:rPr>
+                <w:rFonts w:ascii="Times New Roman" w:hAnsi="Times New Roman"/>
+                <w:b w:val="0"/>
+                <w:i w:val="0"/>
+                <w:color w:val="000000"/>
+                <w:sz w:val="14"/>
+              </w:rPr>
+              <w:t>0,9495</w:t>
+            </w:r>
+          </w:p>
+        </w:tc>
+        <w:tc>
+          <w:tcPr>
+            <w:tcW w:type="dxa" w:w="1094"/>
+            <w:tcMar>
+              <w:top w:w="60" w:type="dxa"/>
+              <w:start w:w="80" w:type="dxa"/>
+              <w:bottom w:w="60" w:type="dxa"/>
+              <w:end w:w="80" w:type="dxa"/>
+            </w:tcMar>
+            <w:vAlign w:val="center"/>
+          </w:tcPr>
+          <w:p>
+            <w:pPr>
+              <w:spacing w:after="0"/>
+              <w:jc w:val="center"/>
+            </w:pPr>
+            <w:r/>
+            <w:r>
+              <w:rPr>
+                <w:rFonts w:ascii="Times New Roman" w:hAnsi="Times New Roman"/>
+                <w:b w:val="0"/>
+                <w:i w:val="0"/>
+                <w:color w:val="000000"/>
+                <w:sz w:val="14"/>
+              </w:rPr>
+              <w:t>0,9482</w:t>
+            </w:r>
+          </w:p>
+        </w:tc>
+        <w:tc>
+          <w:tcPr>
+            <w:tcW w:type="dxa" w:w="1094"/>
+            <w:tcMar>
+              <w:top w:w="60" w:type="dxa"/>
+              <w:start w:w="80" w:type="dxa"/>
+              <w:bottom w:w="60" w:type="dxa"/>
+              <w:end w:w="80" w:type="dxa"/>
+            </w:tcMar>
+            <w:vAlign w:val="center"/>
+          </w:tcPr>
+          <w:p>
+            <w:pPr>
+              <w:spacing w:after="0"/>
+              <w:jc w:val="center"/>
+            </w:pPr>
+            <w:r/>
+            <w:r>
+              <w:rPr>
+                <w:rFonts w:ascii="Times New Roman" w:hAnsi="Times New Roman"/>
+                <w:b w:val="0"/>
+                <w:i w:val="0"/>
+                <w:color w:val="000000"/>
+                <w:sz w:val="14"/>
+              </w:rPr>
+              <w:t>0,9481</w:t>
+            </w:r>
+          </w:p>
+        </w:tc>
+        <w:tc>
+          <w:tcPr>
+            <w:tcW w:type="dxa" w:w="1096"/>
+            <w:tcMar>
+              <w:top w:w="60" w:type="dxa"/>
+              <w:start w:w="80" w:type="dxa"/>
+              <w:bottom w:w="60" w:type="dxa"/>
+              <w:end w:w="80" w:type="dxa"/>
+            </w:tcMar>
+            <w:vAlign w:val="center"/>
+          </w:tcPr>
+          <w:p>
+            <w:pPr>
+              <w:spacing w:after="0"/>
+              <w:jc w:val="center"/>
+            </w:pPr>
+            <w:r/>
+            <w:r>
+              <w:rPr>
+                <w:rFonts w:ascii="Times New Roman" w:hAnsi="Times New Roman"/>
+                <w:b w:val="0"/>
+                <w:i w:val="0"/>
+                <w:color w:val="000000"/>
+                <w:sz w:val="14"/>
+              </w:rPr>
+              <w:t>0,9835</w:t>
+            </w:r>
+          </w:p>
+        </w:tc>
+      </w:tr>
+      <w:tr>
+        <w:tc>
+          <w:tcPr>
+            <w:tcW w:type="dxa" w:w="2600"/>
+            <w:tcMar>
+              <w:top w:w="60" w:type="dxa"/>
+              <w:start w:w="80" w:type="dxa"/>
+              <w:bottom w:w="60" w:type="dxa"/>
+              <w:end w:w="80" w:type="dxa"/>
+            </w:tcMar>
+            <w:vAlign w:val="center"/>
+          </w:tcPr>
+          <w:p>
+            <w:pPr>
+              <w:spacing w:after="0"/>
+              <w:jc w:val="left"/>
+            </w:pPr>
+            <w:r/>
+            <w:r>
+              <w:rPr>
+                <w:rFonts w:ascii="Times New Roman" w:hAnsi="Times New Roman"/>
+                <w:b w:val="0"/>
+                <w:i w:val="0"/>
+                <w:color w:val="000000"/>
+                <w:sz w:val="14"/>
+              </w:rPr>
+              <w:t>Penelitian ini</w:t>
+            </w:r>
+          </w:p>
+        </w:tc>
+        <w:tc>
+          <w:tcPr>
+            <w:tcW w:type="dxa" w:w="1094"/>
+            <w:tcMar>
+              <w:top w:w="60" w:type="dxa"/>
+              <w:start w:w="80" w:type="dxa"/>
+              <w:bottom w:w="60" w:type="dxa"/>
+              <w:end w:w="80" w:type="dxa"/>
+            </w:tcMar>
+            <w:vAlign w:val="center"/>
+          </w:tcPr>
+          <w:p>
+            <w:pPr>
+              <w:spacing w:after="0"/>
+              <w:jc w:val="center"/>
+            </w:pPr>
+            <w:r/>
+            <w:r>
+              <w:rPr>
+                <w:rFonts w:ascii="Times New Roman" w:hAnsi="Times New Roman"/>
+                <w:b w:val="0"/>
+                <w:i w:val="0"/>
+                <w:color w:val="000000"/>
+                <w:sz w:val="14"/>
+              </w:rPr>
+              <w:t>Cut-off hari ke-28, group split</w:t>
+            </w:r>
+          </w:p>
+        </w:tc>
+        <w:tc>
+          <w:tcPr>
+            <w:tcW w:type="dxa" w:w="1094"/>
+            <w:tcMar>
+              <w:top w:w="60" w:type="dxa"/>
+              <w:start w:w="80" w:type="dxa"/>
+              <w:bottom w:w="60" w:type="dxa"/>
+              <w:end w:w="80" w:type="dxa"/>
+            </w:tcMar>
+            <w:vAlign w:val="center"/>
+          </w:tcPr>
+          <w:p>
+            <w:pPr>
+              <w:spacing w:after="0"/>
+              <w:jc w:val="center"/>
+            </w:pPr>
+            <w:r/>
+            <w:r>
+              <w:rPr>
+                <w:rFonts w:ascii="Times New Roman" w:hAnsi="Times New Roman"/>
+                <w:b w:val="0"/>
+                <w:i w:val="0"/>
+                <w:color w:val="000000"/>
+                <w:sz w:val="14"/>
+              </w:rPr>
+              <w:t>Random Forest</w:t>
+            </w:r>
+          </w:p>
+        </w:tc>
+        <w:tc>
+          <w:tcPr>
+            <w:tcW w:type="dxa" w:w="1094"/>
+            <w:tcMar>
+              <w:top w:w="60" w:type="dxa"/>
+              <w:start w:w="80" w:type="dxa"/>
+              <w:bottom w:w="60" w:type="dxa"/>
+              <w:end w:w="80" w:type="dxa"/>
+            </w:tcMar>
+            <w:vAlign w:val="center"/>
+          </w:tcPr>
+          <w:p>
+            <w:pPr>
+              <w:spacing w:after="0"/>
+              <w:jc w:val="center"/>
+            </w:pPr>
+            <w:r/>
+            <w:r>
+              <w:rPr>
+                <w:rFonts w:ascii="Times New Roman" w:hAnsi="Times New Roman"/>
+                <w:b w:val="0"/>
+                <w:i w:val="0"/>
+                <w:color w:val="000000"/>
+                <w:sz w:val="14"/>
+              </w:rPr>
+              <w:t>0,7594</w:t>
+            </w:r>
+          </w:p>
+        </w:tc>
+        <w:tc>
+          <w:tcPr>
+            <w:tcW w:type="dxa" w:w="1094"/>
+            <w:tcMar>
+              <w:top w:w="60" w:type="dxa"/>
+              <w:start w:w="80" w:type="dxa"/>
+              <w:bottom w:w="60" w:type="dxa"/>
+              <w:end w:w="80" w:type="dxa"/>
+            </w:tcMar>
+            <w:vAlign w:val="center"/>
+          </w:tcPr>
+          <w:p>
+            <w:pPr>
+              <w:spacing w:after="0"/>
+              <w:jc w:val="center"/>
+            </w:pPr>
+            <w:r/>
+            <w:r>
+              <w:rPr>
+                <w:rFonts w:ascii="Times New Roman" w:hAnsi="Times New Roman"/>
+                <w:b w:val="0"/>
+                <w:i w:val="0"/>
+                <w:color w:val="000000"/>
+                <w:sz w:val="14"/>
+              </w:rPr>
+              <w:t>0,8007</w:t>
+            </w:r>
+          </w:p>
+        </w:tc>
+        <w:tc>
+          <w:tcPr>
+            <w:tcW w:type="dxa" w:w="1094"/>
+            <w:tcMar>
+              <w:top w:w="60" w:type="dxa"/>
+              <w:start w:w="80" w:type="dxa"/>
+              <w:bottom w:w="60" w:type="dxa"/>
+              <w:end w:w="80" w:type="dxa"/>
+            </w:tcMar>
+            <w:vAlign w:val="center"/>
+          </w:tcPr>
+          <w:p>
+            <w:pPr>
+              <w:spacing w:after="0"/>
+              <w:jc w:val="center"/>
+            </w:pPr>
+            <w:r/>
+            <w:r>
+              <w:rPr>
+                <w:rFonts w:ascii="Times New Roman" w:hAnsi="Times New Roman"/>
+                <w:b w:val="0"/>
+                <w:i w:val="0"/>
+                <w:color w:val="000000"/>
+                <w:sz w:val="14"/>
+              </w:rPr>
+              <w:t>0,7213</w:t>
+            </w:r>
+          </w:p>
+        </w:tc>
+        <w:tc>
+          <w:tcPr>
+            <w:tcW w:type="dxa" w:w="1094"/>
+            <w:tcMar>
+              <w:top w:w="60" w:type="dxa"/>
+              <w:start w:w="80" w:type="dxa"/>
+              <w:bottom w:w="60" w:type="dxa"/>
+              <w:end w:w="80" w:type="dxa"/>
+            </w:tcMar>
+            <w:vAlign w:val="center"/>
+          </w:tcPr>
+          <w:p>
+            <w:pPr>
+              <w:spacing w:after="0"/>
+              <w:jc w:val="center"/>
+            </w:pPr>
+            <w:r/>
+            <w:r>
+              <w:rPr>
+                <w:rFonts w:ascii="Times New Roman" w:hAnsi="Times New Roman"/>
+                <w:b w:val="0"/>
+                <w:i w:val="0"/>
+                <w:color w:val="000000"/>
+                <w:sz w:val="14"/>
+              </w:rPr>
+              <w:t>0,7589</w:t>
+            </w:r>
+          </w:p>
+        </w:tc>
+        <w:tc>
+          <w:tcPr>
+            <w:tcW w:type="dxa" w:w="1096"/>
+            <w:tcMar>
+              <w:top w:w="60" w:type="dxa"/>
+              <w:start w:w="80" w:type="dxa"/>
+              <w:bottom w:w="60" w:type="dxa"/>
+              <w:end w:w="80" w:type="dxa"/>
+            </w:tcMar>
+            <w:vAlign w:val="center"/>
+          </w:tcPr>
+          <w:p>
+            <w:pPr>
+              <w:spacing w:after="0"/>
+              <w:jc w:val="center"/>
+            </w:pPr>
+            <w:r/>
+            <w:r>
+              <w:rPr>
+                <w:rFonts w:ascii="Times New Roman" w:hAnsi="Times New Roman"/>
+                <w:b w:val="0"/>
+                <w:i w:val="0"/>
+                <w:color w:val="000000"/>
+                <w:sz w:val="14"/>
+              </w:rPr>
+              <w:t>0,8396</w:t>
+            </w:r>
+          </w:p>
+        </w:tc>
+      </w:tr>
+    </w:tbl>
+    <w:p>
+      <w:pPr>
+        <w:sectPr>
+          <w:type w:val="continuous"/>
+          <w:pgSz w:w="12240" w:h="15840"/>
+          <w:pgMar w:top="936" w:right="936" w:bottom="936" w:left="936" w:header="432" w:footer="432" w:gutter="0"/>
+          <w:cols w:space="360" w:num="1" w:equalWidth="1"/>
+          <w:docGrid w:linePitch="360"/>
+        </w:sectPr>
+      </w:pPr>
+    </w:p>
+    <w:p>
+      <w:pPr>
+        <w:spacing w:before="0" w:after="140" w:line="240" w:lineRule="auto"/>
+      </w:pPr>
+    </w:p>
+    <w:p>
+      <w:pPr>
+        <w:pStyle w:val="Heading2"/>
+        <w:keepNext/>
+        <w:spacing w:before="100" w:after="40"/>
+        <w:jc w:val="left"/>
+      </w:pPr>
+      <w:r>
+        <w:rPr>
+          <w:rFonts w:ascii="Times New Roman" w:hAnsi="Times New Roman"/>
+          <w:i/>
+          <w:color w:val="000000"/>
+          <w:sz w:val="20"/>
+        </w:rPr>
+        <w:t>E. Knowledge-Based Risk Layer</w:t>
       </w:r>
     </w:p>
     <w:p>
@@ -5343,7 +7429,84 @@
           <w:color w:val="000000"/>
           <w:sz w:val="20"/>
         </w:rPr>
-        <w:t>Tabel III membandingkan Random Forest dengan sistem gabungan. Knowledge layer meningkatkan recall dari 0,7172 menjadi 0,7849. Precision berubah dari 0,8032 menjadi 0,7039, sedangkan accuracy berubah dari 0,7592 menjadi 0,7136. Perubahan tersebut menunjukkan perluasan cakupan deteksi disertai peningkatan jumlah alarm yang memerlukan verifikasi stakeholder.</w:t>
+        <w:t xml:space="preserve">Threshold kuartil bawah data train-validation adalah skor assessment 0, jumlah assessment 0, total klik VLE 47, dan hari aktif VLE 4. Nilai nol pada indikator assessment menunjukkan bahwa sebagian mahasiswa belum mengumpulkan assessment sampai akhir minggu keempat. Knowledge layer menghasilkan 1.816 </w:t>
+      </w:r>
+      <w:r>
+        <w:rPr>
+          <w:rFonts w:ascii="Times New Roman" w:hAnsi="Times New Roman"/>
+          <w:b w:val="0"/>
+          <w:i/>
+          <w:color w:val="000000"/>
+          <w:sz w:val="20"/>
+        </w:rPr>
+        <w:t>High Risk</w:t>
+      </w:r>
+      <w:r>
+        <w:rPr>
+          <w:rFonts w:ascii="Times New Roman" w:hAnsi="Times New Roman"/>
+          <w:b w:val="0"/>
+          <w:i w:val="0"/>
+          <w:color w:val="000000"/>
+          <w:sz w:val="20"/>
+        </w:rPr>
+        <w:t xml:space="preserve">, 1.979 </w:t>
+      </w:r>
+      <w:r>
+        <w:rPr>
+          <w:rFonts w:ascii="Times New Roman" w:hAnsi="Times New Roman"/>
+          <w:b w:val="0"/>
+          <w:i/>
+          <w:color w:val="000000"/>
+          <w:sz w:val="20"/>
+        </w:rPr>
+        <w:t>Medium Risk</w:t>
+      </w:r>
+      <w:r>
+        <w:rPr>
+          <w:rFonts w:ascii="Times New Roman" w:hAnsi="Times New Roman"/>
+          <w:b w:val="0"/>
+          <w:i w:val="0"/>
+          <w:color w:val="000000"/>
+          <w:sz w:val="20"/>
+        </w:rPr>
+        <w:t xml:space="preserve">, dan 2.676 </w:t>
+      </w:r>
+      <w:r>
+        <w:rPr>
+          <w:rFonts w:ascii="Times New Roman" w:hAnsi="Times New Roman"/>
+          <w:b w:val="0"/>
+          <w:i/>
+          <w:color w:val="000000"/>
+          <w:sz w:val="20"/>
+        </w:rPr>
+        <w:t>Low Risk</w:t>
+      </w:r>
+      <w:r>
+        <w:rPr>
+          <w:rFonts w:ascii="Times New Roman" w:hAnsi="Times New Roman"/>
+          <w:b w:val="0"/>
+          <w:i w:val="0"/>
+          <w:color w:val="000000"/>
+          <w:sz w:val="20"/>
+        </w:rPr>
+        <w:t xml:space="preserve"> pada hold-out test.</w:t>
+      </w:r>
+    </w:p>
+    <w:p>
+      <w:pPr>
+        <w:spacing w:before="0" w:after="60" w:line="240" w:lineRule="auto"/>
+        <w:ind w:firstLine="259"/>
+        <w:jc w:val="both"/>
+      </w:pPr>
+      <w:r>
+        <w:rPr>
+          <w:rFonts w:ascii="Times New Roman" w:hAnsi="Times New Roman"/>
+          <w:b w:val="0"/>
+          <w:i w:val="0"/>
+          <w:color w:val="000000"/>
+          <w:sz w:val="20"/>
+        </w:rPr>
+        <w:t>Tabel IV membandingkan Random Forest dengan sistem gabungan. Knowledge layer meningkatkan recall dari 0,7213 menjadi 0,7866. Precision berubah dari 0,8007 menjadi 0,7043, sedangkan accuracy berubah dari 0,7594 menjadi 0,7146. Perubahan tersebut menunjukkan perluasan cakupan deteksi disertai peningkatan jumlah alarm yang memerlukan verifikasi stakeholder.</w:t>
       </w:r>
     </w:p>
     <w:p>
@@ -5358,7 +7521,7 @@
           <w:color w:val="000000"/>
           <w:sz w:val="16"/>
         </w:rPr>
-        <w:t>TABLE III</w:t>
+        <w:t>TABLE IV</w:t>
         <w:br/>
       </w:r>
       <w:r>
@@ -5533,7 +7696,7 @@
                 <w:color w:val="000000"/>
                 <w:sz w:val="13"/>
               </w:rPr>
-              <w:t>0,7592</w:t>
+              <w:t>0,7594</w:t>
             </w:r>
           </w:p>
         </w:tc>
@@ -5562,7 +7725,7 @@
                 <w:color w:val="000000"/>
                 <w:sz w:val="13"/>
               </w:rPr>
-              <w:t>0,7136</w:t>
+              <w:t>0,7146</w:t>
             </w:r>
           </w:p>
         </w:tc>
@@ -5622,7 +7785,7 @@
                 <w:color w:val="000000"/>
                 <w:sz w:val="13"/>
               </w:rPr>
-              <w:t>0,8032</w:t>
+              <w:t>0,8007</w:t>
             </w:r>
           </w:p>
         </w:tc>
@@ -5651,7 +7814,7 @@
                 <w:color w:val="000000"/>
                 <w:sz w:val="13"/>
               </w:rPr>
-              <w:t>0,7039</w:t>
+              <w:t>0,7043</w:t>
             </w:r>
           </w:p>
         </w:tc>
@@ -5711,7 +7874,7 @@
                 <w:color w:val="000000"/>
                 <w:sz w:val="13"/>
               </w:rPr>
-              <w:t>0,7172</w:t>
+              <w:t>0,7213</w:t>
             </w:r>
           </w:p>
         </w:tc>
@@ -5740,7 +7903,7 @@
                 <w:color w:val="000000"/>
                 <w:sz w:val="13"/>
               </w:rPr>
-              <w:t>0,7849</w:t>
+              <w:t>0,7866</w:t>
             </w:r>
           </w:p>
         </w:tc>
@@ -5800,7 +7963,7 @@
                 <w:color w:val="000000"/>
                 <w:sz w:val="13"/>
               </w:rPr>
-              <w:t>0,7578</w:t>
+              <w:t>0,7589</w:t>
             </w:r>
           </w:p>
         </w:tc>
@@ -5829,7 +7992,7 @@
                 <w:color w:val="000000"/>
                 <w:sz w:val="13"/>
               </w:rPr>
-              <w:t>0,7422</w:t>
+              <w:t>0,7432</w:t>
             </w:r>
           </w:p>
         </w:tc>
@@ -5854,7 +8017,7 @@
           <w:color w:val="000000"/>
           <w:sz w:val="20"/>
         </w:rPr>
-        <w:t>E. Business Intelligence Output</w:t>
+        <w:t>F. Business Intelligence Output</w:t>
       </w:r>
     </w:p>
     <w:p>
@@ -5871,7 +8034,7 @@
           <w:color w:val="000000"/>
           <w:sz w:val="20"/>
         </w:rPr>
-        <w:t xml:space="preserve">Dashboard mengidentifikasi 3.789 student-module-presentation dalam antrean </w:t>
+        <w:t xml:space="preserve">Dashboard mengidentifikasi 3.795 student-module-presentation dalam antrean </w:t>
       </w:r>
       <w:r>
         <w:rPr>
@@ -6139,7 +8302,7 @@
           <w:color w:val="000000"/>
           <w:sz w:val="20"/>
         </w:rPr>
-        <w:t xml:space="preserve"> tertinggi pada cross-validation dan hold-out test. Penelitian ini memprioritaskan recall karena early warning diarahkan untuk memperluas cakupan mahasiswa berisiko yang dapat diverifikasi oleh stakeholder. F1-score Random Forest dan XGBoost pada hold-out test memiliki nilai sama sebesar 0,7578, sehingga recall menjadi pembeda yang relevan.</w:t>
+        <w:t xml:space="preserve"> tertinggi pada cross-validation dan hold-out test. Penelitian ini memprioritaskan recall karena early warning diarahkan untuk memperluas cakupan mahasiswa berisiko yang dapat diverifikasi oleh stakeholder. F1-score Random Forest pada hold-out test mencapai 0,7589, diikuti XGBoost sebesar 0,7559.</w:t>
       </w:r>
     </w:p>
     <w:p>
@@ -6190,7 +8353,7 @@
           <w:color w:val="000000"/>
           <w:sz w:val="20"/>
         </w:rPr>
-        <w:t xml:space="preserve">Knowledge-based risk layer meningkatkan recall sebesar 0,0677 poin dari 0,7172 menjadi 0,7849. Peningkatan tersebut memperluas cakupan mahasiswa </w:t>
+        <w:t xml:space="preserve">Knowledge-based risk layer meningkatkan recall sebesar 0,0653 poin dari 0,7213 menjadi 0,7866. Peningkatan tersebut memperluas cakupan mahasiswa </w:t>
       </w:r>
       <w:r>
         <w:rPr>
@@ -6210,7 +8373,7 @@
           <w:color w:val="000000"/>
           <w:sz w:val="20"/>
         </w:rPr>
-        <w:t xml:space="preserve"> yang masuk antrean intervensi. Penurunan precision menjadi 0,7039 menunjukkan bertambahnya kasus yang perlu diverifikasi. Trade-off ini berkaitan langsung dengan kapasitas operasional. Institusi dengan sumber daya konseling terbatas dapat memprioritaskan </w:t>
+        <w:t xml:space="preserve"> yang masuk antrean intervensi. Precision sebesar 0,7043 menunjukkan proporsi alarm yang sesuai dengan label aktual. Trade-off ini berkaitan langsung dengan kapasitas operasional. Institusi dengan sumber daya konseling terbatas dapat memprioritaskan </w:t>
       </w:r>
       <w:r>
         <w:rPr>
@@ -6392,7 +8555,7 @@
           <w:color w:val="000000"/>
           <w:sz w:val="20"/>
         </w:rPr>
-        <w:t xml:space="preserve"> cross-validation tertinggi sebesar 0,7126. Pada hold-out test, model menghasilkan accuracy 0,7592, precision 0,8032, recall 0,7172, F1-score 0,7578, dan ROC-AUC 0,8396. Knowledge-based risk layer meningkatkan recall menjadi 0,7849 dengan menggabungkan prediksi model dan empat sinyal perilaku awal. Sistem menghasilkan level risiko, alasan, dan rekomendasi yang dapat diterjemahkan menjadi antrean intervensi.</w:t>
+        <w:t xml:space="preserve"> cross-validation tertinggi sebesar 0,7107. Pada hold-out test, model menghasilkan accuracy 0,7594, precision 0,8007, recall 0,7213, F1-score 0,7589, dan ROC-AUC 0,8396. Knowledge-based risk layer meningkatkan recall menjadi 0,7866 dengan menggabungkan prediksi model dan empat sinyal perilaku awal. Sistem menghasilkan level risiko, alasan, dan rekomendasi yang dapat diterjemahkan menjadi antrean intervensi.</w:t>
       </w:r>
     </w:p>
     <w:p>
@@ -6608,7 +8771,7 @@
           <w:color w:val="000000"/>
           <w:sz w:val="16"/>
         </w:rPr>
-        <w:t xml:space="preserve">[5] T. Kustitskaya et al., "Hybrid Approach to Predicting Learning Success Based on Digital Educational History for Timely Identification of At-Risk Students," </w:t>
+        <w:t xml:space="preserve">[5] Z. Shou, M. Xie, J. Mo, and H. Zhang, "Predicting Student Performance in Online Learning: A Multidimensional Time-Series Data Analysis Approach," </w:t>
       </w:r>
       <w:r>
         <w:rPr>
@@ -6618,7 +8781,7 @@
           <w:color w:val="000000"/>
           <w:sz w:val="16"/>
         </w:rPr>
-        <w:t>Education Sciences</w:t>
+        <w:t>Applied Sciences</w:t>
       </w:r>
       <w:r>
         <w:rPr>
@@ -6628,7 +8791,7 @@
           <w:color w:val="000000"/>
           <w:sz w:val="16"/>
         </w:rPr>
-        <w:t>, 2024, doi: 10.3390/educsci14060657.</w:t>
+        <w:t>, vol. 14, no. 6, article no. 2522, 2024, doi: 10.3390/app14062522.</w:t>
       </w:r>
     </w:p>
     <w:p>
@@ -6645,7 +8808,7 @@
           <w:color w:val="000000"/>
           <w:sz w:val="16"/>
         </w:rPr>
-        <w:t xml:space="preserve">[6] M. Carballo-Mendivil et al., "Predicting Student Dropout from Day One: XGBoost-Based Early Warning System Using Pre-Enrollment Data," </w:t>
+        <w:t xml:space="preserve">[6] K. Jawad, M. A. Shah, and M. Tahir, "Students' Academic Performance and Engagement Prediction in a Virtual Learning Environment Using Random Forest with Data Balancing," </w:t>
       </w:r>
       <w:r>
         <w:rPr>
@@ -6655,7 +8818,7 @@
           <w:color w:val="000000"/>
           <w:sz w:val="16"/>
         </w:rPr>
-        <w:t>Applied Sciences</w:t>
+        <w:t>Sustainability</w:t>
       </w:r>
       <w:r>
         <w:rPr>
@@ -6665,7 +8828,7 @@
           <w:color w:val="000000"/>
           <w:sz w:val="16"/>
         </w:rPr>
-        <w:t>, 2025, doi: 10.3390/app15169202.</w:t>
+        <w:t>, vol. 14, no. 22, article no. 14795, 2022, doi: 10.3390/su142214795.</w:t>
       </w:r>
     </w:p>
     <w:p>
@@ -6682,7 +8845,7 @@
           <w:color w:val="000000"/>
           <w:sz w:val="16"/>
         </w:rPr>
-        <w:t xml:space="preserve">[7] A. Garmpis et al., "Assisting Educational Analytics with AutoML Functionalities," </w:t>
+        <w:t xml:space="preserve">[7] S. A. A. Balabied and H. F. Eid, "Utilizing Random Forest Algorithm for Early Detection of Academic Underperformance in Open Learning Environments," </w:t>
       </w:r>
       <w:r>
         <w:rPr>
@@ -6692,7 +8855,7 @@
           <w:color w:val="000000"/>
           <w:sz w:val="16"/>
         </w:rPr>
-        <w:t>Computers</w:t>
+        <w:t>PeerJ Computer Science</w:t>
       </w:r>
       <w:r>
         <w:rPr>
@@ -6702,7 +8865,7 @@
           <w:color w:val="000000"/>
           <w:sz w:val="16"/>
         </w:rPr>
-        <w:t>, 2022, doi: 10.3390/computers11060097.</w:t>
+        <w:t>, vol. 9, article no. e1708, 2023, doi: 10.7717/peerj-cs.1708.</w:t>
       </w:r>
     </w:p>
     <w:p>
@@ -6719,7 +8882,7 @@
           <w:color w:val="000000"/>
           <w:sz w:val="16"/>
         </w:rPr>
-        <w:t xml:space="preserve">[8] C. Y. Tsai et al., "Precision education with statistical learning and deep learning: a case study in Taiwan," </w:t>
+        <w:t xml:space="preserve">[8] B. Ujkani, D. Minkovska, and N. Hinov, "Course Success Prediction and Early Identification of At-Risk Students Using Explainable Artificial Intelligence," </w:t>
       </w:r>
       <w:r>
         <w:rPr>
@@ -6729,7 +8892,7 @@
           <w:color w:val="000000"/>
           <w:sz w:val="16"/>
         </w:rPr>
-        <w:t>International Journal of Educational Technology in Higher Education</w:t>
+        <w:t>Electronics</w:t>
       </w:r>
       <w:r>
         <w:rPr>
@@ -6739,7 +8902,7 @@
           <w:color w:val="000000"/>
           <w:sz w:val="16"/>
         </w:rPr>
-        <w:t>, 2020, doi: 10.1186/s41239-020-00186-2.</w:t>
+        <w:t>, vol. 13, no. 21, article no. 4157, 2024, doi: 10.3390/electronics13214157.</w:t>
       </w:r>
     </w:p>
     <w:p>
@@ -6756,7 +8919,7 @@
           <w:color w:val="000000"/>
           <w:sz w:val="16"/>
         </w:rPr>
-        <w:t xml:space="preserve">[9] M. V. Martins et al., "Multi-Class Phased Prediction of Academic Performance and Dropout in Higher Education," </w:t>
+        <w:t xml:space="preserve">[9] B. Alnasyan, M. Basheri, M. Alassafi, and K. Alnasyan, "Kanformer: An Attention-Enhanced Deep Learning Model for Predicting Student Performance in Virtual Learning Environments," </w:t>
       </w:r>
       <w:r>
         <w:rPr>
@@ -6766,7 +8929,7 @@
           <w:color w:val="000000"/>
           <w:sz w:val="16"/>
         </w:rPr>
-        <w:t>Applied Sciences</w:t>
+        <w:t>Social Network Analysis and Mining</w:t>
       </w:r>
       <w:r>
         <w:rPr>
@@ -6776,7 +8939,7 @@
           <w:color w:val="000000"/>
           <w:sz w:val="16"/>
         </w:rPr>
-        <w:t>, 2023, doi: 10.3390/app13084702.</w:t>
+        <w:t>, vol. 15, article no. 25, 2025, doi: 10.1007/s13278-025-01446-7.</w:t>
       </w:r>
     </w:p>
     <w:p>
@@ -6793,7 +8956,7 @@
           <w:color w:val="000000"/>
           <w:sz w:val="16"/>
         </w:rPr>
-        <w:t xml:space="preserve">[10] J. R. Rico-Juan et al., "Study regarding the influence of a student's personality and an LMS usage profile on learning performance using machine learning techniques," </w:t>
+        <w:t xml:space="preserve">[10] T. Kustitskaya et al., "Hybrid Approach to Predicting Learning Success Based on Digital Educational History for Timely Identification of At-Risk Students," </w:t>
       </w:r>
       <w:r>
         <w:rPr>
@@ -6803,7 +8966,7 @@
           <w:color w:val="000000"/>
           <w:sz w:val="16"/>
         </w:rPr>
-        <w:t>Applied Intelligence</w:t>
+        <w:t>Education Sciences</w:t>
       </w:r>
       <w:r>
         <w:rPr>
@@ -6813,7 +8976,7 @@
           <w:color w:val="000000"/>
           <w:sz w:val="16"/>
         </w:rPr>
-        <w:t>, 2024, doi: 10.1007/s10489-024-05483-1.</w:t>
+        <w:t>, 2024, doi: 10.3390/educsci14060657.</w:t>
       </w:r>
     </w:p>
     <w:p>
@@ -6830,7 +8993,192 @@
           <w:color w:val="000000"/>
           <w:sz w:val="16"/>
         </w:rPr>
-        <w:t xml:space="preserve">[11] J. Berens et al., "Crossing individual university boundaries: a comprehensive approach to predicting dropouts in the higher education system," </w:t>
+        <w:t xml:space="preserve">[11] M. Carballo-Mendivil et al., "Predicting Student Dropout from Day One: XGBoost-Based Early Warning System Using Pre-Enrollment Data," </w:t>
+      </w:r>
+      <w:r>
+        <w:rPr>
+          <w:rFonts w:ascii="Times New Roman" w:hAnsi="Times New Roman"/>
+          <w:b w:val="0"/>
+          <w:i/>
+          <w:color w:val="000000"/>
+          <w:sz w:val="16"/>
+        </w:rPr>
+        <w:t>Applied Sciences</w:t>
+      </w:r>
+      <w:r>
+        <w:rPr>
+          <w:rFonts w:ascii="Times New Roman" w:hAnsi="Times New Roman"/>
+          <w:b w:val="0"/>
+          <w:i w:val="0"/>
+          <w:color w:val="000000"/>
+          <w:sz w:val="16"/>
+        </w:rPr>
+        <w:t>, 2025, doi: 10.3390/app15169202.</w:t>
+      </w:r>
+    </w:p>
+    <w:p>
+      <w:pPr>
+        <w:spacing w:after="40"/>
+        <w:ind w:left="259" w:hanging="259"/>
+        <w:jc w:val="both"/>
+      </w:pPr>
+      <w:r>
+        <w:rPr>
+          <w:rFonts w:ascii="Times New Roman" w:hAnsi="Times New Roman"/>
+          <w:b w:val="0"/>
+          <w:i w:val="0"/>
+          <w:color w:val="000000"/>
+          <w:sz w:val="16"/>
+        </w:rPr>
+        <w:t xml:space="preserve">[12] A. Garmpis et al., "Assisting Educational Analytics with AutoML Functionalities," </w:t>
+      </w:r>
+      <w:r>
+        <w:rPr>
+          <w:rFonts w:ascii="Times New Roman" w:hAnsi="Times New Roman"/>
+          <w:b w:val="0"/>
+          <w:i/>
+          <w:color w:val="000000"/>
+          <w:sz w:val="16"/>
+        </w:rPr>
+        <w:t>Computers</w:t>
+      </w:r>
+      <w:r>
+        <w:rPr>
+          <w:rFonts w:ascii="Times New Roman" w:hAnsi="Times New Roman"/>
+          <w:b w:val="0"/>
+          <w:i w:val="0"/>
+          <w:color w:val="000000"/>
+          <w:sz w:val="16"/>
+        </w:rPr>
+        <w:t>, 2022, doi: 10.3390/computers11060097.</w:t>
+      </w:r>
+    </w:p>
+    <w:p>
+      <w:pPr>
+        <w:spacing w:after="40"/>
+        <w:ind w:left="259" w:hanging="259"/>
+        <w:jc w:val="both"/>
+      </w:pPr>
+      <w:r>
+        <w:rPr>
+          <w:rFonts w:ascii="Times New Roman" w:hAnsi="Times New Roman"/>
+          <w:b w:val="0"/>
+          <w:i w:val="0"/>
+          <w:color w:val="000000"/>
+          <w:sz w:val="16"/>
+        </w:rPr>
+        <w:t xml:space="preserve">[13] C. Y. Tsai et al., "Precision education with statistical learning and deep learning: a case study in Taiwan," </w:t>
+      </w:r>
+      <w:r>
+        <w:rPr>
+          <w:rFonts w:ascii="Times New Roman" w:hAnsi="Times New Roman"/>
+          <w:b w:val="0"/>
+          <w:i/>
+          <w:color w:val="000000"/>
+          <w:sz w:val="16"/>
+        </w:rPr>
+        <w:t>International Journal of Educational Technology in Higher Education</w:t>
+      </w:r>
+      <w:r>
+        <w:rPr>
+          <w:rFonts w:ascii="Times New Roman" w:hAnsi="Times New Roman"/>
+          <w:b w:val="0"/>
+          <w:i w:val="0"/>
+          <w:color w:val="000000"/>
+          <w:sz w:val="16"/>
+        </w:rPr>
+        <w:t>, 2020, doi: 10.1186/s41239-020-00186-2.</w:t>
+      </w:r>
+    </w:p>
+    <w:p>
+      <w:pPr>
+        <w:spacing w:after="40"/>
+        <w:ind w:left="259" w:hanging="259"/>
+        <w:jc w:val="both"/>
+      </w:pPr>
+      <w:r>
+        <w:rPr>
+          <w:rFonts w:ascii="Times New Roman" w:hAnsi="Times New Roman"/>
+          <w:b w:val="0"/>
+          <w:i w:val="0"/>
+          <w:color w:val="000000"/>
+          <w:sz w:val="16"/>
+        </w:rPr>
+        <w:t xml:space="preserve">[14] M. V. Martins et al., "Multi-Class Phased Prediction of Academic Performance and Dropout in Higher Education," </w:t>
+      </w:r>
+      <w:r>
+        <w:rPr>
+          <w:rFonts w:ascii="Times New Roman" w:hAnsi="Times New Roman"/>
+          <w:b w:val="0"/>
+          <w:i/>
+          <w:color w:val="000000"/>
+          <w:sz w:val="16"/>
+        </w:rPr>
+        <w:t>Applied Sciences</w:t>
+      </w:r>
+      <w:r>
+        <w:rPr>
+          <w:rFonts w:ascii="Times New Roman" w:hAnsi="Times New Roman"/>
+          <w:b w:val="0"/>
+          <w:i w:val="0"/>
+          <w:color w:val="000000"/>
+          <w:sz w:val="16"/>
+        </w:rPr>
+        <w:t>, 2023, doi: 10.3390/app13084702.</w:t>
+      </w:r>
+    </w:p>
+    <w:p>
+      <w:pPr>
+        <w:spacing w:after="40"/>
+        <w:ind w:left="259" w:hanging="259"/>
+        <w:jc w:val="both"/>
+      </w:pPr>
+      <w:r>
+        <w:rPr>
+          <w:rFonts w:ascii="Times New Roman" w:hAnsi="Times New Roman"/>
+          <w:b w:val="0"/>
+          <w:i w:val="0"/>
+          <w:color w:val="000000"/>
+          <w:sz w:val="16"/>
+        </w:rPr>
+        <w:t xml:space="preserve">[15] J. R. Rico-Juan et al., "Study regarding the influence of a student's personality and an LMS usage profile on learning performance using machine learning techniques," </w:t>
+      </w:r>
+      <w:r>
+        <w:rPr>
+          <w:rFonts w:ascii="Times New Roman" w:hAnsi="Times New Roman"/>
+          <w:b w:val="0"/>
+          <w:i/>
+          <w:color w:val="000000"/>
+          <w:sz w:val="16"/>
+        </w:rPr>
+        <w:t>Applied Intelligence</w:t>
+      </w:r>
+      <w:r>
+        <w:rPr>
+          <w:rFonts w:ascii="Times New Roman" w:hAnsi="Times New Roman"/>
+          <w:b w:val="0"/>
+          <w:i w:val="0"/>
+          <w:color w:val="000000"/>
+          <w:sz w:val="16"/>
+        </w:rPr>
+        <w:t>, 2024, doi: 10.1007/s10489-024-05483-1.</w:t>
+      </w:r>
+    </w:p>
+    <w:p>
+      <w:pPr>
+        <w:spacing w:after="40"/>
+        <w:ind w:left="259" w:hanging="259"/>
+        <w:jc w:val="both"/>
+      </w:pPr>
+      <w:r>
+        <w:rPr>
+          <w:rFonts w:ascii="Times New Roman" w:hAnsi="Times New Roman"/>
+          <w:b w:val="0"/>
+          <w:i w:val="0"/>
+          <w:color w:val="000000"/>
+          <w:sz w:val="16"/>
+        </w:rPr>
+        <w:t xml:space="preserve">[16] J. Berens et al., "Crossing individual university boundaries: a comprehensive approach to predicting dropouts in the higher education system," </w:t>
       </w:r>
       <w:r>
         <w:rPr>

</xml_diff>

<commit_message>
docs: align OULAD study with course outcomes
</commit_message>
<xml_diff>
--- a/docs/artikel-ieee/Artikel IEEE - Early Warning OULAD.docx
+++ b/docs/artikel-ieee/Artikel IEEE - Early Warning OULAD.docx
@@ -13,7 +13,7 @@
           <w:color w:val="000000"/>
           <w:sz w:val="40"/>
         </w:rPr>
-        <w:t>Early Warning Risiko Dropout Mahasiswa pada Minggu Keempat Menggunakan Supervised Learning dan Knowledge-Based Risk Layer pada Open University Learning Analytics Dataset</w:t>
+        <w:t>Early Warning Risiko Gagal atau Mengundurkan Diri dari Mata Kuliah pada Minggu Keempat Menggunakan Supervised Learning dan Knowledge-Based Risk Layer pada Open University Learning Analytics Dataset</w:t>
       </w:r>
     </w:p>
     <w:tbl>
@@ -419,7 +419,7 @@
           <w:color w:val="000000"/>
           <w:sz w:val="18"/>
         </w:rPr>
-        <w:t xml:space="preserve">Dropout mahasiswa memengaruhi keberlanjutan studi, efektivitas layanan akademik, dan pengambilan keputusan institusional. Penelitian ini mengembangkan early warning risiko dropout mahasiswa pada akhir minggu keempat menggunakan Open University Learning Analytics Dataset (OULAD). Target dirumuskan sebagai klasifikasi biner, yaitu </w:t>
+        <w:t xml:space="preserve">Hasil akhir mata kuliah memberi informasi penting bagi monitoring akademik dan perencanaan intervensi dini. Penelitian ini mengembangkan early warning risiko gagal atau mengundurkan diri dari mata kuliah pada akhir minggu keempat menggunakan Open University Learning Analytics Dataset (OULAD). Setiap baris merepresentasikan satu mahasiswa pada satu module-presentation. Target dirumuskan sebagai klasifikasi biner, yaitu </w:t>
       </w:r>
       <w:r>
         <w:rPr>
@@ -439,7 +439,7 @@
           <w:color w:val="000000"/>
           <w:sz w:val="18"/>
         </w:rPr>
-        <w:t xml:space="preserve"> untuk hasil akhir </w:t>
+        <w:t xml:space="preserve"> untuk hasil akhir mata kuliah </w:t>
       </w:r>
       <w:r>
         <w:rPr>
@@ -619,7 +619,7 @@
           <w:color w:val="000000"/>
           <w:sz w:val="18"/>
         </w:rPr>
-        <w:t xml:space="preserve"> beserta alasan dan rekomendasi intervensi. Sistem gabungan meningkatkan recall menjadi 0,7866 dengan precision 0,7043. Hasil analitik disajikan melalui dashboard statis yang memuat indikator risiko, prioritas module-presentation, sinyal dominan, dan daftar mahasiswa untuk mendukung monitoring akademik. Pendekatan ini menyediakan integrasi prediksi, interpretasi berbasis aturan, dan visual decision support untuk intervensi dini.</w:t>
+        <w:t xml:space="preserve"> beserta alasan dan rekomendasi intervensi. Sistem gabungan meningkatkan recall menjadi 0,7866 dengan precision 0,7043. Hasil analitik disajikan melalui dashboard statis yang memuat indikator risiko, prioritas module-presentation, sinyal dominan, dan daftar mahasiswa untuk mendukung monitoring akademik. Pendekatan ini menyediakan integrasi prediksi, interpretasi berbasis aturan, dan visual decision support untuk intervensi dini pada tingkat mata kuliah.</w:t>
       </w:r>
     </w:p>
     <w:p>
@@ -645,7 +645,7 @@
           <w:color w:val="000000"/>
           <w:sz w:val="18"/>
         </w:rPr>
-        <w:t>student dropout, supervised learning, OULAD, early warning system, knowledge-based system, business intelligence</w:t>
+        <w:t>academic risk prediction, course withdrawal, course failure, supervised learning, OULAD, early warning system</w:t>
       </w:r>
     </w:p>
     <w:p>
@@ -679,7 +679,7 @@
           <w:color w:val="000000"/>
           <w:sz w:val="20"/>
         </w:rPr>
-        <w:t>Dropout mahasiswa menjadi isu penting dalam pendidikan tinggi karena berkaitan dengan keberlanjutan studi, kualitas layanan akademik, dan efektivitas pengambilan keputusan institusional. Penelitian sebelumnya menunjukkan bahwa machine learning dapat memprediksi retensi mahasiswa menggunakan karakteristik sosiodemografis dan metrik engagement [1]. Early warning system memperluas manfaat prediksi dengan menempatkan identifikasi risiko pada periode ketika intervensi akademik masih dapat dilakukan [2]. Ketersediaan informasi risiko pada minggu-minggu awal memberi ruang bagi dosen, tutor, dan pengelola program studi untuk merancang tindak lanjut yang relevan.</w:t>
+        <w:t>Kegagalan dan pengunduran diri dari mata kuliah menjadi perhatian dalam pendidikan tinggi karena berkaitan dengan capaian belajar, kualitas layanan akademik, dan efektivitas pengambilan keputusan institusional. Penelitian sebelumnya menunjukkan bahwa machine learning dapat memprediksi retensi mahasiswa menggunakan karakteristik sosiodemografis dan metrik engagement [1]. Early warning system memperluas manfaat prediksi dengan menempatkan identifikasi risiko pada periode ketika intervensi akademik masih dapat dilakukan [2]. Ketersediaan informasi risiko pada minggu-minggu awal memberi ruang bagi dosen, tutor, dan pengelola program studi untuk merancang tindak lanjut yang relevan.</w:t>
       </w:r>
     </w:p>
     <w:p>
@@ -747,7 +747,7 @@
           <w:color w:val="000000"/>
           <w:sz w:val="20"/>
         </w:rPr>
-        <w:t>Penelitian ini bertujuan mengembangkan klasifikasi biner risiko dropout mahasiswa pada minggu keempat, mengevaluasi tiga algoritma supervised learning, dan mengintegrasikan model terpilih dengan knowledge-based risk layer. Hasil sistem diterjemahkan menjadi dashboard Business Intelligence untuk monitoring risiko dan prioritas intervensi akademik.</w:t>
+        <w:t>Penelitian ini bertujuan mengembangkan klasifikasi biner risiko gagal atau mengundurkan diri dari mata kuliah pada minggu keempat, mengevaluasi tiga algoritma supervised learning, dan mengintegrasikan model terpilih dengan knowledge-based risk layer. Hasil sistem diterjemahkan menjadi dashboard Business Intelligence untuk monitoring risiko dan prioritas intervensi akademik pada tingkat module-presentation.</w:t>
       </w:r>
     </w:p>
     <w:p>
@@ -818,7 +818,7 @@
           <w:color w:val="000000"/>
           <w:sz w:val="20"/>
         </w:rPr>
-        <w:t>Penelitian student dropout analytics memanfaatkan data akademik, sosiodemografis, dan aktivitas digital untuk memprediksi keberlanjutan studi. Informasi awal seperti karakteristik sosiodemografis, riwayat akademik, dan engagement digital memiliki nilai prediktif terhadap retensi mahasiswa [1]. Risiko dropout terbentuk melalui interaksi faktor akademik, perilaku belajar, dan konteks mahasiswa.</w:t>
+        <w:t>Penelitian student dropout dan academic performance analytics memanfaatkan data akademik, sosiodemografis, dan aktivitas digital untuk memprediksi keberlanjutan studi serta hasil pembelajaran. Informasi awal seperti karakteristik sosiodemografis, riwayat akademik, dan engagement digital memiliki nilai prediktif terhadap retensi mahasiswa [1]. Pada OULAD, ruang lingkup target berada pada hasil akhir mata kuliah untuk setiap student-module-presentation.</w:t>
       </w:r>
     </w:p>
     <w:p>
@@ -1137,7 +1137,7 @@
           <w:color w:val="000000"/>
           <w:sz w:val="20"/>
         </w:rPr>
-        <w:t xml:space="preserve">Penelitian menggunakan desain supervised binary classification untuk mendeteksi risiko dropout pada akhir minggu keempat. Alur penelitian meliputi pengambilan dan audit OULAD, pembentukan fitur dengan cut-off temporal, exploratory data analysis, pemisahan data berbasis mahasiswa, pelatihan dan evaluasi model, pembentukan knowledge-based risk layer, serta penyajian indikator melalui dashboard Business Intelligence. Seluruh eksperimen menggunakan </w:t>
+        <w:t xml:space="preserve">Penelitian menggunakan desain supervised binary classification untuk mendeteksi risiko gagal atau mengundurkan diri dari mata kuliah pada akhir minggu keempat. Alur penelitian meliputi pengambilan dan audit OULAD, pembentukan fitur dengan cut-off temporal, exploratory data analysis, pemisahan data berbasis mahasiswa, pelatihan dan evaluasi model, pembentukan knowledge-based risk layer, serta penyajian indikator melalui dashboard Business Intelligence. Seluruh eksperimen menggunakan </w:t>
       </w:r>
       <w:r>
         <w:rPr>
@@ -1482,7 +1482,7 @@
           <w:color w:val="000000"/>
           <w:sz w:val="20"/>
         </w:rPr>
-        <w:t xml:space="preserve">Target dirumuskan sebagai klasifikasi biner. Label </w:t>
+        <w:t xml:space="preserve">Target dirumuskan sebagai klasifikasi biner pada tingkat mata kuliah. Label </w:t>
       </w:r>
       <w:r>
         <w:rPr>
@@ -1642,7 +1642,7 @@
           <w:color w:val="000000"/>
           <w:sz w:val="20"/>
         </w:rPr>
-        <w:t xml:space="preserve">. Dataset terdiri atas 17.208 baris </w:t>
+        <w:t xml:space="preserve">. Status tersebut menjelaskan hasil mahasiswa pada suatu module-presentation. Dataset terdiri atas 17.208 baris </w:t>
       </w:r>
       <w:r>
         <w:rPr>
@@ -8498,7 +8498,7 @@
           <w:color w:val="000000"/>
           <w:sz w:val="20"/>
         </w:rPr>
-        <w:t xml:space="preserve">Penelitian ini mengembangkan early warning risiko dropout mahasiswa pada akhir minggu keempat menggunakan OULAD. Dataset dibentuk pada unit student-module-presentation dengan fitur demografis, registrasi awal, assessment, dan aktivitas VLE sampai hari ke-28. Pemisahan berbasis </w:t>
+        <w:t xml:space="preserve">Penelitian ini mengembangkan early warning risiko gagal atau mengundurkan diri dari mata kuliah pada akhir minggu keempat menggunakan OULAD. Dataset dibentuk pada unit student-module-presentation dengan fitur demografis, registrasi awal, assessment, dan aktivitas VLE sampai hari ke-28. Pemisahan berbasis </w:t>
       </w:r>
       <w:r>
         <w:rPr>
@@ -8589,7 +8589,7 @@
           <w:color w:val="000000"/>
           <w:sz w:val="20"/>
         </w:rPr>
-        <w:t>Pengembangan berikutnya dapat membandingkan horizon minggu keempat, kedelapan, dan kedua belas; menggunakan threshold per module-presentation; melakukan tuning hyperparameter; serta menguji validitas eksternal pada data institusi lain. Evaluasi dampak intervensi juga diperlukan untuk mengukur kontribusi sistem terhadap keberlanjutan studi mahasiswa.</w:t>
+        <w:t>Pengembangan berikutnya dapat membandingkan horizon minggu keempat, kedelapan, dan kedua belas; menggunakan threshold per module-presentation; melakukan tuning hyperparameter; serta menguji validitas eksternal pada data institusi lain. Evaluasi dampak intervensi juga diperlukan untuk mengukur kontribusi sistem terhadap keberhasilan mahasiswa menyelesaikan mata kuliah.</w:t>
       </w:r>
     </w:p>
     <w:p>

</xml_diff>

<commit_message>
docs(article): finalize Indonesian IEEE manuscript
</commit_message>
<xml_diff>
--- a/docs/artikel-ieee/Artikel IEEE - Early Warning OULAD.docx
+++ b/docs/artikel-ieee/Artikel IEEE - Early Warning OULAD.docx
@@ -11,7 +11,7 @@
         <w:rPr>
           <w:rFonts w:ascii="Times New Roman" w:hAnsi="Times New Roman"/>
           <w:color w:val="000000"/>
-          <w:sz w:val="40"/>
+          <w:sz w:val="48"/>
         </w:rPr>
         <w:t>Early Warning Risiko Gagal atau Mengundurkan Diri dari Mata Kuliah pada Minggu Keempat Menggunakan Supervised Learning dan Knowledge-Based Risk Layer pada Open University Learning Analytics Dataset</w:t>
       </w:r>
@@ -390,7 +390,7 @@
       <w:pPr>
         <w:sectPr>
           <w:pgSz w:w="12240" w:h="15840"/>
-          <w:pgMar w:top="936" w:right="936" w:bottom="936" w:left="936" w:header="432" w:footer="432" w:gutter="0"/>
+          <w:pgMar w:top="1080" w:right="900" w:bottom="1440" w:left="900" w:header="432" w:footer="432" w:gutter="0"/>
           <w:cols w:space="360" w:num="1" w:equalWidth="1"/>
           <w:docGrid w:linePitch="360"/>
         </w:sectPr>
@@ -652,7 +652,7 @@
       <w:pPr>
         <w:pStyle w:val="Heading1"/>
         <w:keepNext/>
-        <w:spacing w:before="160" w:after="80"/>
+        <w:spacing w:before="120" w:after="60"/>
         <w:jc w:val="center"/>
       </w:pPr>
       <w:r>
@@ -667,7 +667,7 @@
     </w:p>
     <w:p>
       <w:pPr>
-        <w:spacing w:before="0" w:after="60" w:line="240" w:lineRule="auto"/>
+        <w:spacing w:before="0" w:after="20" w:line="240" w:lineRule="auto"/>
         <w:ind w:firstLine="259"/>
         <w:jc w:val="both"/>
       </w:pPr>
@@ -684,7 +684,7 @@
     </w:p>
     <w:p>
       <w:pPr>
-        <w:spacing w:before="0" w:after="60" w:line="240" w:lineRule="auto"/>
+        <w:spacing w:before="0" w:after="20" w:line="240" w:lineRule="auto"/>
         <w:ind w:firstLine="259"/>
         <w:jc w:val="both"/>
       </w:pPr>
@@ -701,7 +701,7 @@
     </w:p>
     <w:p>
       <w:pPr>
-        <w:spacing w:before="0" w:after="60" w:line="240" w:lineRule="auto"/>
+        <w:spacing w:before="0" w:after="20" w:line="240" w:lineRule="auto"/>
         <w:ind w:firstLine="259"/>
         <w:jc w:val="both"/>
       </w:pPr>
@@ -718,7 +718,7 @@
     </w:p>
     <w:p>
       <w:pPr>
-        <w:spacing w:before="0" w:after="60" w:line="240" w:lineRule="auto"/>
+        <w:spacing w:before="0" w:after="20" w:line="240" w:lineRule="auto"/>
         <w:ind w:firstLine="259"/>
         <w:jc w:val="both"/>
       </w:pPr>
@@ -735,7 +735,7 @@
     </w:p>
     <w:p>
       <w:pPr>
-        <w:spacing w:before="0" w:after="60" w:line="240" w:lineRule="auto"/>
+        <w:spacing w:before="0" w:after="20" w:line="240" w:lineRule="auto"/>
         <w:ind w:firstLine="259"/>
         <w:jc w:val="both"/>
       </w:pPr>
@@ -752,7 +752,7 @@
     </w:p>
     <w:p>
       <w:pPr>
-        <w:spacing w:before="0" w:after="60" w:line="240" w:lineRule="auto"/>
+        <w:spacing w:before="0" w:after="20" w:line="240" w:lineRule="auto"/>
         <w:ind w:firstLine="259"/>
         <w:jc w:val="both"/>
       </w:pPr>
@@ -791,7 +791,7 @@
       <w:pPr>
         <w:pStyle w:val="Heading1"/>
         <w:keepNext/>
-        <w:spacing w:before="160" w:after="80"/>
+        <w:spacing w:before="120" w:after="60"/>
         <w:jc w:val="center"/>
       </w:pPr>
       <w:r>
@@ -806,7 +806,7 @@
     </w:p>
     <w:p>
       <w:pPr>
-        <w:spacing w:before="0" w:after="60" w:line="240" w:lineRule="auto"/>
+        <w:spacing w:before="0" w:after="20" w:line="240" w:lineRule="auto"/>
         <w:ind w:firstLine="259"/>
         <w:jc w:val="both"/>
       </w:pPr>
@@ -823,7 +823,7 @@
     </w:p>
     <w:p>
       <w:pPr>
-        <w:spacing w:before="0" w:after="60" w:line="240" w:lineRule="auto"/>
+        <w:spacing w:before="0" w:after="20" w:line="240" w:lineRule="auto"/>
         <w:ind w:firstLine="259"/>
         <w:jc w:val="both"/>
       </w:pPr>
@@ -920,7 +920,7 @@
     </w:p>
     <w:p>
       <w:pPr>
-        <w:spacing w:before="0" w:after="60" w:line="240" w:lineRule="auto"/>
+        <w:spacing w:before="0" w:after="20" w:line="240" w:lineRule="auto"/>
         <w:ind w:firstLine="259"/>
         <w:jc w:val="both"/>
       </w:pPr>
@@ -932,132 +932,12 @@
           <w:color w:val="000000"/>
           <w:sz w:val="20"/>
         </w:rPr>
-        <w:t xml:space="preserve">Penelitian berbasis OULAD terus berkembang melalui kombinasi fitur assessment, aktivitas VLE, dan profil mahasiswa. Jawad et al. menerapkan Random Forest dengan SMOTE pada enam horizon dan memperoleh testing accuracy 0,892 serta ROC-AUC 0,96 pada skenario 260 hari [6]. Balabied dan Eid melaporkan accuracy serta F1-score 0,90 menggunakan Random Forest untuk klasifikasi biner [7]. Ujkani et al. menggabungkan </w:t>
-      </w:r>
-      <w:r>
-        <w:rPr>
-          <w:rFonts w:ascii="Times New Roman" w:hAnsi="Times New Roman"/>
-          <w:b w:val="0"/>
-          <w:i/>
-          <w:color w:val="000000"/>
-          <w:sz w:val="20"/>
-        </w:rPr>
-        <w:t>Fail</w:t>
-      </w:r>
-      <w:r>
-        <w:rPr>
-          <w:rFonts w:ascii="Times New Roman" w:hAnsi="Times New Roman"/>
-          <w:b w:val="0"/>
-          <w:i w:val="0"/>
-          <w:color w:val="000000"/>
-          <w:sz w:val="20"/>
-        </w:rPr>
-        <w:t xml:space="preserve"> dan </w:t>
-      </w:r>
-      <w:r>
-        <w:rPr>
-          <w:rFonts w:ascii="Times New Roman" w:hAnsi="Times New Roman"/>
-          <w:b w:val="0"/>
-          <w:i/>
-          <w:color w:val="000000"/>
-          <w:sz w:val="20"/>
-        </w:rPr>
-        <w:t>Withdrawn</w:t>
-      </w:r>
-      <w:r>
-        <w:rPr>
-          <w:rFonts w:ascii="Times New Roman" w:hAnsi="Times New Roman"/>
-          <w:b w:val="0"/>
-          <w:i w:val="0"/>
-          <w:color w:val="000000"/>
-          <w:sz w:val="20"/>
-        </w:rPr>
-        <w:t xml:space="preserve"> sebagai kelas at-risk dan memperoleh accuracy 0,93 menggunakan custom neural network [8]. Alnasyan et al. menggunakan target biner </w:t>
-      </w:r>
-      <w:r>
-        <w:rPr>
-          <w:rFonts w:ascii="Times New Roman" w:hAnsi="Times New Roman"/>
-          <w:b w:val="0"/>
-          <w:i/>
-          <w:color w:val="000000"/>
-          <w:sz w:val="20"/>
-        </w:rPr>
-        <w:t>Pass</w:t>
-      </w:r>
-      <w:r>
-        <w:rPr>
-          <w:rFonts w:ascii="Times New Roman" w:hAnsi="Times New Roman"/>
-          <w:b w:val="0"/>
-          <w:i w:val="0"/>
-          <w:color w:val="000000"/>
-          <w:sz w:val="20"/>
-        </w:rPr>
-        <w:t xml:space="preserve"> dan </w:t>
-      </w:r>
-      <w:r>
-        <w:rPr>
-          <w:rFonts w:ascii="Times New Roman" w:hAnsi="Times New Roman"/>
-          <w:b w:val="0"/>
-          <w:i/>
-          <w:color w:val="000000"/>
-          <w:sz w:val="20"/>
-        </w:rPr>
-        <w:t>Distinction</w:t>
-      </w:r>
-      <w:r>
-        <w:rPr>
-          <w:rFonts w:ascii="Times New Roman" w:hAnsi="Times New Roman"/>
-          <w:b w:val="0"/>
-          <w:i w:val="0"/>
-          <w:color w:val="000000"/>
-          <w:sz w:val="20"/>
-        </w:rPr>
-        <w:t xml:space="preserve"> terhadap </w:t>
-      </w:r>
-      <w:r>
-        <w:rPr>
-          <w:rFonts w:ascii="Times New Roman" w:hAnsi="Times New Roman"/>
-          <w:b w:val="0"/>
-          <w:i/>
-          <w:color w:val="000000"/>
-          <w:sz w:val="20"/>
-        </w:rPr>
-        <w:t>Fail</w:t>
-      </w:r>
-      <w:r>
-        <w:rPr>
-          <w:rFonts w:ascii="Times New Roman" w:hAnsi="Times New Roman"/>
-          <w:b w:val="0"/>
-          <w:i w:val="0"/>
-          <w:color w:val="000000"/>
-          <w:sz w:val="20"/>
-        </w:rPr>
-        <w:t xml:space="preserve"> dan </w:t>
-      </w:r>
-      <w:r>
-        <w:rPr>
-          <w:rFonts w:ascii="Times New Roman" w:hAnsi="Times New Roman"/>
-          <w:b w:val="0"/>
-          <w:i/>
-          <w:color w:val="000000"/>
-          <w:sz w:val="20"/>
-        </w:rPr>
-        <w:t>Withdrawn</w:t>
-      </w:r>
-      <w:r>
-        <w:rPr>
-          <w:rFonts w:ascii="Times New Roman" w:hAnsi="Times New Roman"/>
-          <w:b w:val="0"/>
-          <w:i w:val="0"/>
-          <w:color w:val="000000"/>
-          <w:sz w:val="20"/>
-        </w:rPr>
-        <w:t>; KANFormer mencapai accuracy 0,9459 dan F1-score 0,9481 [9]. Kesamaan dataset menempatkan kelima studi tersebut sebagai benchmark berbasis OULAD. Kesamaan definisi target pada Shou et al., Ujkani et al., dan Alnasyan et al. memperkuat kedekatan skenario, sedangkan perbedaan horizon, split, balancing, dan arsitektur model membentuk konteks perbandingan.</w:t>
+        <w:t>Penelitian berbasis OULAD terus berkembang melalui kombinasi fitur assessment, aktivitas VLE, dan profil mahasiswa. Jawad et al. menerapkan Random Forest dengan SMOTE dan memperoleh testing accuracy 0,892 pada skenario 260 hari [6]. Balabied dan Eid melaporkan accuracy serta F1-score 0,90 menggunakan Random Forest [7]. Ujkani et al. memperoleh accuracy 0,93 menggunakan custom neural network [8], sedangkan KANFormer dari Alnasyan et al. mencapai accuracy 0,9459 dan F1-score 0,9481 [9]. Shou et al. [5], Ujkani et al. [8], dan Alnasyan et al. [9] memakai definisi target yang sebanding. Perbedaan horizon, split, balancing, dan arsitektur model tetap menentukan konteks perbandingan.</w:t>
       </w:r>
     </w:p>
     <w:p>
       <w:pPr>
-        <w:spacing w:before="0" w:after="60" w:line="240" w:lineRule="auto"/>
+        <w:spacing w:before="0" w:after="20" w:line="240" w:lineRule="auto"/>
         <w:ind w:firstLine="259"/>
         <w:jc w:val="both"/>
       </w:pPr>
@@ -1069,12 +949,12 @@
           <w:color w:val="000000"/>
           <w:sz w:val="20"/>
         </w:rPr>
-        <w:t>Pendekatan hybrid berbasis digital educational history menunjukkan manfaat integrasi beberapa sumber data untuk identifikasi mahasiswa berisiko [10]. XGBoost telah digunakan untuk early warning berbasis data pra-enrollment [11], AutoML mendukung eksplorasi educational analytics [12], dan statistical learning serta deep learning digunakan pada precision education [13]. Phased prediction memperlihatkan perubahan performa model pada beberapa tahap semester [14]. Penelitian lain menghubungkan personality, pola penggunaan LMS, dan performa belajar [15], sedangkan analisis lintas institusi memperluas cakupan prediksi dropout pada level sistem pendidikan tinggi [16]. Keragaman pendekatan tersebut menunjukkan bahwa pemilihan fitur, horizon waktu, dan konteks institusi menentukan interpretasi performa model.</w:t>
+        <w:t>Pendekatan hybrid mengintegrasikan beberapa sumber data untuk identifikasi mahasiswa berisiko [10]. Penelitian lain mencakup early warning berbasis XGBoost [11], AutoML [12], precision education [13], phased prediction [14], pola penggunaan LMS [15], dan analisis lintas institusi [16]. Keragaman tersebut menunjukkan bahwa fitur, horizon waktu, dan konteks institusi menentukan interpretasi performa model.</w:t>
       </w:r>
     </w:p>
     <w:p>
       <w:pPr>
-        <w:spacing w:before="0" w:after="60" w:line="240" w:lineRule="auto"/>
+        <w:spacing w:before="0" w:after="20" w:line="240" w:lineRule="auto"/>
         <w:ind w:firstLine="259"/>
         <w:jc w:val="both"/>
       </w:pPr>
@@ -1093,7 +973,7 @@
       <w:pPr>
         <w:pStyle w:val="Heading1"/>
         <w:keepNext/>
-        <w:spacing w:before="160" w:after="80"/>
+        <w:spacing w:before="120" w:after="60"/>
         <w:jc w:val="center"/>
       </w:pPr>
       <w:r>
@@ -1110,7 +990,7 @@
       <w:pPr>
         <w:pStyle w:val="Heading2"/>
         <w:keepNext/>
-        <w:spacing w:before="100" w:after="40"/>
+        <w:spacing w:before="80" w:after="20"/>
         <w:jc w:val="left"/>
       </w:pPr>
       <w:r>
@@ -1125,7 +1005,7 @@
     </w:p>
     <w:p>
       <w:pPr>
-        <w:spacing w:before="0" w:after="60" w:line="240" w:lineRule="auto"/>
+        <w:spacing w:before="0" w:after="20" w:line="240" w:lineRule="auto"/>
         <w:ind w:firstLine="259"/>
         <w:jc w:val="both"/>
       </w:pPr>
@@ -1137,7 +1017,7 @@
           <w:color w:val="000000"/>
           <w:sz w:val="20"/>
         </w:rPr>
-        <w:t xml:space="preserve">Penelitian menggunakan desain supervised binary classification untuk mendeteksi risiko gagal atau mengundurkan diri dari mata kuliah pada akhir minggu keempat. Alur penelitian meliputi pengambilan dan audit OULAD, pembentukan fitur dengan cut-off temporal, exploratory data analysis, pemisahan data berbasis mahasiswa, pelatihan dan evaluasi model, pembentukan knowledge-based risk layer, serta penyajian indikator melalui dashboard Business Intelligence. Seluruh eksperimen menggunakan </w:t>
+        <w:t xml:space="preserve">Penelitian menggunakan supervised binary classification untuk mendeteksi risiko gagal atau mengundurkan diri dari mata kuliah pada akhir minggu keempat. Alurnya mencakup audit OULAD, pembentukan fitur dengan cut-off temporal, exploratory data analysis, pemisahan berbasis mahasiswa, evaluasi model, knowledge-based risk layer, dan dashboard Business Intelligence. Seluruh eksperimen menggunakan </w:t>
       </w:r>
       <w:r>
         <w:rPr>
@@ -1157,14 +1037,14 @@
           <w:color w:val="000000"/>
           <w:sz w:val="20"/>
         </w:rPr>
-        <w:t xml:space="preserve"> untuk mendukung reproduktibilitas.</w:t>
+        <w:t>.</w:t>
       </w:r>
     </w:p>
     <w:p>
       <w:pPr>
         <w:pStyle w:val="Heading2"/>
         <w:keepNext/>
-        <w:spacing w:before="100" w:after="40"/>
+        <w:spacing w:before="80" w:after="20"/>
         <w:jc w:val="left"/>
       </w:pPr>
       <w:r>
@@ -1179,7 +1059,7 @@
     </w:p>
     <w:p>
       <w:pPr>
-        <w:spacing w:before="0" w:after="60" w:line="240" w:lineRule="auto"/>
+        <w:spacing w:before="0" w:after="20" w:line="240" w:lineRule="auto"/>
         <w:ind w:firstLine="259"/>
         <w:jc w:val="both"/>
       </w:pPr>
@@ -1191,7 +1071,7 @@
           <w:color w:val="000000"/>
           <w:sz w:val="20"/>
         </w:rPr>
-        <w:t xml:space="preserve">Dataset yang digunakan adalah Open University Learning Analytics Dataset (OULAD) [4]. Arsip data diperoleh melalui UCI Machine Learning Repository dan berisi tabel </w:t>
+        <w:t xml:space="preserve">Open University Learning Analytics Dataset (OULAD) [4] diperoleh melalui UCI Machine Learning Repository. Tabel yang digunakan meliputi </w:t>
       </w:r>
       <w:r>
         <w:rPr>
@@ -1331,7 +1211,7 @@
           <w:color w:val="000000"/>
           <w:sz w:val="20"/>
         </w:rPr>
-        <w:t xml:space="preserve">. Tabel </w:t>
+        <w:t xml:space="preserve">. </w:t>
       </w:r>
       <w:r>
         <w:rPr>
@@ -1351,7 +1231,7 @@
           <w:color w:val="000000"/>
           <w:sz w:val="20"/>
         </w:rPr>
-        <w:t xml:space="preserve"> memuat 32.593 baris, sedangkan </w:t>
+        <w:t xml:space="preserve"> memuat 32.593 baris dan </w:t>
       </w:r>
       <w:r>
         <w:rPr>
@@ -1376,7 +1256,7 @@
     </w:p>
     <w:p>
       <w:pPr>
-        <w:spacing w:before="0" w:after="60" w:line="240" w:lineRule="auto"/>
+        <w:spacing w:before="0" w:after="20" w:line="240" w:lineRule="auto"/>
         <w:ind w:firstLine="259"/>
         <w:jc w:val="both"/>
       </w:pPr>
@@ -1388,7 +1268,7 @@
           <w:color w:val="000000"/>
           <w:sz w:val="20"/>
         </w:rPr>
-        <w:t xml:space="preserve">Unit analisis adalah satu mahasiswa pada satu kombinasi </w:t>
+        <w:t xml:space="preserve">Satu baris hasil preprocessing merepresentasikan seorang mahasiswa pada satu kombinasi </w:t>
       </w:r>
       <w:r>
         <w:rPr>
@@ -1428,7 +1308,7 @@
           <w:color w:val="000000"/>
           <w:sz w:val="20"/>
         </w:rPr>
-        <w:t xml:space="preserve">. Satu baris hasil preprocessing merepresentasikan satu student-module-presentation. Struktur ini mengikuti unit label pada </w:t>
+        <w:t xml:space="preserve">. Unit student-module-presentation ini mengikuti struktur label </w:t>
       </w:r>
       <w:r>
         <w:rPr>
@@ -1448,14 +1328,14 @@
           <w:color w:val="000000"/>
           <w:sz w:val="20"/>
         </w:rPr>
-        <w:t xml:space="preserve"> dan menjaga konsistensi penggabungan data registrasi, assessment, serta aktivitas VLE.</w:t>
+        <w:t xml:space="preserve"> dan penggabungan data registrasi, assessment, serta VLE.</w:t>
       </w:r>
     </w:p>
     <w:p>
       <w:pPr>
         <w:pStyle w:val="Heading2"/>
         <w:keepNext/>
-        <w:spacing w:before="100" w:after="40"/>
+        <w:spacing w:before="80" w:after="20"/>
         <w:jc w:val="left"/>
       </w:pPr>
       <w:r>
@@ -1470,7 +1350,7 @@
     </w:p>
     <w:p>
       <w:pPr>
-        <w:spacing w:before="0" w:after="60" w:line="240" w:lineRule="auto"/>
+        <w:spacing w:before="0" w:after="20" w:line="240" w:lineRule="auto"/>
         <w:ind w:firstLine="259"/>
         <w:jc w:val="both"/>
       </w:pPr>
@@ -1687,7 +1567,7 @@
     </w:p>
     <w:p>
       <w:pPr>
-        <w:spacing w:before="0" w:after="60" w:line="240" w:lineRule="auto"/>
+        <w:spacing w:before="0" w:after="20" w:line="240" w:lineRule="auto"/>
         <w:ind w:firstLine="259"/>
         <w:jc w:val="both"/>
       </w:pPr>
@@ -1786,7 +1666,7 @@
       <w:pPr>
         <w:pStyle w:val="Heading2"/>
         <w:keepNext/>
-        <w:spacing w:before="100" w:after="40"/>
+        <w:spacing w:before="80" w:after="20"/>
         <w:jc w:val="left"/>
       </w:pPr>
       <w:r>
@@ -1801,7 +1681,7 @@
     </w:p>
     <w:p>
       <w:pPr>
-        <w:spacing w:before="0" w:after="60" w:line="240" w:lineRule="auto"/>
+        <w:spacing w:before="0" w:after="20" w:line="240" w:lineRule="auto"/>
         <w:ind w:firstLine="259"/>
         <w:jc w:val="both"/>
       </w:pPr>
@@ -2038,7 +1918,7 @@
     </w:p>
     <w:p>
       <w:pPr>
-        <w:spacing w:before="0" w:after="60" w:line="240" w:lineRule="auto"/>
+        <w:spacing w:before="0" w:after="20" w:line="240" w:lineRule="auto"/>
         <w:ind w:firstLine="259"/>
         <w:jc w:val="both"/>
       </w:pPr>
@@ -2295,7 +2175,7 @@
     </w:p>
     <w:p>
       <w:pPr>
-        <w:spacing w:before="0" w:after="60" w:line="240" w:lineRule="auto"/>
+        <w:spacing w:before="0" w:after="20" w:line="240" w:lineRule="auto"/>
         <w:ind w:firstLine="259"/>
         <w:jc w:val="both"/>
       </w:pPr>
@@ -2334,7 +2214,7 @@
       <w:pPr>
         <w:pStyle w:val="Heading2"/>
         <w:keepNext/>
-        <w:spacing w:before="100" w:after="40"/>
+        <w:spacing w:before="80" w:after="20"/>
         <w:jc w:val="left"/>
       </w:pPr>
       <w:r>
@@ -2349,7 +2229,7 @@
     </w:p>
     <w:p>
       <w:pPr>
-        <w:spacing w:before="0" w:after="60" w:line="240" w:lineRule="auto"/>
+        <w:spacing w:before="0" w:after="20" w:line="240" w:lineRule="auto"/>
         <w:ind w:firstLine="259"/>
         <w:jc w:val="both"/>
       </w:pPr>
@@ -2406,7 +2286,7 @@
     </w:p>
     <w:p>
       <w:pPr>
-        <w:spacing w:before="0" w:after="60" w:line="240" w:lineRule="auto"/>
+        <w:spacing w:before="0" w:after="20" w:line="240" w:lineRule="auto"/>
         <w:ind w:firstLine="259"/>
         <w:jc w:val="both"/>
       </w:pPr>
@@ -2485,7 +2365,7 @@
       <w:pPr>
         <w:pStyle w:val="Heading2"/>
         <w:keepNext/>
-        <w:spacing w:before="100" w:after="40"/>
+        <w:spacing w:before="80" w:after="20"/>
         <w:jc w:val="left"/>
       </w:pPr>
       <w:r>
@@ -2500,7 +2380,7 @@
     </w:p>
     <w:p>
       <w:pPr>
-        <w:spacing w:before="0" w:after="60" w:line="240" w:lineRule="auto"/>
+        <w:spacing w:before="0" w:after="20" w:line="240" w:lineRule="auto"/>
         <w:ind w:firstLine="259"/>
         <w:jc w:val="both"/>
       </w:pPr>
@@ -2577,7 +2457,7 @@
     </w:p>
     <w:p>
       <w:pPr>
-        <w:spacing w:before="0" w:after="60" w:line="240" w:lineRule="auto"/>
+        <w:spacing w:before="0" w:after="20" w:line="240" w:lineRule="auto"/>
         <w:ind w:firstLine="259"/>
         <w:jc w:val="both"/>
       </w:pPr>
@@ -2636,7 +2516,7 @@
       <w:pPr>
         <w:pStyle w:val="Heading2"/>
         <w:keepNext/>
-        <w:spacing w:before="100" w:after="40"/>
+        <w:spacing w:before="80" w:after="20"/>
         <w:jc w:val="left"/>
       </w:pPr>
       <w:r>
@@ -2651,7 +2531,7 @@
     </w:p>
     <w:p>
       <w:pPr>
-        <w:spacing w:before="0" w:after="60" w:line="240" w:lineRule="auto"/>
+        <w:spacing w:before="0" w:after="20" w:line="240" w:lineRule="auto"/>
         <w:ind w:firstLine="259"/>
         <w:jc w:val="both"/>
       </w:pPr>
@@ -2748,7 +2628,7 @@
     </w:p>
     <w:p>
       <w:pPr>
-        <w:spacing w:before="0" w:after="60" w:line="240" w:lineRule="auto"/>
+        <w:spacing w:before="0" w:after="20" w:line="240" w:lineRule="auto"/>
         <w:ind w:firstLine="259"/>
         <w:jc w:val="both"/>
       </w:pPr>
@@ -2865,7 +2745,7 @@
     </w:p>
     <w:p>
       <w:pPr>
-        <w:spacing w:before="0" w:after="60" w:line="240" w:lineRule="auto"/>
+        <w:spacing w:before="0" w:after="20" w:line="240" w:lineRule="auto"/>
         <w:ind w:firstLine="259"/>
         <w:jc w:val="both"/>
       </w:pPr>
@@ -2902,7 +2782,7 @@
     </w:p>
     <w:p>
       <w:pPr>
-        <w:spacing w:before="0" w:after="60" w:line="240" w:lineRule="auto"/>
+        <w:spacing w:before="0" w:after="20" w:line="240" w:lineRule="auto"/>
         <w:ind w:firstLine="259"/>
         <w:jc w:val="both"/>
       </w:pPr>
@@ -2974,14 +2854,14 @@
           <w:color w:val="000000"/>
           <w:sz w:val="20"/>
         </w:rPr>
-        <w:t>. Perbandingan dengan model terpilih digunakan untuk mengukur perubahan cakupan deteksi, precision, dan beban verifikasi.</w:t>
+        <w:t>, lalu mengukur perubahan cakupan deteksi, precision, dan beban verifikasi.</w:t>
       </w:r>
     </w:p>
     <w:p>
       <w:pPr>
         <w:pStyle w:val="Heading2"/>
         <w:keepNext/>
-        <w:spacing w:before="100" w:after="40"/>
+        <w:spacing w:before="80" w:after="20"/>
         <w:jc w:val="left"/>
       </w:pPr>
       <w:r>
@@ -2996,7 +2876,7 @@
     </w:p>
     <w:p>
       <w:pPr>
-        <w:spacing w:before="0" w:after="60" w:line="240" w:lineRule="auto"/>
+        <w:spacing w:before="0" w:after="20" w:line="240" w:lineRule="auto"/>
         <w:ind w:firstLine="259"/>
         <w:jc w:val="both"/>
       </w:pPr>
@@ -3013,7 +2893,7 @@
     </w:p>
     <w:p>
       <w:pPr>
-        <w:spacing w:before="0" w:after="60" w:line="240" w:lineRule="auto"/>
+        <w:spacing w:before="0" w:after="20" w:line="240" w:lineRule="auto"/>
         <w:ind w:firstLine="259"/>
         <w:jc w:val="both"/>
       </w:pPr>
@@ -3052,7 +2932,7 @@
       <w:pPr>
         <w:pStyle w:val="Heading1"/>
         <w:keepNext/>
-        <w:spacing w:before="160" w:after="80"/>
+        <w:spacing w:before="120" w:after="60"/>
         <w:jc w:val="center"/>
       </w:pPr>
       <w:r>
@@ -3062,14 +2942,14 @@
           <w:color w:val="000000"/>
           <w:sz w:val="20"/>
         </w:rPr>
-        <w:t>IV. RESULTS</w:t>
+        <w:t>IV. RESULTS AND DISCUSSION</w:t>
       </w:r>
     </w:p>
     <w:p>
       <w:pPr>
         <w:pStyle w:val="Heading2"/>
         <w:keepNext/>
-        <w:spacing w:before="100" w:after="40"/>
+        <w:spacing w:before="80" w:after="20"/>
         <w:jc w:val="left"/>
       </w:pPr>
       <w:r>
@@ -3084,7 +2964,7 @@
     </w:p>
     <w:p>
       <w:pPr>
-        <w:spacing w:before="0" w:after="60" w:line="240" w:lineRule="auto"/>
+        <w:spacing w:before="0" w:after="20" w:line="240" w:lineRule="auto"/>
         <w:ind w:firstLine="259"/>
         <w:jc w:val="both"/>
       </w:pPr>
@@ -3196,15 +3076,18 @@
           <w:color w:val="000000"/>
           <w:sz w:val="20"/>
         </w:rPr>
-        <w:t xml:space="preserve"> menghasilkan overlap mahasiswa sebesar nol.</w:t>
-      </w:r>
-    </w:p>
-    <w:p>
-      <w:pPr>
-        <w:spacing w:before="0" w:after="60" w:line="240" w:lineRule="auto"/>
-        <w:ind w:firstLine="259"/>
-        <w:jc w:val="both"/>
-      </w:pPr>
+        <w:t xml:space="preserve"> menghasilkan overlap mahasiswa sebesar nol. Missing value terutama terdapat pada </w:t>
+      </w:r>
+      <w:r>
+        <w:rPr>
+          <w:rFonts w:ascii="Times New Roman" w:hAnsi="Times New Roman"/>
+          <w:b w:val="0"/>
+          <w:i/>
+          <w:color w:val="000000"/>
+          <w:sz w:val="20"/>
+        </w:rPr>
+        <w:t>imd_band</w:t>
+      </w:r>
       <w:r>
         <w:rPr>
           <w:rFonts w:ascii="Times New Roman" w:hAnsi="Times New Roman"/>
@@ -3213,7 +3096,7 @@
           <w:color w:val="000000"/>
           <w:sz w:val="20"/>
         </w:rPr>
-        <w:t xml:space="preserve">Komposisi target pada dataset pemodelan relatif berimbang, sehingga evaluasi model tidak berangkat dari dominasi satu kelas yang ekstrem. Keseimbangan ini menjadi titik awal yang penting karena tujuan penelitian bukan hanya memperoleh accuracy tinggi, tetapi juga menjaga kemampuan model mengenali mahasiswa yang masuk kelompok </w:t>
+        <w:t xml:space="preserve"> dan sebagian kecil </w:t>
       </w:r>
       <w:r>
         <w:rPr>
@@ -3223,7 +3106,7 @@
           <w:color w:val="000000"/>
           <w:sz w:val="20"/>
         </w:rPr>
-        <w:t>AtRisk</w:t>
+        <w:t>date_registration</w:t>
       </w:r>
       <w:r>
         <w:rPr>
@@ -3233,187 +3116,14 @@
           <w:color w:val="000000"/>
           <w:sz w:val="20"/>
         </w:rPr>
-        <w:t>.</w:t>
-      </w:r>
-    </w:p>
-    <w:p>
-      <w:pPr>
-        <w:keepNext/>
-        <w:spacing w:before="80" w:after="20"/>
-        <w:jc w:val="center"/>
-      </w:pPr>
-      <w:r>
-        <w:drawing>
-          <wp:inline xmlns:a="http://schemas.openxmlformats.org/drawingml/2006/main" xmlns:pic="http://schemas.openxmlformats.org/drawingml/2006/picture">
-            <wp:extent cx="2971800" cy="1649091"/>
-            <wp:docPr id="1" name="Picture 1" descr="Fig. 1. Distribusi target pada dataset pemodelan." title="Fig"/>
-            <wp:cNvGraphicFramePr>
-              <a:graphicFrameLocks noChangeAspect="1"/>
-            </wp:cNvGraphicFramePr>
-            <a:graphic>
-              <a:graphicData uri="http://schemas.openxmlformats.org/drawingml/2006/picture">
-                <pic:pic>
-                  <pic:nvPicPr>
-                    <pic:cNvPr id="0" name="fig-1a-target-distribution.png"/>
-                    <pic:cNvPicPr/>
-                  </pic:nvPicPr>
-                  <pic:blipFill>
-                    <a:blip r:embed="rId9"/>
-                    <a:stretch>
-                      <a:fillRect/>
-                    </a:stretch>
-                  </pic:blipFill>
-                  <pic:spPr>
-                    <a:xfrm>
-                      <a:off x="0" y="0"/>
-                      <a:ext cx="2971800" cy="1649091"/>
-                    </a:xfrm>
-                    <a:prstGeom prst="rect"/>
-                  </pic:spPr>
-                </pic:pic>
-              </a:graphicData>
-            </a:graphic>
-          </wp:inline>
-        </w:drawing>
-      </w:r>
-    </w:p>
-    <w:p>
-      <w:pPr>
-        <w:keepLines/>
-        <w:spacing w:before="20" w:after="80"/>
-        <w:jc w:val="center"/>
-      </w:pPr>
-      <w:r>
-        <w:rPr>
-          <w:rFonts w:ascii="Times New Roman" w:hAnsi="Times New Roman"/>
-          <w:b w:val="0"/>
-          <w:i w:val="0"/>
-          <w:color w:val="000000"/>
-          <w:sz w:val="16"/>
-        </w:rPr>
-        <w:t>Fig. 1. Distribusi target pada dataset pemodelan.</w:t>
-      </w:r>
-    </w:p>
-    <w:p>
-      <w:pPr>
-        <w:spacing w:before="0" w:after="60" w:line="240" w:lineRule="auto"/>
-        <w:ind w:firstLine="259"/>
-        <w:jc w:val="both"/>
-      </w:pPr>
-      <w:r>
-        <w:rPr>
-          <w:rFonts w:ascii="Times New Roman" w:hAnsi="Times New Roman"/>
-          <w:b w:val="0"/>
-          <w:i w:val="0"/>
-          <w:color w:val="000000"/>
-          <w:sz w:val="20"/>
-        </w:rPr>
-        <w:t xml:space="preserve">Pemeriksaan kualitas data kemudian dilakukan sebelum model dilatih. Missing value terutama muncul pada </w:t>
-      </w:r>
-      <w:r>
-        <w:rPr>
-          <w:rFonts w:ascii="Times New Roman" w:hAnsi="Times New Roman"/>
-          <w:b w:val="0"/>
-          <w:i/>
-          <w:color w:val="000000"/>
-          <w:sz w:val="20"/>
-        </w:rPr>
-        <w:t>imd_band</w:t>
-      </w:r>
-      <w:r>
-        <w:rPr>
-          <w:rFonts w:ascii="Times New Roman" w:hAnsi="Times New Roman"/>
-          <w:b w:val="0"/>
-          <w:i w:val="0"/>
-          <w:color w:val="000000"/>
-          <w:sz w:val="20"/>
-        </w:rPr>
-        <w:t xml:space="preserve">, dengan jumlah yang jauh lebih kecil pada </w:t>
-      </w:r>
-      <w:r>
-        <w:rPr>
-          <w:rFonts w:ascii="Times New Roman" w:hAnsi="Times New Roman"/>
-          <w:b w:val="0"/>
-          <w:i/>
-          <w:color w:val="000000"/>
-          <w:sz w:val="20"/>
-        </w:rPr>
-        <w:t>date_registration</w:t>
-      </w:r>
-      <w:r>
-        <w:rPr>
-          <w:rFonts w:ascii="Times New Roman" w:hAnsi="Times New Roman"/>
-          <w:b w:val="0"/>
-          <w:i w:val="0"/>
-          <w:color w:val="000000"/>
-          <w:sz w:val="20"/>
-        </w:rPr>
-        <w:t>. Dua kondisi tersebut ditangani di dalam pipeline berdasarkan data train-validation agar proses imputasi tidak membawa informasi dari hold-out test.</w:t>
-      </w:r>
-    </w:p>
-    <w:p>
-      <w:pPr>
-        <w:keepNext/>
-        <w:spacing w:before="80" w:after="20"/>
-        <w:jc w:val="center"/>
-      </w:pPr>
-      <w:r>
-        <w:drawing>
-          <wp:inline xmlns:a="http://schemas.openxmlformats.org/drawingml/2006/main" xmlns:pic="http://schemas.openxmlformats.org/drawingml/2006/picture">
-            <wp:extent cx="2971800" cy="1649091"/>
-            <wp:docPr id="2" name="Picture 2" descr="Fig. 2. Missing value pada fitur dataset pemodelan." title="Fig"/>
-            <wp:cNvGraphicFramePr>
-              <a:graphicFrameLocks noChangeAspect="1"/>
-            </wp:cNvGraphicFramePr>
-            <a:graphic>
-              <a:graphicData uri="http://schemas.openxmlformats.org/drawingml/2006/picture">
-                <pic:pic>
-                  <pic:nvPicPr>
-                    <pic:cNvPr id="0" name="fig-1b-missing-values.png"/>
-                    <pic:cNvPicPr/>
-                  </pic:nvPicPr>
-                  <pic:blipFill>
-                    <a:blip r:embed="rId10"/>
-                    <a:stretch>
-                      <a:fillRect/>
-                    </a:stretch>
-                  </pic:blipFill>
-                  <pic:spPr>
-                    <a:xfrm>
-                      <a:off x="0" y="0"/>
-                      <a:ext cx="2971800" cy="1649091"/>
-                    </a:xfrm>
-                    <a:prstGeom prst="rect"/>
-                  </pic:spPr>
-                </pic:pic>
-              </a:graphicData>
-            </a:graphic>
-          </wp:inline>
-        </w:drawing>
-      </w:r>
-    </w:p>
-    <w:p>
-      <w:pPr>
-        <w:keepLines/>
-        <w:spacing w:before="20" w:after="80"/>
-        <w:jc w:val="center"/>
-      </w:pPr>
-      <w:r>
-        <w:rPr>
-          <w:rFonts w:ascii="Times New Roman" w:hAnsi="Times New Roman"/>
-          <w:b w:val="0"/>
-          <w:i w:val="0"/>
-          <w:color w:val="000000"/>
-          <w:sz w:val="16"/>
-        </w:rPr>
-        <w:t>Fig. 2. Missing value pada fitur dataset pemodelan.</w:t>
+        <w:t>; keduanya ditangani di dalam pipeline berdasarkan data pelatihan pada setiap fold.</w:t>
       </w:r>
     </w:p>
     <w:p>
       <w:pPr>
         <w:pStyle w:val="Heading2"/>
         <w:keepNext/>
-        <w:spacing w:before="100" w:after="40"/>
+        <w:spacing w:before="80" w:after="20"/>
         <w:jc w:val="left"/>
       </w:pPr>
       <w:r>
@@ -3428,7 +3138,7 @@
     </w:p>
     <w:p>
       <w:pPr>
-        <w:spacing w:before="0" w:after="60" w:line="240" w:lineRule="auto"/>
+        <w:spacing w:before="0" w:after="20" w:line="240" w:lineRule="auto"/>
         <w:ind w:firstLine="259"/>
         <w:jc w:val="both"/>
       </w:pPr>
@@ -3440,7 +3150,7 @@
           <w:color w:val="000000"/>
           <w:sz w:val="20"/>
         </w:rPr>
-        <w:t xml:space="preserve">Tabel I menunjukkan rata-rata hasil 5-fold GroupKFold. Random Forest menghasilkan recall </w:t>
+        <w:t xml:space="preserve">Tabel I menunjukkan hasil 5-fold GroupKFold. Random Forest menghasilkan mean recall </w:t>
       </w:r>
       <w:r>
         <w:rPr>
@@ -3460,7 +3170,7 @@
           <w:color w:val="000000"/>
           <w:sz w:val="20"/>
         </w:rPr>
-        <w:t xml:space="preserve"> tertinggi sebesar 0,7107. XGBoost menghasilkan accuracy, F1-score, dan ROC-AUC tertinggi, masing-masing sebesar 0,7584, 0,7522, dan 0,8440. Berdasarkan kriteria pemilihan yang memprioritaskan recall, Random Forest dipilih sebagai model final.</w:t>
+        <w:t xml:space="preserve"> tertinggi sebesar 0,7107 dan dipilih sebagai model final sesuai kriteria seleksi. XGBoost menghasilkan accuracy, F1-score, dan ROC-AUC tertinggi, masing-masing sebesar 0,7584, 0,7522, dan 0,8440.</w:t>
       </w:r>
     </w:p>
     <w:p>
@@ -4226,7 +3936,7 @@
       <w:pPr>
         <w:pStyle w:val="Heading2"/>
         <w:keepNext/>
-        <w:spacing w:before="100" w:after="40"/>
+        <w:spacing w:before="80" w:after="20"/>
         <w:jc w:val="left"/>
       </w:pPr>
       <w:r>
@@ -4241,7 +3951,7 @@
     </w:p>
     <w:p>
       <w:pPr>
-        <w:spacing w:before="0" w:after="60" w:line="240" w:lineRule="auto"/>
+        <w:spacing w:before="0" w:after="20" w:line="240" w:lineRule="auto"/>
         <w:ind w:firstLine="259"/>
         <w:jc w:val="both"/>
       </w:pPr>
@@ -4253,7 +3963,7 @@
           <w:color w:val="000000"/>
           <w:sz w:val="20"/>
         </w:rPr>
-        <w:t xml:space="preserve">Tabel II memperlihatkan performa pada hold-out test. Random Forest mencapai accuracy 0,7594, precision </w:t>
+        <w:t xml:space="preserve">Pada hold-out test, Random Forest mencapai accuracy 0,7594, precision </w:t>
       </w:r>
       <w:r>
         <w:rPr>
@@ -4273,7 +3983,7 @@
           <w:color w:val="000000"/>
           <w:sz w:val="20"/>
         </w:rPr>
-        <w:t xml:space="preserve"> 0,8007, recall 0,7213, F1-score 0,7589, dan ROC-AUC 0,8396. XGBoost menghasilkan accuracy 0,7611 dan ROC-AUC 0,8443, sedangkan recall </w:t>
+        <w:t xml:space="preserve"> 0,8007, recall 0,7213, F1-score 0,7589, dan ROC-AUC 0,8396. XGBoost menghasilkan accuracy dan ROC-AUC tertinggi, sedangkan Random Forest mempertahankan recall </w:t>
       </w:r>
       <w:r>
         <w:rPr>
@@ -4293,7 +4003,27 @@
           <w:color w:val="000000"/>
           <w:sz w:val="20"/>
         </w:rPr>
-        <w:t xml:space="preserve"> berada pada 0,7045. Logistic Regression menghasilkan recall 0,6904.</w:t>
+        <w:t xml:space="preserve"> tertinggi. Dari 3.398 kasus </w:t>
+      </w:r>
+      <w:r>
+        <w:rPr>
+          <w:rFonts w:ascii="Times New Roman" w:hAnsi="Times New Roman"/>
+          <w:b w:val="0"/>
+          <w:i/>
+          <w:color w:val="000000"/>
+          <w:sz w:val="20"/>
+        </w:rPr>
+        <w:t>AtRisk</w:t>
+      </w:r>
+      <w:r>
+        <w:rPr>
+          <w:rFonts w:ascii="Times New Roman" w:hAnsi="Times New Roman"/>
+          <w:b w:val="0"/>
+          <w:i w:val="0"/>
+          <w:color w:val="000000"/>
+          <w:sz w:val="20"/>
+        </w:rPr>
+        <w:t>, Random Forest mengenali 2.451 kasus dan melewatkan 947 kasus.</w:t>
       </w:r>
     </w:p>
     <w:p>
@@ -5057,7 +4787,7 @@
     </w:p>
     <w:p>
       <w:pPr>
-        <w:spacing w:before="0" w:after="60" w:line="240" w:lineRule="auto"/>
+        <w:spacing w:before="0" w:after="20" w:line="240" w:lineRule="auto"/>
         <w:ind w:firstLine="259"/>
         <w:jc w:val="both"/>
       </w:pPr>
@@ -5069,7 +4799,7 @@
           <w:color w:val="000000"/>
           <w:sz w:val="20"/>
         </w:rPr>
-        <w:t xml:space="preserve">Classification report Random Forest menunjukkan precision 0,80, recall 0,72, dan F1-score 0,76 pada 3.398 kasus </w:t>
+        <w:t xml:space="preserve">Fig. 1 membandingkan metrik ketiga model, Fig. 2 menunjukkan confusion matrix Random Forest, dan Fig. 3 menyajikan kurva ROC. Ketiga model memiliki kurva ROC yang berdekatan. Pemilihan Random Forest mengikuti tujuan early warning yang menempatkan cakupan deteksi </w:t>
       </w:r>
       <w:r>
         <w:rPr>
@@ -5089,47 +4819,7 @@
           <w:color w:val="000000"/>
           <w:sz w:val="20"/>
         </w:rPr>
-        <w:t xml:space="preserve">. Pada 3.073 kasus </w:t>
-      </w:r>
-      <w:r>
-        <w:rPr>
-          <w:rFonts w:ascii="Times New Roman" w:hAnsi="Times New Roman"/>
-          <w:b w:val="0"/>
-          <w:i/>
-          <w:color w:val="000000"/>
-          <w:sz w:val="20"/>
-        </w:rPr>
-        <w:t>Successful</w:t>
-      </w:r>
-      <w:r>
-        <w:rPr>
-          <w:rFonts w:ascii="Times New Roman" w:hAnsi="Times New Roman"/>
-          <w:b w:val="0"/>
-          <w:i w:val="0"/>
-          <w:color w:val="000000"/>
-          <w:sz w:val="20"/>
-        </w:rPr>
-        <w:t xml:space="preserve">, precision mencapai 0,72, recall 0,81, dan F1-score 0,76. Weighted average F1-score mencapai 0,76. Perbandingan metrik antar model menempatkan Random Forest sebagai pilihan yang paling relevan untuk konteks early warning karena recall </w:t>
-      </w:r>
-      <w:r>
-        <w:rPr>
-          <w:rFonts w:ascii="Times New Roman" w:hAnsi="Times New Roman"/>
-          <w:b w:val="0"/>
-          <w:i/>
-          <w:color w:val="000000"/>
-          <w:sz w:val="20"/>
-        </w:rPr>
-        <w:t>AtRisk</w:t>
-      </w:r>
-      <w:r>
-        <w:rPr>
-          <w:rFonts w:ascii="Times New Roman" w:hAnsi="Times New Roman"/>
-          <w:b w:val="0"/>
-          <w:i w:val="0"/>
-          <w:color w:val="000000"/>
-          <w:sz w:val="20"/>
-        </w:rPr>
-        <w:t xml:space="preserve"> menjadi ukuran yang paling dekat dengan kebutuhan menemukan mahasiswa berisiko sejak awal.</w:t>
+        <w:t xml:space="preserve"> sebagai prioritas model selection.</w:t>
       </w:r>
     </w:p>
     <w:p>
@@ -5142,7 +4832,7 @@
         <w:drawing>
           <wp:inline xmlns:a="http://schemas.openxmlformats.org/drawingml/2006/main" xmlns:pic="http://schemas.openxmlformats.org/drawingml/2006/picture">
             <wp:extent cx="2971800" cy="2176023"/>
-            <wp:docPr id="3" name="Picture 3" descr="Fig. 3. Perbandingan metrik AtRisk pada hold-out test." title="Fig"/>
+            <wp:docPr id="1" name="Picture 1" descr="Fig. 1. Perbandingan metrik model pada hold-out test." title="Fig"/>
             <wp:cNvGraphicFramePr>
               <a:graphicFrameLocks noChangeAspect="1"/>
             </wp:cNvGraphicFramePr>
@@ -5154,7 +4844,7 @@
                     <pic:cNvPicPr/>
                   </pic:nvPicPr>
                   <pic:blipFill>
-                    <a:blip r:embed="rId11"/>
+                    <a:blip r:embed="rId9"/>
                     <a:stretch>
                       <a:fillRect/>
                     </a:stretch>
@@ -5187,44 +4877,7 @@
           <w:color w:val="000000"/>
           <w:sz w:val="16"/>
         </w:rPr>
-        <w:t>Fig. 3. Perbandingan metrik AtRisk pada hold-out test.</w:t>
-      </w:r>
-    </w:p>
-    <w:p>
-      <w:pPr>
-        <w:spacing w:before="0" w:after="60" w:line="240" w:lineRule="auto"/>
-        <w:ind w:firstLine="259"/>
-        <w:jc w:val="both"/>
-      </w:pPr>
-      <w:r>
-        <w:rPr>
-          <w:rFonts w:ascii="Times New Roman" w:hAnsi="Times New Roman"/>
-          <w:b w:val="0"/>
-          <w:i w:val="0"/>
-          <w:color w:val="000000"/>
-          <w:sz w:val="20"/>
-        </w:rPr>
-        <w:t xml:space="preserve">Setelah model dipilih, pola kesalahan Random Forest diperiksa untuk memahami risiko operasionalnya. Model tersebut berhasil mengenali 2.451 kasus </w:t>
-      </w:r>
-      <w:r>
-        <w:rPr>
-          <w:rFonts w:ascii="Times New Roman" w:hAnsi="Times New Roman"/>
-          <w:b w:val="0"/>
-          <w:i/>
-          <w:color w:val="000000"/>
-          <w:sz w:val="20"/>
-        </w:rPr>
-        <w:t>AtRisk</w:t>
-      </w:r>
-      <w:r>
-        <w:rPr>
-          <w:rFonts w:ascii="Times New Roman" w:hAnsi="Times New Roman"/>
-          <w:b w:val="0"/>
-          <w:i w:val="0"/>
-          <w:color w:val="000000"/>
-          <w:sz w:val="20"/>
-        </w:rPr>
-        <w:t xml:space="preserve"> dan melewatkan 947 kasus yang masuk kelompok berisiko. Hasil ini menggambarkan cakupan deteksi model sebelum keluaran prediksi diterjemahkan menjadi prioritas intervensi.</w:t>
+        <w:t>Fig. 1. Perbandingan metrik model pada hold-out test.</w:t>
       </w:r>
     </w:p>
     <w:p>
@@ -5237,7 +4890,7 @@
         <w:drawing>
           <wp:inline xmlns:a="http://schemas.openxmlformats.org/drawingml/2006/main" xmlns:pic="http://schemas.openxmlformats.org/drawingml/2006/picture">
             <wp:extent cx="2971800" cy="2176023"/>
-            <wp:docPr id="4" name="Picture 4" descr="Fig. 4. Confusion matrix Random Forest pada hold-out test." title="Fig"/>
+            <wp:docPr id="2" name="Picture 2" descr="Fig. 2. Confusion matrix Random Forest pada hold-out test." title="Fig"/>
             <wp:cNvGraphicFramePr>
               <a:graphicFrameLocks noChangeAspect="1"/>
             </wp:cNvGraphicFramePr>
@@ -5249,7 +4902,7 @@
                     <pic:cNvPicPr/>
                   </pic:nvPicPr>
                   <pic:blipFill>
-                    <a:blip r:embed="rId12"/>
+                    <a:blip r:embed="rId10"/>
                     <a:stretch>
                       <a:fillRect/>
                     </a:stretch>
@@ -5282,24 +4935,7 @@
           <w:color w:val="000000"/>
           <w:sz w:val="16"/>
         </w:rPr>
-        <w:t>Fig. 4. Confusion matrix Random Forest pada hold-out test.</w:t>
-      </w:r>
-    </w:p>
-    <w:p>
-      <w:pPr>
-        <w:spacing w:before="0" w:after="60" w:line="240" w:lineRule="auto"/>
-        <w:ind w:firstLine="259"/>
-        <w:jc w:val="both"/>
-      </w:pPr>
-      <w:r>
-        <w:rPr>
-          <w:rFonts w:ascii="Times New Roman" w:hAnsi="Times New Roman"/>
-          <w:b w:val="0"/>
-          <w:i w:val="0"/>
-          <w:color w:val="000000"/>
-          <w:sz w:val="20"/>
-        </w:rPr>
-        <w:t>Kurva ROC memberikan konteks tambahan terhadap perbedaan antar model. Ketiga kurva berada cukup berdekatan, sehingga selisih ROC-AUC perlu dibaca bersama tujuan keputusan. Dalam penelitian ini, kemampuan memperluas cakupan deteksi lebih diprioritaskan daripada memilih model hanya berdasarkan peringkat ROC-AUC.</w:t>
+        <w:t>Fig. 2. Confusion matrix Random Forest pada hold-out test.</w:t>
       </w:r>
     </w:p>
     <w:p>
@@ -5312,7 +4948,7 @@
         <w:drawing>
           <wp:inline xmlns:a="http://schemas.openxmlformats.org/drawingml/2006/main" xmlns:pic="http://schemas.openxmlformats.org/drawingml/2006/picture">
             <wp:extent cx="2971800" cy="2172736"/>
-            <wp:docPr id="5" name="Picture 5" descr="Fig. 5. Kurva ROC pada hold-out test." title="Fig"/>
+            <wp:docPr id="3" name="Picture 3" descr="Fig. 3. Kurva ROC model pada hold-out test." title="Fig"/>
             <wp:cNvGraphicFramePr>
               <a:graphicFrameLocks noChangeAspect="1"/>
             </wp:cNvGraphicFramePr>
@@ -5324,7 +4960,7 @@
                     <pic:cNvPicPr/>
                   </pic:nvPicPr>
                   <pic:blipFill>
-                    <a:blip r:embed="rId13"/>
+                    <a:blip r:embed="rId11"/>
                     <a:stretch>
                       <a:fillRect/>
                     </a:stretch>
@@ -5357,12 +4993,29 @@
           <w:color w:val="000000"/>
           <w:sz w:val="16"/>
         </w:rPr>
-        <w:t>Fig. 5. Kurva ROC pada hold-out test.</w:t>
+        <w:t>Fig. 3. Kurva ROC model pada hold-out test.</w:t>
       </w:r>
     </w:p>
     <w:p>
       <w:pPr>
-        <w:spacing w:before="0" w:after="60" w:line="240" w:lineRule="auto"/>
+        <w:pStyle w:val="Heading2"/>
+        <w:keepNext/>
+        <w:spacing w:before="80" w:after="20"/>
+        <w:jc w:val="left"/>
+      </w:pPr>
+      <w:r>
+        <w:rPr>
+          <w:rFonts w:ascii="Times New Roman" w:hAnsi="Times New Roman"/>
+          <w:i/>
+          <w:color w:val="000000"/>
+          <w:sz w:val="20"/>
+        </w:rPr>
+        <w:t>D. Feature Importance</w:t>
+      </w:r>
+    </w:p>
+    <w:p>
+      <w:pPr>
+        <w:spacing w:before="0" w:after="20" w:line="240" w:lineRule="auto"/>
         <w:ind w:firstLine="259"/>
         <w:jc w:val="both"/>
       </w:pPr>
@@ -5374,7 +5027,7 @@
           <w:color w:val="000000"/>
           <w:sz w:val="20"/>
         </w:rPr>
-        <w:t>Kontribusi fitur Random Forest memperlihatkan bahwa sinyal perilaku awal menjadi pembeda utama. Total klik VLE, hari aktivitas terakhir, jumlah hari aktif, dan ragam situs yang diakses muncul sebagai prediktor teratas, diikuti fitur assessment dan registrasi. Temuan ini selaras dengan tujuan early warning karena model banyak bertumpu pada jejak engagement yang sudah tersedia sampai akhir minggu keempat. Nilai importance tetap dibaca sebagai kontribusi prediktif, bukan bukti hubungan sebab akibat.</w:t>
+        <w:t>Kontribusi fitur Random Forest didominasi sinyal perilaku awal. Total klik VLE, hari aktivitas terakhir, jumlah hari aktif, dan ragam situs yang diakses muncul sebagai prediktor teratas, diikuti fitur assessment dan registrasi. Nilai importance menunjukkan kontribusi prediktif global; interpretasi hubungan sebab akibat memerlukan desain penelitian kausal.</w:t>
       </w:r>
     </w:p>
     <w:p>
@@ -5387,7 +5040,7 @@
         <w:drawing>
           <wp:inline xmlns:a="http://schemas.openxmlformats.org/drawingml/2006/main" xmlns:pic="http://schemas.openxmlformats.org/drawingml/2006/picture">
             <wp:extent cx="2971800" cy="1763751"/>
-            <wp:docPr id="6" name="Picture 6" descr="Fig. 6. Lima belas fitur dengan feature importance tertinggi pada Random Forest." title="Fig"/>
+            <wp:docPr id="4" name="Picture 4" descr="Fig. 4. Lima belas fitur dengan feature importance tertinggi pada Random Forest." title="Fig"/>
             <wp:cNvGraphicFramePr>
               <a:graphicFrameLocks noChangeAspect="1"/>
             </wp:cNvGraphicFramePr>
@@ -5399,7 +5052,7 @@
                     <pic:cNvPicPr/>
                   </pic:nvPicPr>
                   <pic:blipFill>
-                    <a:blip r:embed="rId14"/>
+                    <a:blip r:embed="rId12"/>
                     <a:stretch>
                       <a:fillRect/>
                     </a:stretch>
@@ -5432,14 +5085,14 @@
           <w:color w:val="000000"/>
           <w:sz w:val="16"/>
         </w:rPr>
-        <w:t>Fig. 6. Lima belas fitur dengan feature importance tertinggi pada Random Forest.</w:t>
+        <w:t>Fig. 4. Lima belas fitur dengan feature importance tertinggi pada Random Forest.</w:t>
       </w:r>
     </w:p>
     <w:p>
       <w:pPr>
         <w:pStyle w:val="Heading2"/>
         <w:keepNext/>
-        <w:spacing w:before="100" w:after="40"/>
+        <w:spacing w:before="80" w:after="20"/>
         <w:jc w:val="left"/>
       </w:pPr>
       <w:r>
@@ -5449,12 +5102,12 @@
           <w:color w:val="000000"/>
           <w:sz w:val="20"/>
         </w:rPr>
-        <w:t>D. Benchmark with OULAD Studies</w:t>
+        <w:t>E. Benchmark with OULAD Studies</w:t>
       </w:r>
     </w:p>
     <w:p>
       <w:pPr>
-        <w:spacing w:before="0" w:after="60" w:line="240" w:lineRule="auto"/>
+        <w:spacing w:before="0" w:after="20" w:line="240" w:lineRule="auto"/>
         <w:ind w:firstLine="259"/>
         <w:jc w:val="both"/>
       </w:pPr>
@@ -5466,7 +5119,7 @@
           <w:color w:val="000000"/>
           <w:sz w:val="20"/>
         </w:rPr>
-        <w:t xml:space="preserve">Tabel III membandingkan hasil penelitian dengan lima studi yang memakai OULAD. Shou et al. mengevaluasi MTAPSP harian pada 20% durasi course dengan target </w:t>
+        <w:t xml:space="preserve">Tabel III menempatkan hasil penelitian dalam konteks lima studi OULAD. Shou et al. memakai target biner yang sama pada 20% durasi course [5]. Jawad et al. menggunakan data sampai 260 hari dan SMOTE [6], Balabied dan Eid menggunakan Random Forest [7], sedangkan Ujkani et al. [8] dan Alnasyan et al. [9] menggabungkan </w:t>
       </w:r>
       <w:r>
         <w:rPr>
@@ -5476,7 +5129,7 @@
           <w:color w:val="000000"/>
           <w:sz w:val="20"/>
         </w:rPr>
-        <w:t>Pass</w:t>
+        <w:t>Fail</w:t>
       </w:r>
       <w:r>
         <w:rPr>
@@ -5496,7 +5149,7 @@
           <w:color w:val="000000"/>
           <w:sz w:val="20"/>
         </w:rPr>
-        <w:t>Distinction</w:t>
+        <w:t>Withdrawn</w:t>
       </w:r>
       <w:r>
         <w:rPr>
@@ -5506,99 +5159,8 @@
           <w:color w:val="000000"/>
           <w:sz w:val="20"/>
         </w:rPr>
-        <w:t xml:space="preserve"> terhadap </w:t>
-      </w:r>
-      <w:r>
-        <w:rPr>
-          <w:rFonts w:ascii="Times New Roman" w:hAnsi="Times New Roman"/>
-          <w:b w:val="0"/>
-          <w:i/>
-          <w:color w:val="000000"/>
-          <w:sz w:val="20"/>
-        </w:rPr>
-        <w:t>Fail</w:t>
-      </w:r>
-      <w:r>
-        <w:rPr>
-          <w:rFonts w:ascii="Times New Roman" w:hAnsi="Times New Roman"/>
-          <w:b w:val="0"/>
-          <w:i w:val="0"/>
-          <w:color w:val="000000"/>
-          <w:sz w:val="20"/>
-        </w:rPr>
-        <w:t xml:space="preserve"> serta </w:t>
-      </w:r>
-      <w:r>
-        <w:rPr>
-          <w:rFonts w:ascii="Times New Roman" w:hAnsi="Times New Roman"/>
-          <w:b w:val="0"/>
-          <w:i/>
-          <w:color w:val="000000"/>
-          <w:sz w:val="20"/>
-        </w:rPr>
-        <w:t>Withdrawn</w:t>
-      </w:r>
-      <w:r>
-        <w:rPr>
-          <w:rFonts w:ascii="Times New Roman" w:hAnsi="Times New Roman"/>
-          <w:b w:val="0"/>
-          <w:i w:val="0"/>
-          <w:color w:val="000000"/>
-          <w:sz w:val="20"/>
-        </w:rPr>
-        <w:t xml:space="preserve"> [5]. Jawad et al. menggunakan data sampai 260 hari dan SMOTE [6]. Balabied dan Eid menggunakan split 80:20 pada klasifikasi biner [7]. Ujkani et al. dan Alnasyan et al. menggabungkan </w:t>
-      </w:r>
-      <w:r>
-        <w:rPr>
-          <w:rFonts w:ascii="Times New Roman" w:hAnsi="Times New Roman"/>
-          <w:b w:val="0"/>
-          <w:i/>
-          <w:color w:val="000000"/>
-          <w:sz w:val="20"/>
-        </w:rPr>
-        <w:t>Fail</w:t>
-      </w:r>
-      <w:r>
-        <w:rPr>
-          <w:rFonts w:ascii="Times New Roman" w:hAnsi="Times New Roman"/>
-          <w:b w:val="0"/>
-          <w:i w:val="0"/>
-          <w:color w:val="000000"/>
-          <w:sz w:val="20"/>
-        </w:rPr>
-        <w:t xml:space="preserve"> serta </w:t>
-      </w:r>
-      <w:r>
-        <w:rPr>
-          <w:rFonts w:ascii="Times New Roman" w:hAnsi="Times New Roman"/>
-          <w:b w:val="0"/>
-          <w:i/>
-          <w:color w:val="000000"/>
-          <w:sz w:val="20"/>
-        </w:rPr>
-        <w:t>Withdrawn</w:t>
-      </w:r>
-      <w:r>
-        <w:rPr>
-          <w:rFonts w:ascii="Times New Roman" w:hAnsi="Times New Roman"/>
-          <w:b w:val="0"/>
-          <w:i w:val="0"/>
-          <w:color w:val="000000"/>
-          <w:sz w:val="20"/>
-        </w:rPr>
-        <w:t xml:space="preserve"> sebagai kelompok at-risk [8], [9]. Perbedaan horizon, desain split, balancing, dan arsitektur model menjadi konteks pembacaan angka.</w:t>
-      </w:r>
-    </w:p>
-    <w:p>
-      <w:pPr>
-        <w:sectPr>
-          <w:type w:val="continuous"/>
-          <w:pgSz w:w="12240" w:h="15840"/>
-          <w:pgMar w:top="936" w:right="936" w:bottom="936" w:left="936" w:header="432" w:footer="432" w:gutter="0"/>
-          <w:cols w:space="360" w:num="2" w:equalWidth="1"/>
-          <w:docGrid w:linePitch="360"/>
-        </w:sectPr>
-      </w:pPr>
+        <w:t xml:space="preserve"> sebagai kelompok at-risk. Perbedaan horizon, split, balancing, dan model menjadikan angka pada tabel sebagai konteks benchmark.</w:t>
+      </w:r>
     </w:p>
     <w:p>
       <w:pPr>
@@ -5621,26 +5183,22 @@
           <w:color w:val="000000"/>
           <w:sz w:val="16"/>
         </w:rPr>
-        <w:t>BENCHMARK HASIL PADA PENELITIAN BERBASIS OULAD</w:t>
+        <w:t>BENCHMARK PENELITIAN BERBASIS OULAD</w:t>
       </w:r>
     </w:p>
     <w:tbl>
       <w:tblPr>
         <w:tblStyle w:val="TableGrid"/>
-        <w:tblW w:type="dxa" w:w="10260"/>
+        <w:tblW w:type="dxa" w:w="4800"/>
         <w:jc w:val="center"/>
         <w:tblLayout w:type="fixed"/>
         <w:tblLook w:firstColumn="1" w:firstRow="1" w:lastColumn="0" w:lastRow="0" w:noHBand="0" w:noVBand="1" w:val="04A0"/>
       </w:tblPr>
       <w:tblGrid>
-        <w:gridCol w:w="2600"/>
-        <w:gridCol w:w="1094"/>
-        <w:gridCol w:w="1094"/>
-        <w:gridCol w:w="1094"/>
-        <w:gridCol w:w="1094"/>
-        <w:gridCol w:w="1094"/>
-        <w:gridCol w:w="1094"/>
-        <w:gridCol w:w="1096"/>
+        <w:gridCol w:w="1100"/>
+        <w:gridCol w:w="1233"/>
+        <w:gridCol w:w="1233"/>
+        <w:gridCol w:w="1234"/>
       </w:tblGrid>
       <w:tr>
         <w:trPr>
@@ -5648,7 +5206,7 @@
         </w:trPr>
         <w:tc>
           <w:tcPr>
-            <w:tcW w:type="dxa" w:w="2600"/>
+            <w:tcW w:type="dxa" w:w="1100"/>
             <w:tcMar>
               <w:top w:w="60" w:type="dxa"/>
               <w:start w:w="80" w:type="dxa"/>
@@ -5670,7 +5228,7 @@
                 <w:b/>
                 <w:i w:val="0"/>
                 <w:color w:val="000000"/>
-                <w:sz w:val="14"/>
+                <w:sz w:val="13"/>
               </w:rPr>
               <w:t>Penelitian</w:t>
             </w:r>
@@ -5678,7 +5236,7 @@
         </w:tc>
         <w:tc>
           <w:tcPr>
-            <w:tcW w:type="dxa" w:w="1094"/>
+            <w:tcW w:type="dxa" w:w="1233"/>
             <w:tcMar>
               <w:top w:w="60" w:type="dxa"/>
               <w:start w:w="80" w:type="dxa"/>
@@ -5700,15 +5258,15 @@
                 <w:b/>
                 <w:i w:val="0"/>
                 <w:color w:val="000000"/>
-                <w:sz w:val="14"/>
+                <w:sz w:val="13"/>
               </w:rPr>
-              <w:t>Skenario</w:t>
+              <w:t>Skenario dan Model</w:t>
             </w:r>
           </w:p>
         </w:tc>
         <w:tc>
           <w:tcPr>
-            <w:tcW w:type="dxa" w:w="1094"/>
+            <w:tcW w:type="dxa" w:w="1233"/>
             <w:tcMar>
               <w:top w:w="60" w:type="dxa"/>
               <w:start w:w="80" w:type="dxa"/>
@@ -5730,15 +5288,15 @@
                 <w:b/>
                 <w:i w:val="0"/>
                 <w:color w:val="000000"/>
-                <w:sz w:val="14"/>
+                <w:sz w:val="13"/>
               </w:rPr>
-              <w:t>Model</w:t>
+              <w:t>Accuracy</w:t>
             </w:r>
           </w:p>
         </w:tc>
         <w:tc>
           <w:tcPr>
-            <w:tcW w:type="dxa" w:w="1094"/>
+            <w:tcW w:type="dxa" w:w="1234"/>
             <w:tcMar>
               <w:top w:w="60" w:type="dxa"/>
               <w:start w:w="80" w:type="dxa"/>
@@ -5760,129 +5318,9 @@
                 <w:b/>
                 <w:i w:val="0"/>
                 <w:color w:val="000000"/>
-                <w:sz w:val="14"/>
-              </w:rPr>
-              <w:t>Accuracy</w:t>
-            </w:r>
-          </w:p>
-        </w:tc>
-        <w:tc>
-          <w:tcPr>
-            <w:tcW w:type="dxa" w:w="1094"/>
-            <w:tcMar>
-              <w:top w:w="60" w:type="dxa"/>
-              <w:start w:w="80" w:type="dxa"/>
-              <w:bottom w:w="60" w:type="dxa"/>
-              <w:end w:w="80" w:type="dxa"/>
-            </w:tcMar>
-            <w:vAlign w:val="center"/>
-            <w:shd w:fill="E7E6E6"/>
-          </w:tcPr>
-          <w:p>
-            <w:pPr>
-              <w:spacing w:after="0"/>
-              <w:jc w:val="center"/>
-            </w:pPr>
-            <w:r/>
-            <w:r>
-              <w:rPr>
-                <w:rFonts w:ascii="Times New Roman" w:hAnsi="Times New Roman"/>
-                <w:b/>
-                <w:i w:val="0"/>
-                <w:color w:val="000000"/>
-                <w:sz w:val="14"/>
-              </w:rPr>
-              <w:t>Precision</w:t>
-            </w:r>
-          </w:p>
-        </w:tc>
-        <w:tc>
-          <w:tcPr>
-            <w:tcW w:type="dxa" w:w="1094"/>
-            <w:tcMar>
-              <w:top w:w="60" w:type="dxa"/>
-              <w:start w:w="80" w:type="dxa"/>
-              <w:bottom w:w="60" w:type="dxa"/>
-              <w:end w:w="80" w:type="dxa"/>
-            </w:tcMar>
-            <w:vAlign w:val="center"/>
-            <w:shd w:fill="E7E6E6"/>
-          </w:tcPr>
-          <w:p>
-            <w:pPr>
-              <w:spacing w:after="0"/>
-              <w:jc w:val="center"/>
-            </w:pPr>
-            <w:r/>
-            <w:r>
-              <w:rPr>
-                <w:rFonts w:ascii="Times New Roman" w:hAnsi="Times New Roman"/>
-                <w:b/>
-                <w:i w:val="0"/>
-                <w:color w:val="000000"/>
-                <w:sz w:val="14"/>
-              </w:rPr>
-              <w:t>Recall</w:t>
-            </w:r>
-          </w:p>
-        </w:tc>
-        <w:tc>
-          <w:tcPr>
-            <w:tcW w:type="dxa" w:w="1094"/>
-            <w:tcMar>
-              <w:top w:w="60" w:type="dxa"/>
-              <w:start w:w="80" w:type="dxa"/>
-              <w:bottom w:w="60" w:type="dxa"/>
-              <w:end w:w="80" w:type="dxa"/>
-            </w:tcMar>
-            <w:vAlign w:val="center"/>
-            <w:shd w:fill="E7E6E6"/>
-          </w:tcPr>
-          <w:p>
-            <w:pPr>
-              <w:spacing w:after="0"/>
-              <w:jc w:val="center"/>
-            </w:pPr>
-            <w:r/>
-            <w:r>
-              <w:rPr>
-                <w:rFonts w:ascii="Times New Roman" w:hAnsi="Times New Roman"/>
-                <w:b/>
-                <w:i w:val="0"/>
-                <w:color w:val="000000"/>
-                <w:sz w:val="14"/>
+                <w:sz w:val="13"/>
               </w:rPr>
               <w:t>F1</w:t>
-            </w:r>
-          </w:p>
-        </w:tc>
-        <w:tc>
-          <w:tcPr>
-            <w:tcW w:type="dxa" w:w="1096"/>
-            <w:tcMar>
-              <w:top w:w="60" w:type="dxa"/>
-              <w:start w:w="80" w:type="dxa"/>
-              <w:bottom w:w="60" w:type="dxa"/>
-              <w:end w:w="80" w:type="dxa"/>
-            </w:tcMar>
-            <w:vAlign w:val="center"/>
-            <w:shd w:fill="E7E6E6"/>
-          </w:tcPr>
-          <w:p>
-            <w:pPr>
-              <w:spacing w:after="0"/>
-              <w:jc w:val="center"/>
-            </w:pPr>
-            <w:r/>
-            <w:r>
-              <w:rPr>
-                <w:rFonts w:ascii="Times New Roman" w:hAnsi="Times New Roman"/>
-                <w:b/>
-                <w:i w:val="0"/>
-                <w:color w:val="000000"/>
-                <w:sz w:val="14"/>
-              </w:rPr>
-              <w:t>ROC-AUC</w:t>
             </w:r>
           </w:p>
         </w:tc>
@@ -5890,7 +5328,7 @@
       <w:tr>
         <w:tc>
           <w:tcPr>
-            <w:tcW w:type="dxa" w:w="2600"/>
+            <w:tcW w:type="dxa" w:w="1100"/>
             <w:tcMar>
               <w:top w:w="60" w:type="dxa"/>
               <w:start w:w="80" w:type="dxa"/>
@@ -5911,7 +5349,7 @@
                 <w:b w:val="0"/>
                 <w:i w:val="0"/>
                 <w:color w:val="000000"/>
-                <w:sz w:val="14"/>
+                <w:sz w:val="13"/>
               </w:rPr>
               <w:t>Shou et al. [5]</w:t>
             </w:r>
@@ -5919,7 +5357,7 @@
         </w:tc>
         <w:tc>
           <w:tcPr>
-            <w:tcW w:type="dxa" w:w="1094"/>
+            <w:tcW w:type="dxa" w:w="1233"/>
             <w:tcMar>
               <w:top w:w="60" w:type="dxa"/>
               <w:start w:w="80" w:type="dxa"/>
@@ -5940,15 +5378,15 @@
                 <w:b w:val="0"/>
                 <w:i w:val="0"/>
                 <w:color w:val="000000"/>
-                <w:sz w:val="14"/>
+                <w:sz w:val="13"/>
               </w:rPr>
-              <w:t>20% durasi course, target biner</w:t>
+              <w:t>20% course, MTAPSP daily</w:t>
             </w:r>
           </w:p>
         </w:tc>
         <w:tc>
           <w:tcPr>
-            <w:tcW w:type="dxa" w:w="1094"/>
+            <w:tcW w:type="dxa" w:w="1233"/>
             <w:tcMar>
               <w:top w:w="60" w:type="dxa"/>
               <w:start w:w="80" w:type="dxa"/>
@@ -5969,15 +5407,15 @@
                 <w:b w:val="0"/>
                 <w:i w:val="0"/>
                 <w:color w:val="000000"/>
-                <w:sz w:val="14"/>
+                <w:sz w:val="13"/>
               </w:rPr>
-              <w:t>MTAPSP (daily)</w:t>
+              <w:t>0,9179</w:t>
             </w:r>
           </w:p>
         </w:tc>
         <w:tc>
           <w:tcPr>
-            <w:tcW w:type="dxa" w:w="1094"/>
+            <w:tcW w:type="dxa" w:w="1234"/>
             <w:tcMar>
               <w:top w:w="60" w:type="dxa"/>
               <w:start w:w="80" w:type="dxa"/>
@@ -5998,15 +5436,46 @@
                 <w:b w:val="0"/>
                 <w:i w:val="0"/>
                 <w:color w:val="000000"/>
-                <w:sz w:val="14"/>
+                <w:sz w:val="13"/>
               </w:rPr>
-              <w:t>0,9179</w:t>
+              <w:t>0,9180</w:t>
+            </w:r>
+          </w:p>
+        </w:tc>
+      </w:tr>
+      <w:tr>
+        <w:tc>
+          <w:tcPr>
+            <w:tcW w:type="dxa" w:w="1100"/>
+            <w:tcMar>
+              <w:top w:w="60" w:type="dxa"/>
+              <w:start w:w="80" w:type="dxa"/>
+              <w:bottom w:w="60" w:type="dxa"/>
+              <w:end w:w="80" w:type="dxa"/>
+            </w:tcMar>
+            <w:vAlign w:val="center"/>
+          </w:tcPr>
+          <w:p>
+            <w:pPr>
+              <w:spacing w:after="0"/>
+              <w:jc w:val="left"/>
+            </w:pPr>
+            <w:r/>
+            <w:r>
+              <w:rPr>
+                <w:rFonts w:ascii="Times New Roman" w:hAnsi="Times New Roman"/>
+                <w:b w:val="0"/>
+                <w:i w:val="0"/>
+                <w:color w:val="000000"/>
+                <w:sz w:val="13"/>
+              </w:rPr>
+              <w:t>Jawad et al. [6]</w:t>
             </w:r>
           </w:p>
         </w:tc>
         <w:tc>
           <w:tcPr>
-            <w:tcW w:type="dxa" w:w="1094"/>
+            <w:tcW w:type="dxa" w:w="1233"/>
             <w:tcMar>
               <w:top w:w="60" w:type="dxa"/>
               <w:start w:w="80" w:type="dxa"/>
@@ -6027,15 +5496,15 @@
                 <w:b w:val="0"/>
                 <w:i w:val="0"/>
                 <w:color w:val="000000"/>
-                <w:sz w:val="14"/>
+                <w:sz w:val="13"/>
               </w:rPr>
-              <w:t>-</w:t>
+              <w:t>260 hari + SMOTE, RF</w:t>
             </w:r>
           </w:p>
         </w:tc>
         <w:tc>
           <w:tcPr>
-            <w:tcW w:type="dxa" w:w="1094"/>
+            <w:tcW w:type="dxa" w:w="1233"/>
             <w:tcMar>
               <w:top w:w="60" w:type="dxa"/>
               <w:start w:w="80" w:type="dxa"/>
@@ -6056,15 +5525,15 @@
                 <w:b w:val="0"/>
                 <w:i w:val="0"/>
                 <w:color w:val="000000"/>
-                <w:sz w:val="14"/>
+                <w:sz w:val="13"/>
               </w:rPr>
-              <w:t>-</w:t>
+              <w:t>0,8920</w:t>
             </w:r>
           </w:p>
         </w:tc>
         <w:tc>
           <w:tcPr>
-            <w:tcW w:type="dxa" w:w="1094"/>
+            <w:tcW w:type="dxa" w:w="1234"/>
             <w:tcMar>
               <w:top w:w="60" w:type="dxa"/>
               <w:start w:w="80" w:type="dxa"/>
@@ -6085,15 +5554,46 @@
                 <w:b w:val="0"/>
                 <w:i w:val="0"/>
                 <w:color w:val="000000"/>
-                <w:sz w:val="14"/>
+                <w:sz w:val="13"/>
               </w:rPr>
-              <w:t>0,9180</w:t>
+              <w:t>-</w:t>
+            </w:r>
+          </w:p>
+        </w:tc>
+      </w:tr>
+      <w:tr>
+        <w:tc>
+          <w:tcPr>
+            <w:tcW w:type="dxa" w:w="1100"/>
+            <w:tcMar>
+              <w:top w:w="60" w:type="dxa"/>
+              <w:start w:w="80" w:type="dxa"/>
+              <w:bottom w:w="60" w:type="dxa"/>
+              <w:end w:w="80" w:type="dxa"/>
+            </w:tcMar>
+            <w:vAlign w:val="center"/>
+          </w:tcPr>
+          <w:p>
+            <w:pPr>
+              <w:spacing w:after="0"/>
+              <w:jc w:val="left"/>
+            </w:pPr>
+            <w:r/>
+            <w:r>
+              <w:rPr>
+                <w:rFonts w:ascii="Times New Roman" w:hAnsi="Times New Roman"/>
+                <w:b w:val="0"/>
+                <w:i w:val="0"/>
+                <w:color w:val="000000"/>
+                <w:sz w:val="13"/>
+              </w:rPr>
+              <w:t>Balabied dan Eid [7]</w:t>
             </w:r>
           </w:p>
         </w:tc>
         <w:tc>
           <w:tcPr>
-            <w:tcW w:type="dxa" w:w="1096"/>
+            <w:tcW w:type="dxa" w:w="1233"/>
             <w:tcMar>
               <w:top w:w="60" w:type="dxa"/>
               <w:start w:w="80" w:type="dxa"/>
@@ -6114,9 +5614,67 @@
                 <w:b w:val="0"/>
                 <w:i w:val="0"/>
                 <w:color w:val="000000"/>
-                <w:sz w:val="14"/>
+                <w:sz w:val="13"/>
               </w:rPr>
-              <w:t>-</w:t>
+              <w:t>Binary, RF</w:t>
+            </w:r>
+          </w:p>
+        </w:tc>
+        <w:tc>
+          <w:tcPr>
+            <w:tcW w:type="dxa" w:w="1233"/>
+            <w:tcMar>
+              <w:top w:w="60" w:type="dxa"/>
+              <w:start w:w="80" w:type="dxa"/>
+              <w:bottom w:w="60" w:type="dxa"/>
+              <w:end w:w="80" w:type="dxa"/>
+            </w:tcMar>
+            <w:vAlign w:val="center"/>
+          </w:tcPr>
+          <w:p>
+            <w:pPr>
+              <w:spacing w:after="0"/>
+              <w:jc w:val="center"/>
+            </w:pPr>
+            <w:r/>
+            <w:r>
+              <w:rPr>
+                <w:rFonts w:ascii="Times New Roman" w:hAnsi="Times New Roman"/>
+                <w:b w:val="0"/>
+                <w:i w:val="0"/>
+                <w:color w:val="000000"/>
+                <w:sz w:val="13"/>
+              </w:rPr>
+              <w:t>0,9000</w:t>
+            </w:r>
+          </w:p>
+        </w:tc>
+        <w:tc>
+          <w:tcPr>
+            <w:tcW w:type="dxa" w:w="1234"/>
+            <w:tcMar>
+              <w:top w:w="60" w:type="dxa"/>
+              <w:start w:w="80" w:type="dxa"/>
+              <w:bottom w:w="60" w:type="dxa"/>
+              <w:end w:w="80" w:type="dxa"/>
+            </w:tcMar>
+            <w:vAlign w:val="center"/>
+          </w:tcPr>
+          <w:p>
+            <w:pPr>
+              <w:spacing w:after="0"/>
+              <w:jc w:val="center"/>
+            </w:pPr>
+            <w:r/>
+            <w:r>
+              <w:rPr>
+                <w:rFonts w:ascii="Times New Roman" w:hAnsi="Times New Roman"/>
+                <w:b w:val="0"/>
+                <w:i w:val="0"/>
+                <w:color w:val="000000"/>
+                <w:sz w:val="13"/>
+              </w:rPr>
+              <w:t>0,9000</w:t>
             </w:r>
           </w:p>
         </w:tc>
@@ -6124,7 +5682,7 @@
       <w:tr>
         <w:tc>
           <w:tcPr>
-            <w:tcW w:type="dxa" w:w="2600"/>
+            <w:tcW w:type="dxa" w:w="1100"/>
             <w:tcMar>
               <w:top w:w="60" w:type="dxa"/>
               <w:start w:w="80" w:type="dxa"/>
@@ -6145,15 +5703,15 @@
                 <w:b w:val="0"/>
                 <w:i w:val="0"/>
                 <w:color w:val="000000"/>
-                <w:sz w:val="14"/>
+                <w:sz w:val="13"/>
               </w:rPr>
-              <w:t>Jawad et al. [6]</w:t>
+              <w:t>Ujkani et al. [8]</w:t>
             </w:r>
           </w:p>
         </w:tc>
         <w:tc>
           <w:tcPr>
-            <w:tcW w:type="dxa" w:w="1094"/>
+            <w:tcW w:type="dxa" w:w="1233"/>
             <w:tcMar>
               <w:top w:w="60" w:type="dxa"/>
               <w:start w:w="80" w:type="dxa"/>
@@ -6174,15 +5732,15 @@
                 <w:b w:val="0"/>
                 <w:i w:val="0"/>
                 <w:color w:val="000000"/>
-                <w:sz w:val="14"/>
+                <w:sz w:val="13"/>
               </w:rPr>
-              <w:t>260 hari + SMOTE</w:t>
+              <w:t>At-risk binary, custom NN</w:t>
             </w:r>
           </w:p>
         </w:tc>
         <w:tc>
           <w:tcPr>
-            <w:tcW w:type="dxa" w:w="1094"/>
+            <w:tcW w:type="dxa" w:w="1233"/>
             <w:tcMar>
               <w:top w:w="60" w:type="dxa"/>
               <w:start w:w="80" w:type="dxa"/>
@@ -6203,15 +5761,15 @@
                 <w:b w:val="0"/>
                 <w:i w:val="0"/>
                 <w:color w:val="000000"/>
-                <w:sz w:val="14"/>
+                <w:sz w:val="13"/>
               </w:rPr>
-              <w:t>Random Forest</w:t>
+              <w:t>0,9300</w:t>
             </w:r>
           </w:p>
         </w:tc>
         <w:tc>
           <w:tcPr>
-            <w:tcW w:type="dxa" w:w="1094"/>
+            <w:tcW w:type="dxa" w:w="1234"/>
             <w:tcMar>
               <w:top w:w="60" w:type="dxa"/>
               <w:start w:w="80" w:type="dxa"/>
@@ -6232,15 +5790,46 @@
                 <w:b w:val="0"/>
                 <w:i w:val="0"/>
                 <w:color w:val="000000"/>
-                <w:sz w:val="14"/>
+                <w:sz w:val="13"/>
               </w:rPr>
-              <w:t>0,8920</w:t>
+              <w:t>0,9600</w:t>
+            </w:r>
+          </w:p>
+        </w:tc>
+      </w:tr>
+      <w:tr>
+        <w:tc>
+          <w:tcPr>
+            <w:tcW w:type="dxa" w:w="1100"/>
+            <w:tcMar>
+              <w:top w:w="60" w:type="dxa"/>
+              <w:start w:w="80" w:type="dxa"/>
+              <w:bottom w:w="60" w:type="dxa"/>
+              <w:end w:w="80" w:type="dxa"/>
+            </w:tcMar>
+            <w:vAlign w:val="center"/>
+          </w:tcPr>
+          <w:p>
+            <w:pPr>
+              <w:spacing w:after="0"/>
+              <w:jc w:val="left"/>
+            </w:pPr>
+            <w:r/>
+            <w:r>
+              <w:rPr>
+                <w:rFonts w:ascii="Times New Roman" w:hAnsi="Times New Roman"/>
+                <w:b w:val="0"/>
+                <w:i w:val="0"/>
+                <w:color w:val="000000"/>
+                <w:sz w:val="13"/>
+              </w:rPr>
+              <w:t>Alnasyan et al. [9]</w:t>
             </w:r>
           </w:p>
         </w:tc>
         <w:tc>
           <w:tcPr>
-            <w:tcW w:type="dxa" w:w="1094"/>
+            <w:tcW w:type="dxa" w:w="1233"/>
             <w:tcMar>
               <w:top w:w="60" w:type="dxa"/>
               <w:start w:w="80" w:type="dxa"/>
@@ -6261,15 +5850,15 @@
                 <w:b w:val="0"/>
                 <w:i w:val="0"/>
                 <w:color w:val="000000"/>
-                <w:sz w:val="14"/>
+                <w:sz w:val="13"/>
               </w:rPr>
-              <w:t>-</w:t>
+              <w:t>At-risk binary, KANFormer</w:t>
             </w:r>
           </w:p>
         </w:tc>
         <w:tc>
           <w:tcPr>
-            <w:tcW w:type="dxa" w:w="1094"/>
+            <w:tcW w:type="dxa" w:w="1233"/>
             <w:tcMar>
               <w:top w:w="60" w:type="dxa"/>
               <w:start w:w="80" w:type="dxa"/>
@@ -6290,15 +5879,15 @@
                 <w:b w:val="0"/>
                 <w:i w:val="0"/>
                 <w:color w:val="000000"/>
-                <w:sz w:val="14"/>
+                <w:sz w:val="13"/>
               </w:rPr>
-              <w:t>-</w:t>
+              <w:t>0,9459</w:t>
             </w:r>
           </w:p>
         </w:tc>
         <w:tc>
           <w:tcPr>
-            <w:tcW w:type="dxa" w:w="1094"/>
+            <w:tcW w:type="dxa" w:w="1234"/>
             <w:tcMar>
               <w:top w:w="60" w:type="dxa"/>
               <w:start w:w="80" w:type="dxa"/>
@@ -6319,15 +5908,46 @@
                 <w:b w:val="0"/>
                 <w:i w:val="0"/>
                 <w:color w:val="000000"/>
-                <w:sz w:val="14"/>
+                <w:sz w:val="13"/>
               </w:rPr>
-              <w:t>-</w:t>
+              <w:t>0,9481</w:t>
+            </w:r>
+          </w:p>
+        </w:tc>
+      </w:tr>
+      <w:tr>
+        <w:tc>
+          <w:tcPr>
+            <w:tcW w:type="dxa" w:w="1100"/>
+            <w:tcMar>
+              <w:top w:w="60" w:type="dxa"/>
+              <w:start w:w="80" w:type="dxa"/>
+              <w:bottom w:w="60" w:type="dxa"/>
+              <w:end w:w="80" w:type="dxa"/>
+            </w:tcMar>
+            <w:vAlign w:val="center"/>
+          </w:tcPr>
+          <w:p>
+            <w:pPr>
+              <w:spacing w:after="0"/>
+              <w:jc w:val="left"/>
+            </w:pPr>
+            <w:r/>
+            <w:r>
+              <w:rPr>
+                <w:rFonts w:ascii="Times New Roman" w:hAnsi="Times New Roman"/>
+                <w:b w:val="0"/>
+                <w:i w:val="0"/>
+                <w:color w:val="000000"/>
+                <w:sz w:val="13"/>
+              </w:rPr>
+              <w:t>Penelitian ini</w:t>
             </w:r>
           </w:p>
         </w:tc>
         <w:tc>
           <w:tcPr>
-            <w:tcW w:type="dxa" w:w="1096"/>
+            <w:tcW w:type="dxa" w:w="1233"/>
             <w:tcMar>
               <w:top w:w="60" w:type="dxa"/>
               <w:start w:w="80" w:type="dxa"/>
@@ -6348,46 +5968,15 @@
                 <w:b w:val="0"/>
                 <w:i w:val="0"/>
                 <w:color w:val="000000"/>
-                <w:sz w:val="14"/>
+                <w:sz w:val="13"/>
               </w:rPr>
-              <w:t>0,9600</w:t>
-            </w:r>
-          </w:p>
-        </w:tc>
-      </w:tr>
-      <w:tr>
-        <w:tc>
-          <w:tcPr>
-            <w:tcW w:type="dxa" w:w="2600"/>
-            <w:tcMar>
-              <w:top w:w="60" w:type="dxa"/>
-              <w:start w:w="80" w:type="dxa"/>
-              <w:bottom w:w="60" w:type="dxa"/>
-              <w:end w:w="80" w:type="dxa"/>
-            </w:tcMar>
-            <w:vAlign w:val="center"/>
-          </w:tcPr>
-          <w:p>
-            <w:pPr>
-              <w:spacing w:after="0"/>
-              <w:jc w:val="left"/>
-            </w:pPr>
-            <w:r/>
-            <w:r>
-              <w:rPr>
-                <w:rFonts w:ascii="Times New Roman" w:hAnsi="Times New Roman"/>
-                <w:b w:val="0"/>
-                <w:i w:val="0"/>
-                <w:color w:val="000000"/>
-                <w:sz w:val="14"/>
-              </w:rPr>
-              <w:t>Balabied dan Eid [7]</w:t>
+              <w:t>Hari ke-28, group split, RF</w:t>
             </w:r>
           </w:p>
         </w:tc>
         <w:tc>
           <w:tcPr>
-            <w:tcW w:type="dxa" w:w="1094"/>
+            <w:tcW w:type="dxa" w:w="1233"/>
             <w:tcMar>
               <w:top w:w="60" w:type="dxa"/>
               <w:start w:w="80" w:type="dxa"/>
@@ -6408,15 +5997,15 @@
                 <w:b w:val="0"/>
                 <w:i w:val="0"/>
                 <w:color w:val="000000"/>
-                <w:sz w:val="14"/>
+                <w:sz w:val="13"/>
               </w:rPr>
-              <w:t>Klasifikasi biner</w:t>
+              <w:t>0,7594</w:t>
             </w:r>
           </w:p>
         </w:tc>
         <w:tc>
           <w:tcPr>
-            <w:tcW w:type="dxa" w:w="1094"/>
+            <w:tcW w:type="dxa" w:w="1234"/>
             <w:tcMar>
               <w:top w:w="60" w:type="dxa"/>
               <w:start w:w="80" w:type="dxa"/>
@@ -6437,962 +6026,14 @@
                 <w:b w:val="0"/>
                 <w:i w:val="0"/>
                 <w:color w:val="000000"/>
-                <w:sz w:val="14"/>
-              </w:rPr>
-              <w:t>Random Forest</w:t>
-            </w:r>
-          </w:p>
-        </w:tc>
-        <w:tc>
-          <w:tcPr>
-            <w:tcW w:type="dxa" w:w="1094"/>
-            <w:tcMar>
-              <w:top w:w="60" w:type="dxa"/>
-              <w:start w:w="80" w:type="dxa"/>
-              <w:bottom w:w="60" w:type="dxa"/>
-              <w:end w:w="80" w:type="dxa"/>
-            </w:tcMar>
-            <w:vAlign w:val="center"/>
-          </w:tcPr>
-          <w:p>
-            <w:pPr>
-              <w:spacing w:after="0"/>
-              <w:jc w:val="center"/>
-            </w:pPr>
-            <w:r/>
-            <w:r>
-              <w:rPr>
-                <w:rFonts w:ascii="Times New Roman" w:hAnsi="Times New Roman"/>
-                <w:b w:val="0"/>
-                <w:i w:val="0"/>
-                <w:color w:val="000000"/>
-                <w:sz w:val="14"/>
-              </w:rPr>
-              <w:t>0,9000</w:t>
-            </w:r>
-          </w:p>
-        </w:tc>
-        <w:tc>
-          <w:tcPr>
-            <w:tcW w:type="dxa" w:w="1094"/>
-            <w:tcMar>
-              <w:top w:w="60" w:type="dxa"/>
-              <w:start w:w="80" w:type="dxa"/>
-              <w:bottom w:w="60" w:type="dxa"/>
-              <w:end w:w="80" w:type="dxa"/>
-            </w:tcMar>
-            <w:vAlign w:val="center"/>
-          </w:tcPr>
-          <w:p>
-            <w:pPr>
-              <w:spacing w:after="0"/>
-              <w:jc w:val="center"/>
-            </w:pPr>
-            <w:r/>
-            <w:r>
-              <w:rPr>
-                <w:rFonts w:ascii="Times New Roman" w:hAnsi="Times New Roman"/>
-                <w:b w:val="0"/>
-                <w:i w:val="0"/>
-                <w:color w:val="000000"/>
-                <w:sz w:val="14"/>
-              </w:rPr>
-              <w:t>0,9000</w:t>
-            </w:r>
-          </w:p>
-        </w:tc>
-        <w:tc>
-          <w:tcPr>
-            <w:tcW w:type="dxa" w:w="1094"/>
-            <w:tcMar>
-              <w:top w:w="60" w:type="dxa"/>
-              <w:start w:w="80" w:type="dxa"/>
-              <w:bottom w:w="60" w:type="dxa"/>
-              <w:end w:w="80" w:type="dxa"/>
-            </w:tcMar>
-            <w:vAlign w:val="center"/>
-          </w:tcPr>
-          <w:p>
-            <w:pPr>
-              <w:spacing w:after="0"/>
-              <w:jc w:val="center"/>
-            </w:pPr>
-            <w:r/>
-            <w:r>
-              <w:rPr>
-                <w:rFonts w:ascii="Times New Roman" w:hAnsi="Times New Roman"/>
-                <w:b w:val="0"/>
-                <w:i w:val="0"/>
-                <w:color w:val="000000"/>
-                <w:sz w:val="14"/>
-              </w:rPr>
-              <w:t>0,9000</w:t>
-            </w:r>
-          </w:p>
-        </w:tc>
-        <w:tc>
-          <w:tcPr>
-            <w:tcW w:type="dxa" w:w="1094"/>
-            <w:tcMar>
-              <w:top w:w="60" w:type="dxa"/>
-              <w:start w:w="80" w:type="dxa"/>
-              <w:bottom w:w="60" w:type="dxa"/>
-              <w:end w:w="80" w:type="dxa"/>
-            </w:tcMar>
-            <w:vAlign w:val="center"/>
-          </w:tcPr>
-          <w:p>
-            <w:pPr>
-              <w:spacing w:after="0"/>
-              <w:jc w:val="center"/>
-            </w:pPr>
-            <w:r/>
-            <w:r>
-              <w:rPr>
-                <w:rFonts w:ascii="Times New Roman" w:hAnsi="Times New Roman"/>
-                <w:b w:val="0"/>
-                <w:i w:val="0"/>
-                <w:color w:val="000000"/>
-                <w:sz w:val="14"/>
-              </w:rPr>
-              <w:t>0,9000</w:t>
-            </w:r>
-          </w:p>
-        </w:tc>
-        <w:tc>
-          <w:tcPr>
-            <w:tcW w:type="dxa" w:w="1096"/>
-            <w:tcMar>
-              <w:top w:w="60" w:type="dxa"/>
-              <w:start w:w="80" w:type="dxa"/>
-              <w:bottom w:w="60" w:type="dxa"/>
-              <w:end w:w="80" w:type="dxa"/>
-            </w:tcMar>
-            <w:vAlign w:val="center"/>
-          </w:tcPr>
-          <w:p>
-            <w:pPr>
-              <w:spacing w:after="0"/>
-              <w:jc w:val="center"/>
-            </w:pPr>
-            <w:r/>
-            <w:r>
-              <w:rPr>
-                <w:rFonts w:ascii="Times New Roman" w:hAnsi="Times New Roman"/>
-                <w:b w:val="0"/>
-                <w:i w:val="0"/>
-                <w:color w:val="000000"/>
-                <w:sz w:val="14"/>
-              </w:rPr>
-              <w:t>-</w:t>
-            </w:r>
-          </w:p>
-        </w:tc>
-      </w:tr>
-      <w:tr>
-        <w:tc>
-          <w:tcPr>
-            <w:tcW w:type="dxa" w:w="2600"/>
-            <w:tcMar>
-              <w:top w:w="60" w:type="dxa"/>
-              <w:start w:w="80" w:type="dxa"/>
-              <w:bottom w:w="60" w:type="dxa"/>
-              <w:end w:w="80" w:type="dxa"/>
-            </w:tcMar>
-            <w:vAlign w:val="center"/>
-          </w:tcPr>
-          <w:p>
-            <w:pPr>
-              <w:spacing w:after="0"/>
-              <w:jc w:val="left"/>
-            </w:pPr>
-            <w:r/>
-            <w:r>
-              <w:rPr>
-                <w:rFonts w:ascii="Times New Roman" w:hAnsi="Times New Roman"/>
-                <w:b w:val="0"/>
-                <w:i w:val="0"/>
-                <w:color w:val="000000"/>
-                <w:sz w:val="14"/>
-              </w:rPr>
-              <w:t>Ujkani et al. [8]</w:t>
-            </w:r>
-          </w:p>
-        </w:tc>
-        <w:tc>
-          <w:tcPr>
-            <w:tcW w:type="dxa" w:w="1094"/>
-            <w:tcMar>
-              <w:top w:w="60" w:type="dxa"/>
-              <w:start w:w="80" w:type="dxa"/>
-              <w:bottom w:w="60" w:type="dxa"/>
-              <w:end w:w="80" w:type="dxa"/>
-            </w:tcMar>
-            <w:vAlign w:val="center"/>
-          </w:tcPr>
-          <w:p>
-            <w:pPr>
-              <w:spacing w:after="0"/>
-              <w:jc w:val="center"/>
-            </w:pPr>
-            <w:r/>
-            <w:r>
-              <w:rPr>
-                <w:rFonts w:ascii="Times New Roman" w:hAnsi="Times New Roman"/>
-                <w:b w:val="0"/>
-                <w:i/>
-                <w:color w:val="000000"/>
-                <w:sz w:val="14"/>
-              </w:rPr>
-              <w:t>Fail</w:t>
-            </w:r>
-            <w:r>
-              <w:rPr>
-                <w:rFonts w:ascii="Times New Roman" w:hAnsi="Times New Roman"/>
-                <w:b w:val="0"/>
-                <w:i w:val="0"/>
-                <w:color w:val="000000"/>
-                <w:sz w:val="14"/>
-              </w:rPr>
-              <w:t xml:space="preserve"> + </w:t>
-            </w:r>
-            <w:r>
-              <w:rPr>
-                <w:rFonts w:ascii="Times New Roman" w:hAnsi="Times New Roman"/>
-                <w:b w:val="0"/>
-                <w:i/>
-                <w:color w:val="000000"/>
-                <w:sz w:val="14"/>
-              </w:rPr>
-              <w:t>Withdrawn</w:t>
-            </w:r>
-            <w:r>
-              <w:rPr>
-                <w:rFonts w:ascii="Times New Roman" w:hAnsi="Times New Roman"/>
-                <w:b w:val="0"/>
-                <w:i w:val="0"/>
-                <w:color w:val="000000"/>
-                <w:sz w:val="14"/>
-              </w:rPr>
-              <w:t xml:space="preserve"> sebagai at-risk</w:t>
-            </w:r>
-          </w:p>
-        </w:tc>
-        <w:tc>
-          <w:tcPr>
-            <w:tcW w:type="dxa" w:w="1094"/>
-            <w:tcMar>
-              <w:top w:w="60" w:type="dxa"/>
-              <w:start w:w="80" w:type="dxa"/>
-              <w:bottom w:w="60" w:type="dxa"/>
-              <w:end w:w="80" w:type="dxa"/>
-            </w:tcMar>
-            <w:vAlign w:val="center"/>
-          </w:tcPr>
-          <w:p>
-            <w:pPr>
-              <w:spacing w:after="0"/>
-              <w:jc w:val="center"/>
-            </w:pPr>
-            <w:r/>
-            <w:r>
-              <w:rPr>
-                <w:rFonts w:ascii="Times New Roman" w:hAnsi="Times New Roman"/>
-                <w:b w:val="0"/>
-                <w:i w:val="0"/>
-                <w:color w:val="000000"/>
-                <w:sz w:val="14"/>
-              </w:rPr>
-              <w:t>Custom Neural Network</w:t>
-            </w:r>
-          </w:p>
-        </w:tc>
-        <w:tc>
-          <w:tcPr>
-            <w:tcW w:type="dxa" w:w="1094"/>
-            <w:tcMar>
-              <w:top w:w="60" w:type="dxa"/>
-              <w:start w:w="80" w:type="dxa"/>
-              <w:bottom w:w="60" w:type="dxa"/>
-              <w:end w:w="80" w:type="dxa"/>
-            </w:tcMar>
-            <w:vAlign w:val="center"/>
-          </w:tcPr>
-          <w:p>
-            <w:pPr>
-              <w:spacing w:after="0"/>
-              <w:jc w:val="center"/>
-            </w:pPr>
-            <w:r/>
-            <w:r>
-              <w:rPr>
-                <w:rFonts w:ascii="Times New Roman" w:hAnsi="Times New Roman"/>
-                <w:b w:val="0"/>
-                <w:i w:val="0"/>
-                <w:color w:val="000000"/>
-                <w:sz w:val="14"/>
-              </w:rPr>
-              <w:t>0,9300</w:t>
-            </w:r>
-          </w:p>
-        </w:tc>
-        <w:tc>
-          <w:tcPr>
-            <w:tcW w:type="dxa" w:w="1094"/>
-            <w:tcMar>
-              <w:top w:w="60" w:type="dxa"/>
-              <w:start w:w="80" w:type="dxa"/>
-              <w:bottom w:w="60" w:type="dxa"/>
-              <w:end w:w="80" w:type="dxa"/>
-            </w:tcMar>
-            <w:vAlign w:val="center"/>
-          </w:tcPr>
-          <w:p>
-            <w:pPr>
-              <w:spacing w:after="0"/>
-              <w:jc w:val="center"/>
-            </w:pPr>
-            <w:r/>
-            <w:r>
-              <w:rPr>
-                <w:rFonts w:ascii="Times New Roman" w:hAnsi="Times New Roman"/>
-                <w:b w:val="0"/>
-                <w:i w:val="0"/>
-                <w:color w:val="000000"/>
-                <w:sz w:val="14"/>
-              </w:rPr>
-              <w:t>0,9500</w:t>
-            </w:r>
-          </w:p>
-        </w:tc>
-        <w:tc>
-          <w:tcPr>
-            <w:tcW w:type="dxa" w:w="1094"/>
-            <w:tcMar>
-              <w:top w:w="60" w:type="dxa"/>
-              <w:start w:w="80" w:type="dxa"/>
-              <w:bottom w:w="60" w:type="dxa"/>
-              <w:end w:w="80" w:type="dxa"/>
-            </w:tcMar>
-            <w:vAlign w:val="center"/>
-          </w:tcPr>
-          <w:p>
-            <w:pPr>
-              <w:spacing w:after="0"/>
-              <w:jc w:val="center"/>
-            </w:pPr>
-            <w:r/>
-            <w:r>
-              <w:rPr>
-                <w:rFonts w:ascii="Times New Roman" w:hAnsi="Times New Roman"/>
-                <w:b w:val="0"/>
-                <w:i w:val="0"/>
-                <w:color w:val="000000"/>
-                <w:sz w:val="14"/>
-              </w:rPr>
-              <w:t>0,9700</w:t>
-            </w:r>
-          </w:p>
-        </w:tc>
-        <w:tc>
-          <w:tcPr>
-            <w:tcW w:type="dxa" w:w="1094"/>
-            <w:tcMar>
-              <w:top w:w="60" w:type="dxa"/>
-              <w:start w:w="80" w:type="dxa"/>
-              <w:bottom w:w="60" w:type="dxa"/>
-              <w:end w:w="80" w:type="dxa"/>
-            </w:tcMar>
-            <w:vAlign w:val="center"/>
-          </w:tcPr>
-          <w:p>
-            <w:pPr>
-              <w:spacing w:after="0"/>
-              <w:jc w:val="center"/>
-            </w:pPr>
-            <w:r/>
-            <w:r>
-              <w:rPr>
-                <w:rFonts w:ascii="Times New Roman" w:hAnsi="Times New Roman"/>
-                <w:b w:val="0"/>
-                <w:i w:val="0"/>
-                <w:color w:val="000000"/>
-                <w:sz w:val="14"/>
-              </w:rPr>
-              <w:t>0,9600</w:t>
-            </w:r>
-          </w:p>
-        </w:tc>
-        <w:tc>
-          <w:tcPr>
-            <w:tcW w:type="dxa" w:w="1096"/>
-            <w:tcMar>
-              <w:top w:w="60" w:type="dxa"/>
-              <w:start w:w="80" w:type="dxa"/>
-              <w:bottom w:w="60" w:type="dxa"/>
-              <w:end w:w="80" w:type="dxa"/>
-            </w:tcMar>
-            <w:vAlign w:val="center"/>
-          </w:tcPr>
-          <w:p>
-            <w:pPr>
-              <w:spacing w:after="0"/>
-              <w:jc w:val="center"/>
-            </w:pPr>
-            <w:r/>
-            <w:r>
-              <w:rPr>
-                <w:rFonts w:ascii="Times New Roman" w:hAnsi="Times New Roman"/>
-                <w:b w:val="0"/>
-                <w:i w:val="0"/>
-                <w:color w:val="000000"/>
-                <w:sz w:val="14"/>
-              </w:rPr>
-              <w:t>-</w:t>
-            </w:r>
-          </w:p>
-        </w:tc>
-      </w:tr>
-      <w:tr>
-        <w:tc>
-          <w:tcPr>
-            <w:tcW w:type="dxa" w:w="2600"/>
-            <w:tcMar>
-              <w:top w:w="60" w:type="dxa"/>
-              <w:start w:w="80" w:type="dxa"/>
-              <w:bottom w:w="60" w:type="dxa"/>
-              <w:end w:w="80" w:type="dxa"/>
-            </w:tcMar>
-            <w:vAlign w:val="center"/>
-          </w:tcPr>
-          <w:p>
-            <w:pPr>
-              <w:spacing w:after="0"/>
-              <w:jc w:val="left"/>
-            </w:pPr>
-            <w:r/>
-            <w:r>
-              <w:rPr>
-                <w:rFonts w:ascii="Times New Roman" w:hAnsi="Times New Roman"/>
-                <w:b w:val="0"/>
-                <w:i w:val="0"/>
-                <w:color w:val="000000"/>
-                <w:sz w:val="14"/>
-              </w:rPr>
-              <w:t>Alnasyan et al. [9]</w:t>
-            </w:r>
-          </w:p>
-        </w:tc>
-        <w:tc>
-          <w:tcPr>
-            <w:tcW w:type="dxa" w:w="1094"/>
-            <w:tcMar>
-              <w:top w:w="60" w:type="dxa"/>
-              <w:start w:w="80" w:type="dxa"/>
-              <w:bottom w:w="60" w:type="dxa"/>
-              <w:end w:w="80" w:type="dxa"/>
-            </w:tcMar>
-            <w:vAlign w:val="center"/>
-          </w:tcPr>
-          <w:p>
-            <w:pPr>
-              <w:spacing w:after="0"/>
-              <w:jc w:val="center"/>
-            </w:pPr>
-            <w:r/>
-            <w:r>
-              <w:rPr>
-                <w:rFonts w:ascii="Times New Roman" w:hAnsi="Times New Roman"/>
-                <w:b w:val="0"/>
-                <w:i/>
-                <w:color w:val="000000"/>
-                <w:sz w:val="14"/>
-              </w:rPr>
-              <w:t>Pass</w:t>
-            </w:r>
-            <w:r>
-              <w:rPr>
-                <w:rFonts w:ascii="Times New Roman" w:hAnsi="Times New Roman"/>
-                <w:b w:val="0"/>
-                <w:i w:val="0"/>
-                <w:color w:val="000000"/>
-                <w:sz w:val="14"/>
-              </w:rPr>
-              <w:t xml:space="preserve"> + </w:t>
-            </w:r>
-            <w:r>
-              <w:rPr>
-                <w:rFonts w:ascii="Times New Roman" w:hAnsi="Times New Roman"/>
-                <w:b w:val="0"/>
-                <w:i/>
-                <w:color w:val="000000"/>
-                <w:sz w:val="14"/>
-              </w:rPr>
-              <w:t>Distinction</w:t>
-            </w:r>
-            <w:r>
-              <w:rPr>
-                <w:rFonts w:ascii="Times New Roman" w:hAnsi="Times New Roman"/>
-                <w:b w:val="0"/>
-                <w:i w:val="0"/>
-                <w:color w:val="000000"/>
-                <w:sz w:val="14"/>
-              </w:rPr>
-              <w:t xml:space="preserve"> vs </w:t>
-            </w:r>
-            <w:r>
-              <w:rPr>
-                <w:rFonts w:ascii="Times New Roman" w:hAnsi="Times New Roman"/>
-                <w:b w:val="0"/>
-                <w:i/>
-                <w:color w:val="000000"/>
-                <w:sz w:val="14"/>
-              </w:rPr>
-              <w:t>Fail</w:t>
-            </w:r>
-            <w:r>
-              <w:rPr>
-                <w:rFonts w:ascii="Times New Roman" w:hAnsi="Times New Roman"/>
-                <w:b w:val="0"/>
-                <w:i w:val="0"/>
-                <w:color w:val="000000"/>
-                <w:sz w:val="14"/>
-              </w:rPr>
-              <w:t xml:space="preserve"> + </w:t>
-            </w:r>
-            <w:r>
-              <w:rPr>
-                <w:rFonts w:ascii="Times New Roman" w:hAnsi="Times New Roman"/>
-                <w:b w:val="0"/>
-                <w:i/>
-                <w:color w:val="000000"/>
-                <w:sz w:val="14"/>
-              </w:rPr>
-              <w:t>Withdrawn</w:t>
-            </w:r>
-          </w:p>
-        </w:tc>
-        <w:tc>
-          <w:tcPr>
-            <w:tcW w:type="dxa" w:w="1094"/>
-            <w:tcMar>
-              <w:top w:w="60" w:type="dxa"/>
-              <w:start w:w="80" w:type="dxa"/>
-              <w:bottom w:w="60" w:type="dxa"/>
-              <w:end w:w="80" w:type="dxa"/>
-            </w:tcMar>
-            <w:vAlign w:val="center"/>
-          </w:tcPr>
-          <w:p>
-            <w:pPr>
-              <w:spacing w:after="0"/>
-              <w:jc w:val="center"/>
-            </w:pPr>
-            <w:r/>
-            <w:r>
-              <w:rPr>
-                <w:rFonts w:ascii="Times New Roman" w:hAnsi="Times New Roman"/>
-                <w:b w:val="0"/>
-                <w:i w:val="0"/>
-                <w:color w:val="000000"/>
-                <w:sz w:val="14"/>
-              </w:rPr>
-              <w:t>KANFormer</w:t>
-            </w:r>
-          </w:p>
-        </w:tc>
-        <w:tc>
-          <w:tcPr>
-            <w:tcW w:type="dxa" w:w="1094"/>
-            <w:tcMar>
-              <w:top w:w="60" w:type="dxa"/>
-              <w:start w:w="80" w:type="dxa"/>
-              <w:bottom w:w="60" w:type="dxa"/>
-              <w:end w:w="80" w:type="dxa"/>
-            </w:tcMar>
-            <w:vAlign w:val="center"/>
-          </w:tcPr>
-          <w:p>
-            <w:pPr>
-              <w:spacing w:after="0"/>
-              <w:jc w:val="center"/>
-            </w:pPr>
-            <w:r/>
-            <w:r>
-              <w:rPr>
-                <w:rFonts w:ascii="Times New Roman" w:hAnsi="Times New Roman"/>
-                <w:b w:val="0"/>
-                <w:i w:val="0"/>
-                <w:color w:val="000000"/>
-                <w:sz w:val="14"/>
-              </w:rPr>
-              <w:t>0,9459</w:t>
-            </w:r>
-          </w:p>
-        </w:tc>
-        <w:tc>
-          <w:tcPr>
-            <w:tcW w:type="dxa" w:w="1094"/>
-            <w:tcMar>
-              <w:top w:w="60" w:type="dxa"/>
-              <w:start w:w="80" w:type="dxa"/>
-              <w:bottom w:w="60" w:type="dxa"/>
-              <w:end w:w="80" w:type="dxa"/>
-            </w:tcMar>
-            <w:vAlign w:val="center"/>
-          </w:tcPr>
-          <w:p>
-            <w:pPr>
-              <w:spacing w:after="0"/>
-              <w:jc w:val="center"/>
-            </w:pPr>
-            <w:r/>
-            <w:r>
-              <w:rPr>
-                <w:rFonts w:ascii="Times New Roman" w:hAnsi="Times New Roman"/>
-                <w:b w:val="0"/>
-                <w:i w:val="0"/>
-                <w:color w:val="000000"/>
-                <w:sz w:val="14"/>
-              </w:rPr>
-              <w:t>0,9495</w:t>
-            </w:r>
-          </w:p>
-        </w:tc>
-        <w:tc>
-          <w:tcPr>
-            <w:tcW w:type="dxa" w:w="1094"/>
-            <w:tcMar>
-              <w:top w:w="60" w:type="dxa"/>
-              <w:start w:w="80" w:type="dxa"/>
-              <w:bottom w:w="60" w:type="dxa"/>
-              <w:end w:w="80" w:type="dxa"/>
-            </w:tcMar>
-            <w:vAlign w:val="center"/>
-          </w:tcPr>
-          <w:p>
-            <w:pPr>
-              <w:spacing w:after="0"/>
-              <w:jc w:val="center"/>
-            </w:pPr>
-            <w:r/>
-            <w:r>
-              <w:rPr>
-                <w:rFonts w:ascii="Times New Roman" w:hAnsi="Times New Roman"/>
-                <w:b w:val="0"/>
-                <w:i w:val="0"/>
-                <w:color w:val="000000"/>
-                <w:sz w:val="14"/>
-              </w:rPr>
-              <w:t>0,9482</w:t>
-            </w:r>
-          </w:p>
-        </w:tc>
-        <w:tc>
-          <w:tcPr>
-            <w:tcW w:type="dxa" w:w="1094"/>
-            <w:tcMar>
-              <w:top w:w="60" w:type="dxa"/>
-              <w:start w:w="80" w:type="dxa"/>
-              <w:bottom w:w="60" w:type="dxa"/>
-              <w:end w:w="80" w:type="dxa"/>
-            </w:tcMar>
-            <w:vAlign w:val="center"/>
-          </w:tcPr>
-          <w:p>
-            <w:pPr>
-              <w:spacing w:after="0"/>
-              <w:jc w:val="center"/>
-            </w:pPr>
-            <w:r/>
-            <w:r>
-              <w:rPr>
-                <w:rFonts w:ascii="Times New Roman" w:hAnsi="Times New Roman"/>
-                <w:b w:val="0"/>
-                <w:i w:val="0"/>
-                <w:color w:val="000000"/>
-                <w:sz w:val="14"/>
-              </w:rPr>
-              <w:t>0,9481</w:t>
-            </w:r>
-          </w:p>
-        </w:tc>
-        <w:tc>
-          <w:tcPr>
-            <w:tcW w:type="dxa" w:w="1096"/>
-            <w:tcMar>
-              <w:top w:w="60" w:type="dxa"/>
-              <w:start w:w="80" w:type="dxa"/>
-              <w:bottom w:w="60" w:type="dxa"/>
-              <w:end w:w="80" w:type="dxa"/>
-            </w:tcMar>
-            <w:vAlign w:val="center"/>
-          </w:tcPr>
-          <w:p>
-            <w:pPr>
-              <w:spacing w:after="0"/>
-              <w:jc w:val="center"/>
-            </w:pPr>
-            <w:r/>
-            <w:r>
-              <w:rPr>
-                <w:rFonts w:ascii="Times New Roman" w:hAnsi="Times New Roman"/>
-                <w:b w:val="0"/>
-                <w:i w:val="0"/>
-                <w:color w:val="000000"/>
-                <w:sz w:val="14"/>
-              </w:rPr>
-              <w:t>0,9835</w:t>
-            </w:r>
-          </w:p>
-        </w:tc>
-      </w:tr>
-      <w:tr>
-        <w:tc>
-          <w:tcPr>
-            <w:tcW w:type="dxa" w:w="2600"/>
-            <w:tcMar>
-              <w:top w:w="60" w:type="dxa"/>
-              <w:start w:w="80" w:type="dxa"/>
-              <w:bottom w:w="60" w:type="dxa"/>
-              <w:end w:w="80" w:type="dxa"/>
-            </w:tcMar>
-            <w:vAlign w:val="center"/>
-          </w:tcPr>
-          <w:p>
-            <w:pPr>
-              <w:spacing w:after="0"/>
-              <w:jc w:val="left"/>
-            </w:pPr>
-            <w:r/>
-            <w:r>
-              <w:rPr>
-                <w:rFonts w:ascii="Times New Roman" w:hAnsi="Times New Roman"/>
-                <w:b w:val="0"/>
-                <w:i w:val="0"/>
-                <w:color w:val="000000"/>
-                <w:sz w:val="14"/>
-              </w:rPr>
-              <w:t>Penelitian ini</w:t>
-            </w:r>
-          </w:p>
-        </w:tc>
-        <w:tc>
-          <w:tcPr>
-            <w:tcW w:type="dxa" w:w="1094"/>
-            <w:tcMar>
-              <w:top w:w="60" w:type="dxa"/>
-              <w:start w:w="80" w:type="dxa"/>
-              <w:bottom w:w="60" w:type="dxa"/>
-              <w:end w:w="80" w:type="dxa"/>
-            </w:tcMar>
-            <w:vAlign w:val="center"/>
-          </w:tcPr>
-          <w:p>
-            <w:pPr>
-              <w:spacing w:after="0"/>
-              <w:jc w:val="center"/>
-            </w:pPr>
-            <w:r/>
-            <w:r>
-              <w:rPr>
-                <w:rFonts w:ascii="Times New Roman" w:hAnsi="Times New Roman"/>
-                <w:b w:val="0"/>
-                <w:i w:val="0"/>
-                <w:color w:val="000000"/>
-                <w:sz w:val="14"/>
-              </w:rPr>
-              <w:t>Cut-off hari ke-28, group split</w:t>
-            </w:r>
-          </w:p>
-        </w:tc>
-        <w:tc>
-          <w:tcPr>
-            <w:tcW w:type="dxa" w:w="1094"/>
-            <w:tcMar>
-              <w:top w:w="60" w:type="dxa"/>
-              <w:start w:w="80" w:type="dxa"/>
-              <w:bottom w:w="60" w:type="dxa"/>
-              <w:end w:w="80" w:type="dxa"/>
-            </w:tcMar>
-            <w:vAlign w:val="center"/>
-          </w:tcPr>
-          <w:p>
-            <w:pPr>
-              <w:spacing w:after="0"/>
-              <w:jc w:val="center"/>
-            </w:pPr>
-            <w:r/>
-            <w:r>
-              <w:rPr>
-                <w:rFonts w:ascii="Times New Roman" w:hAnsi="Times New Roman"/>
-                <w:b w:val="0"/>
-                <w:i w:val="0"/>
-                <w:color w:val="000000"/>
-                <w:sz w:val="14"/>
-              </w:rPr>
-              <w:t>Random Forest</w:t>
-            </w:r>
-          </w:p>
-        </w:tc>
-        <w:tc>
-          <w:tcPr>
-            <w:tcW w:type="dxa" w:w="1094"/>
-            <w:tcMar>
-              <w:top w:w="60" w:type="dxa"/>
-              <w:start w:w="80" w:type="dxa"/>
-              <w:bottom w:w="60" w:type="dxa"/>
-              <w:end w:w="80" w:type="dxa"/>
-            </w:tcMar>
-            <w:vAlign w:val="center"/>
-          </w:tcPr>
-          <w:p>
-            <w:pPr>
-              <w:spacing w:after="0"/>
-              <w:jc w:val="center"/>
-            </w:pPr>
-            <w:r/>
-            <w:r>
-              <w:rPr>
-                <w:rFonts w:ascii="Times New Roman" w:hAnsi="Times New Roman"/>
-                <w:b w:val="0"/>
-                <w:i w:val="0"/>
-                <w:color w:val="000000"/>
-                <w:sz w:val="14"/>
-              </w:rPr>
-              <w:t>0,7594</w:t>
-            </w:r>
-          </w:p>
-        </w:tc>
-        <w:tc>
-          <w:tcPr>
-            <w:tcW w:type="dxa" w:w="1094"/>
-            <w:tcMar>
-              <w:top w:w="60" w:type="dxa"/>
-              <w:start w:w="80" w:type="dxa"/>
-              <w:bottom w:w="60" w:type="dxa"/>
-              <w:end w:w="80" w:type="dxa"/>
-            </w:tcMar>
-            <w:vAlign w:val="center"/>
-          </w:tcPr>
-          <w:p>
-            <w:pPr>
-              <w:spacing w:after="0"/>
-              <w:jc w:val="center"/>
-            </w:pPr>
-            <w:r/>
-            <w:r>
-              <w:rPr>
-                <w:rFonts w:ascii="Times New Roman" w:hAnsi="Times New Roman"/>
-                <w:b w:val="0"/>
-                <w:i w:val="0"/>
-                <w:color w:val="000000"/>
-                <w:sz w:val="14"/>
-              </w:rPr>
-              <w:t>0,8007</w:t>
-            </w:r>
-          </w:p>
-        </w:tc>
-        <w:tc>
-          <w:tcPr>
-            <w:tcW w:type="dxa" w:w="1094"/>
-            <w:tcMar>
-              <w:top w:w="60" w:type="dxa"/>
-              <w:start w:w="80" w:type="dxa"/>
-              <w:bottom w:w="60" w:type="dxa"/>
-              <w:end w:w="80" w:type="dxa"/>
-            </w:tcMar>
-            <w:vAlign w:val="center"/>
-          </w:tcPr>
-          <w:p>
-            <w:pPr>
-              <w:spacing w:after="0"/>
-              <w:jc w:val="center"/>
-            </w:pPr>
-            <w:r/>
-            <w:r>
-              <w:rPr>
-                <w:rFonts w:ascii="Times New Roman" w:hAnsi="Times New Roman"/>
-                <w:b w:val="0"/>
-                <w:i w:val="0"/>
-                <w:color w:val="000000"/>
-                <w:sz w:val="14"/>
-              </w:rPr>
-              <w:t>0,7213</w:t>
-            </w:r>
-          </w:p>
-        </w:tc>
-        <w:tc>
-          <w:tcPr>
-            <w:tcW w:type="dxa" w:w="1094"/>
-            <w:tcMar>
-              <w:top w:w="60" w:type="dxa"/>
-              <w:start w:w="80" w:type="dxa"/>
-              <w:bottom w:w="60" w:type="dxa"/>
-              <w:end w:w="80" w:type="dxa"/>
-            </w:tcMar>
-            <w:vAlign w:val="center"/>
-          </w:tcPr>
-          <w:p>
-            <w:pPr>
-              <w:spacing w:after="0"/>
-              <w:jc w:val="center"/>
-            </w:pPr>
-            <w:r/>
-            <w:r>
-              <w:rPr>
-                <w:rFonts w:ascii="Times New Roman" w:hAnsi="Times New Roman"/>
-                <w:b w:val="0"/>
-                <w:i w:val="0"/>
-                <w:color w:val="000000"/>
-                <w:sz w:val="14"/>
+                <w:sz w:val="13"/>
               </w:rPr>
               <w:t>0,7589</w:t>
             </w:r>
           </w:p>
         </w:tc>
-        <w:tc>
-          <w:tcPr>
-            <w:tcW w:type="dxa" w:w="1096"/>
-            <w:tcMar>
-              <w:top w:w="60" w:type="dxa"/>
-              <w:start w:w="80" w:type="dxa"/>
-              <w:bottom w:w="60" w:type="dxa"/>
-              <w:end w:w="80" w:type="dxa"/>
-            </w:tcMar>
-            <w:vAlign w:val="center"/>
-          </w:tcPr>
-          <w:p>
-            <w:pPr>
-              <w:spacing w:after="0"/>
-              <w:jc w:val="center"/>
-            </w:pPr>
-            <w:r/>
-            <w:r>
-              <w:rPr>
-                <w:rFonts w:ascii="Times New Roman" w:hAnsi="Times New Roman"/>
-                <w:b w:val="0"/>
-                <w:i w:val="0"/>
-                <w:color w:val="000000"/>
-                <w:sz w:val="14"/>
-              </w:rPr>
-              <w:t>0,8396</w:t>
-            </w:r>
-          </w:p>
-        </w:tc>
       </w:tr>
     </w:tbl>
-    <w:p>
-      <w:pPr>
-        <w:sectPr>
-          <w:type w:val="continuous"/>
-          <w:pgSz w:w="12240" w:h="15840"/>
-          <w:pgMar w:top="936" w:right="936" w:bottom="936" w:left="936" w:header="432" w:footer="432" w:gutter="0"/>
-          <w:cols w:space="360" w:num="1" w:equalWidth="1"/>
-          <w:docGrid w:linePitch="360"/>
-        </w:sectPr>
-      </w:pPr>
-    </w:p>
     <w:p>
       <w:pPr>
         <w:spacing w:before="0" w:after="140" w:line="240" w:lineRule="auto"/>
@@ -7402,7 +6043,7 @@
       <w:pPr>
         <w:pStyle w:val="Heading2"/>
         <w:keepNext/>
-        <w:spacing w:before="100" w:after="40"/>
+        <w:spacing w:before="80" w:after="20"/>
         <w:jc w:val="left"/>
       </w:pPr>
       <w:r>
@@ -7412,12 +6053,12 @@
           <w:color w:val="000000"/>
           <w:sz w:val="20"/>
         </w:rPr>
-        <w:t>E. Knowledge-Based Risk Layer</w:t>
+        <w:t>F. Knowledge-Based Risk Layer and BI Output</w:t>
       </w:r>
     </w:p>
     <w:p>
       <w:pPr>
-        <w:spacing w:before="0" w:after="60" w:line="240" w:lineRule="auto"/>
+        <w:spacing w:before="0" w:after="20" w:line="240" w:lineRule="auto"/>
         <w:ind w:firstLine="259"/>
         <w:jc w:val="both"/>
       </w:pPr>
@@ -7429,7 +6070,7 @@
           <w:color w:val="000000"/>
           <w:sz w:val="20"/>
         </w:rPr>
-        <w:t xml:space="preserve">Threshold kuartil bawah data train-validation adalah skor assessment 0, jumlah assessment 0, total klik VLE 47, dan hari aktif VLE 4. Nilai nol pada indikator assessment menunjukkan bahwa sebagian mahasiswa belum mengumpulkan assessment sampai akhir minggu keempat. Knowledge layer menghasilkan 1.816 </w:t>
+        <w:t xml:space="preserve">Threshold kuartil bawah train-validation adalah skor assessment 0, jumlah assessment 0, total klik VLE 47, dan hari aktif VLE 4. Knowledge layer menghasilkan 1.816 </w:t>
       </w:r>
       <w:r>
         <w:rPr>
@@ -7489,15 +6130,18 @@
           <w:color w:val="000000"/>
           <w:sz w:val="20"/>
         </w:rPr>
-        <w:t xml:space="preserve"> pada hold-out test.</w:t>
-      </w:r>
-    </w:p>
-    <w:p>
-      <w:pPr>
-        <w:spacing w:before="0" w:after="60" w:line="240" w:lineRule="auto"/>
-        <w:ind w:firstLine="259"/>
-        <w:jc w:val="both"/>
-      </w:pPr>
+        <w:t xml:space="preserve">. Ketika </w:t>
+      </w:r>
+      <w:r>
+        <w:rPr>
+          <w:rFonts w:ascii="Times New Roman" w:hAnsi="Times New Roman"/>
+          <w:b w:val="0"/>
+          <w:i/>
+          <w:color w:val="000000"/>
+          <w:sz w:val="20"/>
+        </w:rPr>
+        <w:t>High Risk</w:t>
+      </w:r>
       <w:r>
         <w:rPr>
           <w:rFonts w:ascii="Times New Roman" w:hAnsi="Times New Roman"/>
@@ -7506,7 +6150,47 @@
           <w:color w:val="000000"/>
           <w:sz w:val="20"/>
         </w:rPr>
-        <w:t>Tabel IV membandingkan Random Forest dengan sistem gabungan. Knowledge layer meningkatkan recall dari 0,7213 menjadi 0,7866. Precision berubah dari 0,8007 menjadi 0,7043, sedangkan accuracy berubah dari 0,7594 menjadi 0,7146. Perubahan tersebut menunjukkan perluasan cakupan deteksi disertai peningkatan jumlah alarm yang memerlukan verifikasi stakeholder.</w:t>
+        <w:t xml:space="preserve"> serta </w:t>
+      </w:r>
+      <w:r>
+        <w:rPr>
+          <w:rFonts w:ascii="Times New Roman" w:hAnsi="Times New Roman"/>
+          <w:b w:val="0"/>
+          <w:i/>
+          <w:color w:val="000000"/>
+          <w:sz w:val="20"/>
+        </w:rPr>
+        <w:t>Medium Risk</w:t>
+      </w:r>
+      <w:r>
+        <w:rPr>
+          <w:rFonts w:ascii="Times New Roman" w:hAnsi="Times New Roman"/>
+          <w:b w:val="0"/>
+          <w:i w:val="0"/>
+          <w:color w:val="000000"/>
+          <w:sz w:val="20"/>
+        </w:rPr>
+        <w:t xml:space="preserve"> dipetakan sebagai alarm </w:t>
+      </w:r>
+      <w:r>
+        <w:rPr>
+          <w:rFonts w:ascii="Times New Roman" w:hAnsi="Times New Roman"/>
+          <w:b w:val="0"/>
+          <w:i/>
+          <w:color w:val="000000"/>
+          <w:sz w:val="20"/>
+        </w:rPr>
+        <w:t>AtRisk</w:t>
+      </w:r>
+      <w:r>
+        <w:rPr>
+          <w:rFonts w:ascii="Times New Roman" w:hAnsi="Times New Roman"/>
+          <w:b w:val="0"/>
+          <w:i w:val="0"/>
+          <w:color w:val="000000"/>
+          <w:sz w:val="20"/>
+        </w:rPr>
+        <w:t>, recall meningkat dari 0,7213 menjadi 0,7866; precision berubah dari 0,8007 menjadi 0,7043. Perubahan tersebut memperluas cakupan alarm dan menambah kebutuhan verifikasi stakeholder.</w:t>
       </w:r>
     </w:p>
     <w:p>
@@ -8005,24 +6689,7 @@
     </w:p>
     <w:p>
       <w:pPr>
-        <w:pStyle w:val="Heading2"/>
-        <w:keepNext/>
-        <w:spacing w:before="100" w:after="40"/>
-        <w:jc w:val="left"/>
-      </w:pPr>
-      <w:r>
-        <w:rPr>
-          <w:rFonts w:ascii="Times New Roman" w:hAnsi="Times New Roman"/>
-          <w:i/>
-          <w:color w:val="000000"/>
-          <w:sz w:val="20"/>
-        </w:rPr>
-        <w:t>F. Business Intelligence Output</w:t>
-      </w:r>
-    </w:p>
-    <w:p>
-      <w:pPr>
-        <w:spacing w:before="0" w:after="60" w:line="240" w:lineRule="auto"/>
+        <w:spacing w:before="0" w:after="20" w:line="240" w:lineRule="auto"/>
         <w:ind w:firstLine="259"/>
         <w:jc w:val="both"/>
       </w:pPr>
@@ -8034,7 +6701,7 @@
           <w:color w:val="000000"/>
           <w:sz w:val="20"/>
         </w:rPr>
-        <w:t xml:space="preserve">Dashboard mengidentifikasi 3.795 student-module-presentation dalam antrean </w:t>
+        <w:t xml:space="preserve">Dashboard pada Fig. 5 mengidentifikasi 3.795 student-module-presentation dalam antrean </w:t>
       </w:r>
       <w:r>
         <w:rPr>
@@ -8074,7 +6741,7 @@
           <w:color w:val="000000"/>
           <w:sz w:val="20"/>
         </w:rPr>
-        <w:t xml:space="preserve">. Sinyal paling dominan adalah skor assessment rendah dengan 2.341 kasus. Module GGG presentation 2014J memiliki proporsi prioritas tertinggi pada hold-out test, yaitu 100% kasus </w:t>
+        <w:t xml:space="preserve">. Sinyal terbanyak adalah skor assessment rendah dengan 2.341 kasus. Daftar prioritas memuat identitas anonim, module-presentation, probabilitas </w:t>
       </w:r>
       <w:r>
         <w:rPr>
@@ -8084,7 +6751,7 @@
           <w:color w:val="000000"/>
           <w:sz w:val="20"/>
         </w:rPr>
-        <w:t>High Risk</w:t>
+        <w:t>AtRisk</w:t>
       </w:r>
       <w:r>
         <w:rPr>
@@ -8094,93 +6761,8 @@
           <w:color w:val="000000"/>
           <w:sz w:val="20"/>
         </w:rPr>
-        <w:t xml:space="preserve"> atau </w:t>
-      </w:r>
-      <w:r>
-        <w:rPr>
-          <w:rFonts w:ascii="Times New Roman" w:hAnsi="Times New Roman"/>
-          <w:b w:val="0"/>
-          <w:i/>
-          <w:color w:val="000000"/>
-          <w:sz w:val="20"/>
-        </w:rPr>
-        <w:t>Medium Risk</w:t>
-      </w:r>
-      <w:r>
-        <w:rPr>
-          <w:rFonts w:ascii="Times New Roman" w:hAnsi="Times New Roman"/>
-          <w:b w:val="0"/>
-          <w:i w:val="0"/>
-          <w:color w:val="000000"/>
-          <w:sz w:val="20"/>
-        </w:rPr>
-        <w:t>. Indikator tersebut berfungsi sebagai sinyal untuk peninjauan konteks modul dan kapasitas intervensi.</w:t>
-      </w:r>
-    </w:p>
-    <w:p>
-      <w:pPr>
-        <w:spacing w:before="0" w:after="60" w:line="240" w:lineRule="auto"/>
-        <w:ind w:firstLine="259"/>
-        <w:jc w:val="both"/>
-      </w:pPr>
-      <w:r>
-        <w:rPr>
-          <w:rFonts w:ascii="Times New Roman" w:hAnsi="Times New Roman"/>
-          <w:b w:val="0"/>
-          <w:i w:val="0"/>
-          <w:color w:val="000000"/>
-          <w:sz w:val="20"/>
-        </w:rPr>
-        <w:t xml:space="preserve">Daftar prioritas menyajikan identitas anonim mahasiswa, module-presentation, probabilitas </w:t>
-      </w:r>
-      <w:r>
-        <w:rPr>
-          <w:rFonts w:ascii="Times New Roman" w:hAnsi="Times New Roman"/>
-          <w:b w:val="0"/>
-          <w:i/>
-          <w:color w:val="000000"/>
-          <w:sz w:val="20"/>
-        </w:rPr>
-        <w:t>AtRisk</w:t>
-      </w:r>
-      <w:r>
-        <w:rPr>
-          <w:rFonts w:ascii="Times New Roman" w:hAnsi="Times New Roman"/>
-          <w:b w:val="0"/>
-          <w:i w:val="0"/>
-          <w:color w:val="000000"/>
-          <w:sz w:val="20"/>
-        </w:rPr>
-        <w:t>, level risiko, jumlah sinyal, alasan, dan rekomendasi. Struktur tersebut menghubungkan hasil model dengan tindakan seperti monitoring akses VLE, pendampingan assessment, serta konseling akademik.</w:t>
-      </w:r>
-    </w:p>
-    <w:p>
-      <w:pPr>
-        <w:spacing w:before="0" w:after="60" w:line="240" w:lineRule="auto"/>
-        <w:ind w:firstLine="259"/>
-        <w:jc w:val="both"/>
-      </w:pPr>
-      <w:r>
-        <w:rPr>
-          <w:rFonts w:ascii="Times New Roman" w:hAnsi="Times New Roman"/>
-          <w:b w:val="0"/>
-          <w:i w:val="0"/>
-          <w:color w:val="000000"/>
-          <w:sz w:val="20"/>
-        </w:rPr>
-        <w:t>Keluaran analitik kemudian diterjemahkan ke dalam dashboard agar hasil model dapat dibaca sebagai prioritas tindakan, bukan hanya sebagai angka evaluasi. Tampilan tersebut menghubungkan KPI risiko, level prioritas, konsentrasi module-presentation, distribusi probabilitas, sinyal dominan, perbandingan perilaku, confusion matrix, dan trade-off setelah knowledge layer. Dengan susunan ini, pengguna dapat bergerak dari ringkasan strategis menuju penelusuran kelompok atau mahasiswa yang membutuhkan tindak lanjut.</w:t>
-      </w:r>
-    </w:p>
-    <w:p>
-      <w:pPr>
-        <w:sectPr>
-          <w:type w:val="continuous"/>
-          <w:pgSz w:w="12240" w:h="15840"/>
-          <w:pgMar w:top="936" w:right="936" w:bottom="936" w:left="936" w:header="432" w:footer="432" w:gutter="0"/>
-          <w:cols w:space="360" w:num="2" w:equalWidth="1"/>
-          <w:docGrid w:linePitch="360"/>
-        </w:sectPr>
-      </w:pPr>
+        <w:t>, level, jumlah sinyal, alasan, dan rekomendasi. Struktur ini menghubungkan evaluasi teknis dengan monitoring module-presentation dan tindak lanjut tingkat mahasiswa.</w:t>
+      </w:r>
     </w:p>
     <w:p>
       <w:pPr>
@@ -8191,8 +6773,8 @@
       <w:r>
         <w:drawing>
           <wp:inline xmlns:a="http://schemas.openxmlformats.org/drawingml/2006/main" xmlns:pic="http://schemas.openxmlformats.org/drawingml/2006/picture">
-            <wp:extent cx="5486400" cy="4940761"/>
-            <wp:docPr id="7" name="Picture 7" descr="Fig. 7. Dashboard early warning OULAD pada akhir minggu keempat." title="Fig"/>
+            <wp:extent cx="2971800" cy="2676246"/>
+            <wp:docPr id="5" name="Picture 5" descr="Fig. 5. Dashboard early warning OULAD pada akhir minggu keempat." title="Fig"/>
             <wp:cNvGraphicFramePr>
               <a:graphicFrameLocks noChangeAspect="1"/>
             </wp:cNvGraphicFramePr>
@@ -8204,7 +6786,7 @@
                     <pic:cNvPicPr/>
                   </pic:nvPicPr>
                   <pic:blipFill>
-                    <a:blip r:embed="rId15"/>
+                    <a:blip r:embed="rId13"/>
                     <a:stretch>
                       <a:fillRect/>
                     </a:stretch>
@@ -8212,7 +6794,7 @@
                   <pic:spPr>
                     <a:xfrm>
                       <a:off x="0" y="0"/>
-                      <a:ext cx="5486400" cy="4940761"/>
+                      <a:ext cx="2971800" cy="2676246"/>
                     </a:xfrm>
                     <a:prstGeom prst="rect"/>
                   </pic:spPr>
@@ -8237,25 +6819,119 @@
           <w:color w:val="000000"/>
           <w:sz w:val="16"/>
         </w:rPr>
-        <w:t>Fig. 7. Dashboard early warning OULAD pada akhir minggu keempat.</w:t>
+        <w:t>Fig. 5. Dashboard early warning OULAD pada akhir minggu keempat.</w:t>
       </w:r>
     </w:p>
     <w:p>
       <w:pPr>
-        <w:sectPr>
-          <w:type w:val="continuous"/>
-          <w:pgSz w:w="12240" w:h="15840"/>
-          <w:pgMar w:top="936" w:right="936" w:bottom="936" w:left="936" w:header="432" w:footer="432" w:gutter="0"/>
-          <w:cols w:space="360" w:num="1" w:equalWidth="1"/>
-          <w:docGrid w:linePitch="360"/>
-        </w:sectPr>
+        <w:pStyle w:val="Heading2"/>
+        <w:keepNext/>
+        <w:spacing w:before="80" w:after="20"/>
+        <w:jc w:val="left"/>
       </w:pPr>
+      <w:r>
+        <w:rPr>
+          <w:rFonts w:ascii="Times New Roman" w:hAnsi="Times New Roman"/>
+          <w:i/>
+          <w:color w:val="000000"/>
+          <w:sz w:val="20"/>
+        </w:rPr>
+        <w:t>G. Discussion and Limitations</w:t>
+      </w:r>
+    </w:p>
+    <w:p>
+      <w:pPr>
+        <w:spacing w:before="0" w:after="20" w:line="240" w:lineRule="auto"/>
+        <w:ind w:firstLine="259"/>
+        <w:jc w:val="both"/>
+      </w:pPr>
+      <w:r>
+        <w:rPr>
+          <w:rFonts w:ascii="Times New Roman" w:hAnsi="Times New Roman"/>
+          <w:b w:val="0"/>
+          <w:i w:val="0"/>
+          <w:color w:val="000000"/>
+          <w:sz w:val="20"/>
+        </w:rPr>
+        <w:t xml:space="preserve">Hasil eksperimen memperlihatkan hubungan antara tujuan keputusan dan model selection. XGBoost unggul pada accuracy dan ROC-AUC, sementara Random Forest memperoleh recall </w:t>
+      </w:r>
+      <w:r>
+        <w:rPr>
+          <w:rFonts w:ascii="Times New Roman" w:hAnsi="Times New Roman"/>
+          <w:b w:val="0"/>
+          <w:i/>
+          <w:color w:val="000000"/>
+          <w:sz w:val="20"/>
+        </w:rPr>
+        <w:t>AtRisk</w:t>
+      </w:r>
+      <w:r>
+        <w:rPr>
+          <w:rFonts w:ascii="Times New Roman" w:hAnsi="Times New Roman"/>
+          <w:b w:val="0"/>
+          <w:i w:val="0"/>
+          <w:color w:val="000000"/>
+          <w:sz w:val="20"/>
+        </w:rPr>
+        <w:t xml:space="preserve"> tertinggi pada cross-validation dan hold-out test. Performa sekitar 0,76 merepresentasikan skenario awal yang hanya menggunakan informasi sampai hari ke-28. Horizon ini menyediakan waktu intervensi lebih panjang sekaligus membatasi jumlah bukti perilaku yang tersedia bagi model.</w:t>
+      </w:r>
+    </w:p>
+    <w:p>
+      <w:pPr>
+        <w:spacing w:before="0" w:after="20" w:line="240" w:lineRule="auto"/>
+        <w:ind w:firstLine="259"/>
+        <w:jc w:val="both"/>
+      </w:pPr>
+      <w:r>
+        <w:rPr>
+          <w:rFonts w:ascii="Times New Roman" w:hAnsi="Times New Roman"/>
+          <w:b w:val="0"/>
+          <w:i w:val="0"/>
+          <w:color w:val="000000"/>
+          <w:sz w:val="20"/>
+        </w:rPr>
+        <w:t>Threshold assessment sebesar nol menunjukkan bahwa sebagian module-presentation belum memiliki submission sampai minggu keempat. Pengembangan berikutnya dapat menggunakan threshold per module-presentation atau menyesuaikan cut-off dengan jadwal assessment. Knowledge layer memperluas recall sebesar 0,0653 poin dan menghasilkan alasan operasional seperti aktivitas VLE rendah atau assessment yang belum dikerjakan. Alasan tersebut menjadi bahan verifikasi bersama informasi kontekstual dari dosen dan tutor.</w:t>
+      </w:r>
+    </w:p>
+    <w:p>
+      <w:pPr>
+        <w:spacing w:before="0" w:after="20" w:line="240" w:lineRule="auto"/>
+        <w:ind w:firstLine="259"/>
+        <w:jc w:val="both"/>
+      </w:pPr>
+      <w:r>
+        <w:rPr>
+          <w:rFonts w:ascii="Times New Roman" w:hAnsi="Times New Roman"/>
+          <w:b w:val="0"/>
+          <w:i w:val="0"/>
+          <w:color w:val="000000"/>
+          <w:sz w:val="20"/>
+        </w:rPr>
+        <w:t>Dashboard memperluas fungsi model menjadi Business Intelligence melalui agregasi risiko, perbandingan module-presentation, dan antrean mahasiswa. Temuan 100% prioritas pada GGG 2014J menjadi sinyal untuk meninjau ukuran kelompok, jadwal assessment, serta karakteristik modul sebelum menentukan tindakan.</w:t>
+      </w:r>
+    </w:p>
+    <w:p>
+      <w:pPr>
+        <w:spacing w:before="0" w:after="20" w:line="240" w:lineRule="auto"/>
+        <w:ind w:firstLine="259"/>
+        <w:jc w:val="both"/>
+      </w:pPr>
+      <w:r>
+        <w:rPr>
+          <w:rFonts w:ascii="Times New Roman" w:hAnsi="Times New Roman"/>
+          <w:b w:val="0"/>
+          <w:i w:val="0"/>
+          <w:color w:val="000000"/>
+          <w:sz w:val="20"/>
+        </w:rPr>
+        <w:t>Keterbatasan penelitian mencakup konteks OULAD di Open University Inggris, fitur perilaku yang masih berupa agregat, konfigurasi model baseline, dan threshold kuartil yang memerlukan validasi pakar. Evaluasi mengukur performa deteksi, sedangkan dampak intervensi terhadap keberhasilan mata kuliah memerlukan penelitian lanjutan dengan data institusi dan desain evaluasi intervensi.</w:t>
+      </w:r>
     </w:p>
     <w:p>
       <w:pPr>
         <w:pStyle w:val="Heading1"/>
         <w:keepNext/>
-        <w:spacing w:before="160" w:after="80"/>
+        <w:spacing w:before="120" w:after="60"/>
         <w:jc w:val="center"/>
       </w:pPr>
       <w:r>
@@ -8265,12 +6941,12 @@
           <w:color w:val="000000"/>
           <w:sz w:val="20"/>
         </w:rPr>
-        <w:t>V. DISCUSSION</w:t>
+        <w:t>V. CONCLUSION</w:t>
       </w:r>
     </w:p>
     <w:p>
       <w:pPr>
-        <w:spacing w:before="0" w:after="60" w:line="240" w:lineRule="auto"/>
+        <w:spacing w:before="0" w:after="20" w:line="240" w:lineRule="auto"/>
         <w:ind w:firstLine="259"/>
         <w:jc w:val="both"/>
       </w:pPr>
@@ -8282,7 +6958,7 @@
           <w:color w:val="000000"/>
           <w:sz w:val="20"/>
         </w:rPr>
-        <w:t xml:space="preserve">Hasil eksperimen menunjukkan bahwa pemilihan model bergantung pada tujuan keputusan. XGBoost menghasilkan accuracy dan ROC-AUC tertinggi, sedangkan Random Forest menghasilkan recall </w:t>
+        <w:t xml:space="preserve">Penelitian ini mengembangkan early warning risiko gagal atau mengundurkan diri dari mata kuliah pada akhir minggu keempat menggunakan OULAD. Dataset dibentuk pada unit student-module-presentation dengan fitur demografis, registrasi awal, assessment, dan aktivitas VLE sampai hari ke-28. Pemisahan berbasis </w:t>
       </w:r>
       <w:r>
         <w:rPr>
@@ -8292,7 +6968,7 @@
           <w:color w:val="000000"/>
           <w:sz w:val="20"/>
         </w:rPr>
-        <w:t>AtRisk</w:t>
+        <w:t>id_student</w:t>
       </w:r>
       <w:r>
         <w:rPr>
@@ -8302,12 +6978,12 @@
           <w:color w:val="000000"/>
           <w:sz w:val="20"/>
         </w:rPr>
-        <w:t xml:space="preserve"> tertinggi pada cross-validation dan hold-out test. Penelitian ini memprioritaskan recall karena early warning diarahkan untuk memperluas cakupan mahasiswa berisiko yang dapat diverifikasi oleh stakeholder. F1-score Random Forest pada hold-out test mencapai 0,7589, diikuti XGBoost sebesar 0,7559.</w:t>
+        <w:t xml:space="preserve"> menjaga independensi mahasiswa antara train-validation dan hold-out test.</w:t>
       </w:r>
     </w:p>
     <w:p>
       <w:pPr>
-        <w:spacing w:before="0" w:after="60" w:line="240" w:lineRule="auto"/>
+        <w:spacing w:before="0" w:after="20" w:line="240" w:lineRule="auto"/>
         <w:ind w:firstLine="259"/>
         <w:jc w:val="both"/>
       </w:pPr>
@@ -8319,12 +6995,32 @@
           <w:color w:val="000000"/>
           <w:sz w:val="20"/>
         </w:rPr>
-        <w:t>Performa sekitar 0,76 lebih rendah dibandingkan eksperimen yang memakai aktivitas seluruh semester dan status unregistration. Nilai tersebut merepresentasikan kondisi yang lebih menantang karena model hanya menerima informasi sampai hari ke-28. Pembatasan temporal menjaga hubungan antara waktu fitur tersedia dan waktu keputusan intervensi. Hasil ini memperlihatkan bahwa evaluasi early warning perlu dibaca berdasarkan horizon prediksi, sehingga perbandingan performa antarpenelitian memerlukan kesetaraan cut-off data.</w:t>
+        <w:t xml:space="preserve">Random Forest dipilih berdasarkan recall </w:t>
+      </w:r>
+      <w:r>
+        <w:rPr>
+          <w:rFonts w:ascii="Times New Roman" w:hAnsi="Times New Roman"/>
+          <w:b w:val="0"/>
+          <w:i/>
+          <w:color w:val="000000"/>
+          <w:sz w:val="20"/>
+        </w:rPr>
+        <w:t>AtRisk</w:t>
+      </w:r>
+      <w:r>
+        <w:rPr>
+          <w:rFonts w:ascii="Times New Roman" w:hAnsi="Times New Roman"/>
+          <w:b w:val="0"/>
+          <w:i w:val="0"/>
+          <w:color w:val="000000"/>
+          <w:sz w:val="20"/>
+        </w:rPr>
+        <w:t xml:space="preserve"> cross-validation tertinggi sebesar 0,7107. Pada hold-out test, model menghasilkan accuracy 0,7594, precision 0,8007, recall 0,7213, F1-score 0,7589, dan ROC-AUC 0,8396. Knowledge-based risk layer meningkatkan recall menjadi 0,7866 dengan menggabungkan prediksi model dan empat sinyal perilaku awal. Sistem menghasilkan level risiko, alasan, dan rekomendasi yang dapat diterjemahkan menjadi antrean intervensi.</w:t>
       </w:r>
     </w:p>
     <w:p>
       <w:pPr>
-        <w:spacing w:before="0" w:after="60" w:line="240" w:lineRule="auto"/>
+        <w:spacing w:before="0" w:after="20" w:line="240" w:lineRule="auto"/>
         <w:ind w:firstLine="259"/>
         <w:jc w:val="both"/>
       </w:pPr>
@@ -8336,12 +7032,12 @@
           <w:color w:val="000000"/>
           <w:sz w:val="20"/>
         </w:rPr>
-        <w:t>Threshold assessment sebesar nol memiliki makna operasional khusus. Pada minggu keempat, sejumlah module-presentation belum menghasilkan submission assessment untuk semua mahasiswa. Kondisi belum mengumpulkan assessment menjadi sinyal engagement awal, sedangkan kemampuan membedakan skor rendah di atas nol masih terbatas. Penelitian lanjutan dapat menggunakan threshold per module-presentation atau menyesuaikan cut-off dengan jadwal assessment untuk memperoleh aturan yang lebih kontekstual.</w:t>
+        <w:t>Dashboard Business Intelligence menyajikan distribusi risiko, prioritas module-presentation, sinyal dominan, performa model, dan daftar mahasiswa anonim untuk monitoring. Integrasi supervised learning, knowledge-based risk layer, dan visual analytics menghasilkan decision support yang menghubungkan prediksi dengan proses tindak lanjut akademik.</w:t>
       </w:r>
     </w:p>
     <w:p>
       <w:pPr>
-        <w:spacing w:before="0" w:after="60" w:line="240" w:lineRule="auto"/>
+        <w:spacing w:before="0" w:after="20" w:line="240" w:lineRule="auto"/>
         <w:ind w:firstLine="259"/>
         <w:jc w:val="both"/>
       </w:pPr>
@@ -8353,250 +7049,14 @@
           <w:color w:val="000000"/>
           <w:sz w:val="20"/>
         </w:rPr>
-        <w:t xml:space="preserve">Knowledge-based risk layer meningkatkan recall sebesar 0,0653 poin dari 0,7213 menjadi 0,7866. Peningkatan tersebut memperluas cakupan mahasiswa </w:t>
-      </w:r>
-      <w:r>
-        <w:rPr>
-          <w:rFonts w:ascii="Times New Roman" w:hAnsi="Times New Roman"/>
-          <w:b w:val="0"/>
-          <w:i/>
-          <w:color w:val="000000"/>
-          <w:sz w:val="20"/>
-        </w:rPr>
-        <w:t>AtRisk</w:t>
-      </w:r>
-      <w:r>
-        <w:rPr>
-          <w:rFonts w:ascii="Times New Roman" w:hAnsi="Times New Roman"/>
-          <w:b w:val="0"/>
-          <w:i w:val="0"/>
-          <w:color w:val="000000"/>
-          <w:sz w:val="20"/>
-        </w:rPr>
-        <w:t xml:space="preserve"> yang masuk antrean intervensi. Precision sebesar 0,7043 menunjukkan proporsi alarm yang sesuai dengan label aktual. Trade-off ini berkaitan langsung dengan kapasitas operasional. Institusi dengan sumber daya konseling terbatas dapat memprioritaskan </w:t>
-      </w:r>
-      <w:r>
-        <w:rPr>
-          <w:rFonts w:ascii="Times New Roman" w:hAnsi="Times New Roman"/>
-          <w:b w:val="0"/>
-          <w:i/>
-          <w:color w:val="000000"/>
-          <w:sz w:val="20"/>
-        </w:rPr>
-        <w:t>High Risk</w:t>
-      </w:r>
-      <w:r>
-        <w:rPr>
-          <w:rFonts w:ascii="Times New Roman" w:hAnsi="Times New Roman"/>
-          <w:b w:val="0"/>
-          <w:i w:val="0"/>
-          <w:color w:val="000000"/>
-          <w:sz w:val="20"/>
-        </w:rPr>
-        <w:t xml:space="preserve">, sedangkan institusi dengan kapasitas lebih besar dapat memasukkan </w:t>
-      </w:r>
-      <w:r>
-        <w:rPr>
-          <w:rFonts w:ascii="Times New Roman" w:hAnsi="Times New Roman"/>
-          <w:b w:val="0"/>
-          <w:i/>
-          <w:color w:val="000000"/>
-          <w:sz w:val="20"/>
-        </w:rPr>
-        <w:t>Medium Risk</w:t>
-      </w:r>
-      <w:r>
-        <w:rPr>
-          <w:rFonts w:ascii="Times New Roman" w:hAnsi="Times New Roman"/>
-          <w:b w:val="0"/>
-          <w:i w:val="0"/>
-          <w:color w:val="000000"/>
-          <w:sz w:val="20"/>
-        </w:rPr>
-        <w:t xml:space="preserve"> dalam monitoring berkala.</w:t>
-      </w:r>
-    </w:p>
-    <w:p>
-      <w:pPr>
-        <w:spacing w:before="0" w:after="60" w:line="240" w:lineRule="auto"/>
-        <w:ind w:firstLine="259"/>
-        <w:jc w:val="both"/>
-      </w:pPr>
-      <w:r>
-        <w:rPr>
-          <w:rFonts w:ascii="Times New Roman" w:hAnsi="Times New Roman"/>
-          <w:b w:val="0"/>
-          <w:i w:val="0"/>
-          <w:color w:val="000000"/>
-          <w:sz w:val="20"/>
-        </w:rPr>
-        <w:t>Knowledge layer juga meningkatkan interpretabilitas praktis. Probabilitas model dilengkapi dengan alasan seperti aktivitas VLE rendah, hari aktif rendah, atau assessment yang belum dikerjakan. Informasi tersebut membantu memilih bentuk intervensi yang sesuai. Hubungan ini bersifat asosiasi prediktif, sehingga rekomendasi tetap memerlukan validasi manusia dan informasi kontekstual dari dosen atau tutor.</w:t>
-      </w:r>
-    </w:p>
-    <w:p>
-      <w:pPr>
-        <w:spacing w:before="0" w:after="60" w:line="240" w:lineRule="auto"/>
-        <w:ind w:firstLine="259"/>
-        <w:jc w:val="both"/>
-      </w:pPr>
-      <w:r>
-        <w:rPr>
-          <w:rFonts w:ascii="Times New Roman" w:hAnsi="Times New Roman"/>
-          <w:b w:val="0"/>
-          <w:i w:val="0"/>
-          <w:color w:val="000000"/>
-          <w:sz w:val="20"/>
-        </w:rPr>
-        <w:t>Dashboard memperluas fungsi eksperimen dari evaluasi teknis menjadi Business Intelligence. Agregasi per module-presentation membantu program studi mengenali konsentrasi risiko, sedangkan daftar prioritas mendukung tindak lanjut tingkat mahasiswa. Temuan 100% prioritas pada GGG 2014J perlu dibaca bersama ukuran kelompok, jadwal assessment, dan karakteristik modul. Dashboard menyediakan titik awal investigasi dan monitoring, sedangkan keputusan akademik ditetapkan melalui proses institusional.</w:t>
-      </w:r>
-    </w:p>
-    <w:p>
-      <w:pPr>
-        <w:spacing w:before="0" w:after="60" w:line="240" w:lineRule="auto"/>
-        <w:ind w:firstLine="259"/>
-        <w:jc w:val="both"/>
-      </w:pPr>
-      <w:r>
-        <w:rPr>
-          <w:rFonts w:ascii="Times New Roman" w:hAnsi="Times New Roman"/>
-          <w:b w:val="0"/>
-          <w:i w:val="0"/>
-          <w:color w:val="000000"/>
-          <w:sz w:val="20"/>
-        </w:rPr>
-        <w:t>Penelitian memiliki beberapa keterbatasan. OULAD berasal dari konteks Open University di Inggris sehingga validitas eksternal pada institusi lain memerlukan pengujian ulang. Fitur perilaku dibatasi pada agregasi sampai hari ke-28 dan belum memodelkan urutan temporal harian. Hyperparameter model menggunakan konfigurasi baseline. Threshold berbasis kuartil memerlukan validasi pakar dan dapat berubah mengikuti cohort, module-presentation, atau kebijakan akademik. Evaluasi juga mengukur performa deteksi, sedangkan dampak intervensi terhadap retensi memerlukan desain eksperimen lanjutan.</w:t>
+        <w:t>Pengembangan berikutnya dapat membandingkan horizon minggu keempat, kedelapan, dan kedua belas; menggunakan threshold per module-presentation; melakukan tuning hyperparameter; serta menguji validitas eksternal pada data institusi lain. Evaluasi dampak intervensi juga diperlukan untuk mengukur kontribusi sistem terhadap keberhasilan mahasiswa menyelesaikan mata kuliah.</w:t>
       </w:r>
     </w:p>
     <w:p>
       <w:pPr>
         <w:pStyle w:val="Heading1"/>
         <w:keepNext/>
-        <w:spacing w:before="160" w:after="80"/>
-        <w:jc w:val="center"/>
-      </w:pPr>
-      <w:r>
-        <w:rPr>
-          <w:rFonts w:ascii="Times New Roman" w:hAnsi="Times New Roman"/>
-          <w:b w:val="0"/>
-          <w:color w:val="000000"/>
-          <w:sz w:val="20"/>
-        </w:rPr>
-        <w:t>VI. CONCLUSION</w:t>
-      </w:r>
-    </w:p>
-    <w:p>
-      <w:pPr>
-        <w:spacing w:before="0" w:after="60" w:line="240" w:lineRule="auto"/>
-        <w:ind w:firstLine="259"/>
-        <w:jc w:val="both"/>
-      </w:pPr>
-      <w:r>
-        <w:rPr>
-          <w:rFonts w:ascii="Times New Roman" w:hAnsi="Times New Roman"/>
-          <w:b w:val="0"/>
-          <w:i w:val="0"/>
-          <w:color w:val="000000"/>
-          <w:sz w:val="20"/>
-        </w:rPr>
-        <w:t xml:space="preserve">Penelitian ini mengembangkan early warning risiko gagal atau mengundurkan diri dari mata kuliah pada akhir minggu keempat menggunakan OULAD. Dataset dibentuk pada unit student-module-presentation dengan fitur demografis, registrasi awal, assessment, dan aktivitas VLE sampai hari ke-28. Pemisahan berbasis </w:t>
-      </w:r>
-      <w:r>
-        <w:rPr>
-          <w:rFonts w:ascii="Times New Roman" w:hAnsi="Times New Roman"/>
-          <w:b w:val="0"/>
-          <w:i/>
-          <w:color w:val="000000"/>
-          <w:sz w:val="20"/>
-        </w:rPr>
-        <w:t>id_student</w:t>
-      </w:r>
-      <w:r>
-        <w:rPr>
-          <w:rFonts w:ascii="Times New Roman" w:hAnsi="Times New Roman"/>
-          <w:b w:val="0"/>
-          <w:i w:val="0"/>
-          <w:color w:val="000000"/>
-          <w:sz w:val="20"/>
-        </w:rPr>
-        <w:t xml:space="preserve"> menjaga independensi mahasiswa antara train-validation dan hold-out test.</w:t>
-      </w:r>
-    </w:p>
-    <w:p>
-      <w:pPr>
-        <w:spacing w:before="0" w:after="60" w:line="240" w:lineRule="auto"/>
-        <w:ind w:firstLine="259"/>
-        <w:jc w:val="both"/>
-      </w:pPr>
-      <w:r>
-        <w:rPr>
-          <w:rFonts w:ascii="Times New Roman" w:hAnsi="Times New Roman"/>
-          <w:b w:val="0"/>
-          <w:i w:val="0"/>
-          <w:color w:val="000000"/>
-          <w:sz w:val="20"/>
-        </w:rPr>
-        <w:t xml:space="preserve">Random Forest dipilih berdasarkan recall </w:t>
-      </w:r>
-      <w:r>
-        <w:rPr>
-          <w:rFonts w:ascii="Times New Roman" w:hAnsi="Times New Roman"/>
-          <w:b w:val="0"/>
-          <w:i/>
-          <w:color w:val="000000"/>
-          <w:sz w:val="20"/>
-        </w:rPr>
-        <w:t>AtRisk</w:t>
-      </w:r>
-      <w:r>
-        <w:rPr>
-          <w:rFonts w:ascii="Times New Roman" w:hAnsi="Times New Roman"/>
-          <w:b w:val="0"/>
-          <w:i w:val="0"/>
-          <w:color w:val="000000"/>
-          <w:sz w:val="20"/>
-        </w:rPr>
-        <w:t xml:space="preserve"> cross-validation tertinggi sebesar 0,7107. Pada hold-out test, model menghasilkan accuracy 0,7594, precision 0,8007, recall 0,7213, F1-score 0,7589, dan ROC-AUC 0,8396. Knowledge-based risk layer meningkatkan recall menjadi 0,7866 dengan menggabungkan prediksi model dan empat sinyal perilaku awal. Sistem menghasilkan level risiko, alasan, dan rekomendasi yang dapat diterjemahkan menjadi antrean intervensi.</w:t>
-      </w:r>
-    </w:p>
-    <w:p>
-      <w:pPr>
-        <w:spacing w:before="0" w:after="60" w:line="240" w:lineRule="auto"/>
-        <w:ind w:firstLine="259"/>
-        <w:jc w:val="both"/>
-      </w:pPr>
-      <w:r>
-        <w:rPr>
-          <w:rFonts w:ascii="Times New Roman" w:hAnsi="Times New Roman"/>
-          <w:b w:val="0"/>
-          <w:i w:val="0"/>
-          <w:color w:val="000000"/>
-          <w:sz w:val="20"/>
-        </w:rPr>
-        <w:t>Dashboard Business Intelligence menyajikan distribusi risiko, prioritas module-presentation, sinyal dominan, performa model, dan daftar mahasiswa anonim untuk monitoring. Integrasi supervised learning, knowledge-based risk layer, dan visual analytics menghasilkan decision support yang menghubungkan prediksi dengan proses tindak lanjut akademik.</w:t>
-      </w:r>
-    </w:p>
-    <w:p>
-      <w:pPr>
-        <w:spacing w:before="0" w:after="60" w:line="240" w:lineRule="auto"/>
-        <w:ind w:firstLine="259"/>
-        <w:jc w:val="both"/>
-      </w:pPr>
-      <w:r>
-        <w:rPr>
-          <w:rFonts w:ascii="Times New Roman" w:hAnsi="Times New Roman"/>
-          <w:b w:val="0"/>
-          <w:i w:val="0"/>
-          <w:color w:val="000000"/>
-          <w:sz w:val="20"/>
-        </w:rPr>
-        <w:t>Pengembangan berikutnya dapat membandingkan horizon minggu keempat, kedelapan, dan kedua belas; menggunakan threshold per module-presentation; melakukan tuning hyperparameter; serta menguji validitas eksternal pada data institusi lain. Evaluasi dampak intervensi juga diperlukan untuk mengukur kontribusi sistem terhadap keberhasilan mahasiswa menyelesaikan mata kuliah.</w:t>
-      </w:r>
-    </w:p>
-    <w:p>
-      <w:pPr>
-        <w:pStyle w:val="Heading1"/>
-        <w:keepNext/>
-        <w:spacing w:before="160" w:after="80"/>
+        <w:spacing w:before="120" w:after="60"/>
         <w:jc w:val="center"/>
       </w:pPr>
       <w:r>
@@ -9204,7 +7664,7 @@
     <w:sectPr>
       <w:type w:val="continuous"/>
       <w:pgSz w:w="12240" w:h="15840"/>
-      <w:pgMar w:top="936" w:right="936" w:bottom="936" w:left="936" w:header="432" w:footer="432" w:gutter="0"/>
+      <w:pgMar w:top="1080" w:right="900" w:bottom="1440" w:left="900" w:header="432" w:footer="432" w:gutter="0"/>
       <w:cols w:space="360" w:num="2" w:equalWidth="1"/>
       <w:docGrid w:linePitch="360"/>
     </w:sectPr>

</xml_diff>

<commit_message>
docs(article): visualize OULAD benchmark results
</commit_message>
<xml_diff>
--- a/docs/artikel-ieee/Artikel IEEE - Early Warning OULAD.docx
+++ b/docs/artikel-ieee/Artikel IEEE - Early Warning OULAD.docx
@@ -5119,7 +5119,7 @@
           <w:color w:val="000000"/>
           <w:sz w:val="20"/>
         </w:rPr>
-        <w:t xml:space="preserve">Tabel III menempatkan hasil penelitian dalam konteks lima studi OULAD. Shou et al. memakai target biner yang sama pada 20% durasi course [5]. Jawad et al. menggunakan data sampai 260 hari dan SMOTE [6], Balabied dan Eid menggunakan Random Forest [7], sedangkan Ujkani et al. [8] dan Alnasyan et al. [9] menggabungkan </w:t>
+        <w:t xml:space="preserve">Fig. 5 menempatkan hasil penelitian dalam konteks lima studi OULAD. Shou et al. memakai target biner yang sama pada 20% durasi course [5]. Jawad et al. menggunakan data sampai 260 hari dan SMOTE [6], Balabied dan Eid menggunakan Random Forest [7], sedangkan Ujkani et al. [8] dan Alnasyan et al. [9] menggabungkan </w:t>
       </w:r>
       <w:r>
         <w:rPr>
@@ -5159,885 +5159,66 @@
           <w:color w:val="000000"/>
           <w:sz w:val="20"/>
         </w:rPr>
-        <w:t xml:space="preserve"> sebagai kelompok at-risk. Perbedaan horizon, split, balancing, dan model menjadikan angka pada tabel sebagai konteks benchmark.</w:t>
+        <w:t xml:space="preserve"> sebagai kelompok at-risk. Grafik menyajikan nilai yang dilaporkan setiap studi sebagai benchmark kontekstual karena horizon, split, balancing, dan model yang digunakan berbeda.</w:t>
       </w:r>
     </w:p>
     <w:p>
       <w:pPr>
         <w:keepNext/>
-        <w:spacing w:before="80" w:after="40"/>
+        <w:spacing w:before="80" w:after="20"/>
         <w:jc w:val="center"/>
       </w:pPr>
       <w:r>
-        <w:rPr>
-          <w:rFonts w:ascii="Times New Roman" w:hAnsi="Times New Roman"/>
-          <w:color w:val="000000"/>
-          <w:sz w:val="16"/>
-        </w:rPr>
-        <w:t>TABLE III</w:t>
-        <w:br/>
-      </w:r>
-      <w:r>
-        <w:rPr>
-          <w:rFonts w:ascii="Times New Roman" w:hAnsi="Times New Roman"/>
-          <w:color w:val="000000"/>
-          <w:sz w:val="16"/>
-        </w:rPr>
-        <w:t>BENCHMARK PENELITIAN BERBASIS OULAD</w:t>
+        <w:drawing>
+          <wp:inline xmlns:a="http://schemas.openxmlformats.org/drawingml/2006/main" xmlns:pic="http://schemas.openxmlformats.org/drawingml/2006/picture">
+            <wp:extent cx="2971800" cy="2311906"/>
+            <wp:docPr id="5" name="Picture 5" descr="Fig. 5. Benchmark accuracy dan F1-score penelitian berbasis OULAD. Perbandingan bersifat kontekstual karena perbedaan horizon, data split, balancing, dan model." title="Fig"/>
+            <wp:cNvGraphicFramePr>
+              <a:graphicFrameLocks noChangeAspect="1"/>
+            </wp:cNvGraphicFramePr>
+            <a:graphic>
+              <a:graphicData uri="http://schemas.openxmlformats.org/drawingml/2006/picture">
+                <pic:pic>
+                  <pic:nvPicPr>
+                    <pic:cNvPr id="0" name="fig-5-oulad-benchmark.png"/>
+                    <pic:cNvPicPr/>
+                  </pic:nvPicPr>
+                  <pic:blipFill>
+                    <a:blip r:embed="rId13"/>
+                    <a:stretch>
+                      <a:fillRect/>
+                    </a:stretch>
+                  </pic:blipFill>
+                  <pic:spPr>
+                    <a:xfrm>
+                      <a:off x="0" y="0"/>
+                      <a:ext cx="2971800" cy="2311906"/>
+                    </a:xfrm>
+                    <a:prstGeom prst="rect"/>
+                  </pic:spPr>
+                </pic:pic>
+              </a:graphicData>
+            </a:graphic>
+          </wp:inline>
+        </w:drawing>
       </w:r>
     </w:p>
-    <w:tbl>
-      <w:tblPr>
-        <w:tblStyle w:val="TableGrid"/>
-        <w:tblW w:type="dxa" w:w="4800"/>
-        <w:jc w:val="center"/>
-        <w:tblLayout w:type="fixed"/>
-        <w:tblLook w:firstColumn="1" w:firstRow="1" w:lastColumn="0" w:lastRow="0" w:noHBand="0" w:noVBand="1" w:val="04A0"/>
-      </w:tblPr>
-      <w:tblGrid>
-        <w:gridCol w:w="1100"/>
-        <w:gridCol w:w="1233"/>
-        <w:gridCol w:w="1233"/>
-        <w:gridCol w:w="1234"/>
-      </w:tblGrid>
-      <w:tr>
-        <w:trPr>
-          <w:tblHeader/>
-        </w:trPr>
-        <w:tc>
-          <w:tcPr>
-            <w:tcW w:type="dxa" w:w="1100"/>
-            <w:tcMar>
-              <w:top w:w="60" w:type="dxa"/>
-              <w:start w:w="80" w:type="dxa"/>
-              <w:bottom w:w="60" w:type="dxa"/>
-              <w:end w:w="80" w:type="dxa"/>
-            </w:tcMar>
-            <w:vAlign w:val="center"/>
-            <w:shd w:fill="E7E6E6"/>
-          </w:tcPr>
-          <w:p>
-            <w:pPr>
-              <w:spacing w:after="0"/>
-              <w:jc w:val="left"/>
-            </w:pPr>
-            <w:r/>
-            <w:r>
-              <w:rPr>
-                <w:rFonts w:ascii="Times New Roman" w:hAnsi="Times New Roman"/>
-                <w:b/>
-                <w:i w:val="0"/>
-                <w:color w:val="000000"/>
-                <w:sz w:val="13"/>
-              </w:rPr>
-              <w:t>Penelitian</w:t>
-            </w:r>
-          </w:p>
-        </w:tc>
-        <w:tc>
-          <w:tcPr>
-            <w:tcW w:type="dxa" w:w="1233"/>
-            <w:tcMar>
-              <w:top w:w="60" w:type="dxa"/>
-              <w:start w:w="80" w:type="dxa"/>
-              <w:bottom w:w="60" w:type="dxa"/>
-              <w:end w:w="80" w:type="dxa"/>
-            </w:tcMar>
-            <w:vAlign w:val="center"/>
-            <w:shd w:fill="E7E6E6"/>
-          </w:tcPr>
-          <w:p>
-            <w:pPr>
-              <w:spacing w:after="0"/>
-              <w:jc w:val="center"/>
-            </w:pPr>
-            <w:r/>
-            <w:r>
-              <w:rPr>
-                <w:rFonts w:ascii="Times New Roman" w:hAnsi="Times New Roman"/>
-                <w:b/>
-                <w:i w:val="0"/>
-                <w:color w:val="000000"/>
-                <w:sz w:val="13"/>
-              </w:rPr>
-              <w:t>Skenario dan Model</w:t>
-            </w:r>
-          </w:p>
-        </w:tc>
-        <w:tc>
-          <w:tcPr>
-            <w:tcW w:type="dxa" w:w="1233"/>
-            <w:tcMar>
-              <w:top w:w="60" w:type="dxa"/>
-              <w:start w:w="80" w:type="dxa"/>
-              <w:bottom w:w="60" w:type="dxa"/>
-              <w:end w:w="80" w:type="dxa"/>
-            </w:tcMar>
-            <w:vAlign w:val="center"/>
-            <w:shd w:fill="E7E6E6"/>
-          </w:tcPr>
-          <w:p>
-            <w:pPr>
-              <w:spacing w:after="0"/>
-              <w:jc w:val="center"/>
-            </w:pPr>
-            <w:r/>
-            <w:r>
-              <w:rPr>
-                <w:rFonts w:ascii="Times New Roman" w:hAnsi="Times New Roman"/>
-                <w:b/>
-                <w:i w:val="0"/>
-                <w:color w:val="000000"/>
-                <w:sz w:val="13"/>
-              </w:rPr>
-              <w:t>Accuracy</w:t>
-            </w:r>
-          </w:p>
-        </w:tc>
-        <w:tc>
-          <w:tcPr>
-            <w:tcW w:type="dxa" w:w="1234"/>
-            <w:tcMar>
-              <w:top w:w="60" w:type="dxa"/>
-              <w:start w:w="80" w:type="dxa"/>
-              <w:bottom w:w="60" w:type="dxa"/>
-              <w:end w:w="80" w:type="dxa"/>
-            </w:tcMar>
-            <w:vAlign w:val="center"/>
-            <w:shd w:fill="E7E6E6"/>
-          </w:tcPr>
-          <w:p>
-            <w:pPr>
-              <w:spacing w:after="0"/>
-              <w:jc w:val="center"/>
-            </w:pPr>
-            <w:r/>
-            <w:r>
-              <w:rPr>
-                <w:rFonts w:ascii="Times New Roman" w:hAnsi="Times New Roman"/>
-                <w:b/>
-                <w:i w:val="0"/>
-                <w:color w:val="000000"/>
-                <w:sz w:val="13"/>
-              </w:rPr>
-              <w:t>F1</w:t>
-            </w:r>
-          </w:p>
-        </w:tc>
-      </w:tr>
-      <w:tr>
-        <w:tc>
-          <w:tcPr>
-            <w:tcW w:type="dxa" w:w="1100"/>
-            <w:tcMar>
-              <w:top w:w="60" w:type="dxa"/>
-              <w:start w:w="80" w:type="dxa"/>
-              <w:bottom w:w="60" w:type="dxa"/>
-              <w:end w:w="80" w:type="dxa"/>
-            </w:tcMar>
-            <w:vAlign w:val="center"/>
-          </w:tcPr>
-          <w:p>
-            <w:pPr>
-              <w:spacing w:after="0"/>
-              <w:jc w:val="left"/>
-            </w:pPr>
-            <w:r/>
-            <w:r>
-              <w:rPr>
-                <w:rFonts w:ascii="Times New Roman" w:hAnsi="Times New Roman"/>
-                <w:b w:val="0"/>
-                <w:i w:val="0"/>
-                <w:color w:val="000000"/>
-                <w:sz w:val="13"/>
-              </w:rPr>
-              <w:t>Shou et al. [5]</w:t>
-            </w:r>
-          </w:p>
-        </w:tc>
-        <w:tc>
-          <w:tcPr>
-            <w:tcW w:type="dxa" w:w="1233"/>
-            <w:tcMar>
-              <w:top w:w="60" w:type="dxa"/>
-              <w:start w:w="80" w:type="dxa"/>
-              <w:bottom w:w="60" w:type="dxa"/>
-              <w:end w:w="80" w:type="dxa"/>
-            </w:tcMar>
-            <w:vAlign w:val="center"/>
-          </w:tcPr>
-          <w:p>
-            <w:pPr>
-              <w:spacing w:after="0"/>
-              <w:jc w:val="center"/>
-            </w:pPr>
-            <w:r/>
-            <w:r>
-              <w:rPr>
-                <w:rFonts w:ascii="Times New Roman" w:hAnsi="Times New Roman"/>
-                <w:b w:val="0"/>
-                <w:i w:val="0"/>
-                <w:color w:val="000000"/>
-                <w:sz w:val="13"/>
-              </w:rPr>
-              <w:t>20% course, MTAPSP daily</w:t>
-            </w:r>
-          </w:p>
-        </w:tc>
-        <w:tc>
-          <w:tcPr>
-            <w:tcW w:type="dxa" w:w="1233"/>
-            <w:tcMar>
-              <w:top w:w="60" w:type="dxa"/>
-              <w:start w:w="80" w:type="dxa"/>
-              <w:bottom w:w="60" w:type="dxa"/>
-              <w:end w:w="80" w:type="dxa"/>
-            </w:tcMar>
-            <w:vAlign w:val="center"/>
-          </w:tcPr>
-          <w:p>
-            <w:pPr>
-              <w:spacing w:after="0"/>
-              <w:jc w:val="center"/>
-            </w:pPr>
-            <w:r/>
-            <w:r>
-              <w:rPr>
-                <w:rFonts w:ascii="Times New Roman" w:hAnsi="Times New Roman"/>
-                <w:b w:val="0"/>
-                <w:i w:val="0"/>
-                <w:color w:val="000000"/>
-                <w:sz w:val="13"/>
-              </w:rPr>
-              <w:t>0,9179</w:t>
-            </w:r>
-          </w:p>
-        </w:tc>
-        <w:tc>
-          <w:tcPr>
-            <w:tcW w:type="dxa" w:w="1234"/>
-            <w:tcMar>
-              <w:top w:w="60" w:type="dxa"/>
-              <w:start w:w="80" w:type="dxa"/>
-              <w:bottom w:w="60" w:type="dxa"/>
-              <w:end w:w="80" w:type="dxa"/>
-            </w:tcMar>
-            <w:vAlign w:val="center"/>
-          </w:tcPr>
-          <w:p>
-            <w:pPr>
-              <w:spacing w:after="0"/>
-              <w:jc w:val="center"/>
-            </w:pPr>
-            <w:r/>
-            <w:r>
-              <w:rPr>
-                <w:rFonts w:ascii="Times New Roman" w:hAnsi="Times New Roman"/>
-                <w:b w:val="0"/>
-                <w:i w:val="0"/>
-                <w:color w:val="000000"/>
-                <w:sz w:val="13"/>
-              </w:rPr>
-              <w:t>0,9180</w:t>
-            </w:r>
-          </w:p>
-        </w:tc>
-      </w:tr>
-      <w:tr>
-        <w:tc>
-          <w:tcPr>
-            <w:tcW w:type="dxa" w:w="1100"/>
-            <w:tcMar>
-              <w:top w:w="60" w:type="dxa"/>
-              <w:start w:w="80" w:type="dxa"/>
-              <w:bottom w:w="60" w:type="dxa"/>
-              <w:end w:w="80" w:type="dxa"/>
-            </w:tcMar>
-            <w:vAlign w:val="center"/>
-          </w:tcPr>
-          <w:p>
-            <w:pPr>
-              <w:spacing w:after="0"/>
-              <w:jc w:val="left"/>
-            </w:pPr>
-            <w:r/>
-            <w:r>
-              <w:rPr>
-                <w:rFonts w:ascii="Times New Roman" w:hAnsi="Times New Roman"/>
-                <w:b w:val="0"/>
-                <w:i w:val="0"/>
-                <w:color w:val="000000"/>
-                <w:sz w:val="13"/>
-              </w:rPr>
-              <w:t>Jawad et al. [6]</w:t>
-            </w:r>
-          </w:p>
-        </w:tc>
-        <w:tc>
-          <w:tcPr>
-            <w:tcW w:type="dxa" w:w="1233"/>
-            <w:tcMar>
-              <w:top w:w="60" w:type="dxa"/>
-              <w:start w:w="80" w:type="dxa"/>
-              <w:bottom w:w="60" w:type="dxa"/>
-              <w:end w:w="80" w:type="dxa"/>
-            </w:tcMar>
-            <w:vAlign w:val="center"/>
-          </w:tcPr>
-          <w:p>
-            <w:pPr>
-              <w:spacing w:after="0"/>
-              <w:jc w:val="center"/>
-            </w:pPr>
-            <w:r/>
-            <w:r>
-              <w:rPr>
-                <w:rFonts w:ascii="Times New Roman" w:hAnsi="Times New Roman"/>
-                <w:b w:val="0"/>
-                <w:i w:val="0"/>
-                <w:color w:val="000000"/>
-                <w:sz w:val="13"/>
-              </w:rPr>
-              <w:t>260 hari + SMOTE, RF</w:t>
-            </w:r>
-          </w:p>
-        </w:tc>
-        <w:tc>
-          <w:tcPr>
-            <w:tcW w:type="dxa" w:w="1233"/>
-            <w:tcMar>
-              <w:top w:w="60" w:type="dxa"/>
-              <w:start w:w="80" w:type="dxa"/>
-              <w:bottom w:w="60" w:type="dxa"/>
-              <w:end w:w="80" w:type="dxa"/>
-            </w:tcMar>
-            <w:vAlign w:val="center"/>
-          </w:tcPr>
-          <w:p>
-            <w:pPr>
-              <w:spacing w:after="0"/>
-              <w:jc w:val="center"/>
-            </w:pPr>
-            <w:r/>
-            <w:r>
-              <w:rPr>
-                <w:rFonts w:ascii="Times New Roman" w:hAnsi="Times New Roman"/>
-                <w:b w:val="0"/>
-                <w:i w:val="0"/>
-                <w:color w:val="000000"/>
-                <w:sz w:val="13"/>
-              </w:rPr>
-              <w:t>0,8920</w:t>
-            </w:r>
-          </w:p>
-        </w:tc>
-        <w:tc>
-          <w:tcPr>
-            <w:tcW w:type="dxa" w:w="1234"/>
-            <w:tcMar>
-              <w:top w:w="60" w:type="dxa"/>
-              <w:start w:w="80" w:type="dxa"/>
-              <w:bottom w:w="60" w:type="dxa"/>
-              <w:end w:w="80" w:type="dxa"/>
-            </w:tcMar>
-            <w:vAlign w:val="center"/>
-          </w:tcPr>
-          <w:p>
-            <w:pPr>
-              <w:spacing w:after="0"/>
-              <w:jc w:val="center"/>
-            </w:pPr>
-            <w:r/>
-            <w:r>
-              <w:rPr>
-                <w:rFonts w:ascii="Times New Roman" w:hAnsi="Times New Roman"/>
-                <w:b w:val="0"/>
-                <w:i w:val="0"/>
-                <w:color w:val="000000"/>
-                <w:sz w:val="13"/>
-              </w:rPr>
-              <w:t>-</w:t>
-            </w:r>
-          </w:p>
-        </w:tc>
-      </w:tr>
-      <w:tr>
-        <w:tc>
-          <w:tcPr>
-            <w:tcW w:type="dxa" w:w="1100"/>
-            <w:tcMar>
-              <w:top w:w="60" w:type="dxa"/>
-              <w:start w:w="80" w:type="dxa"/>
-              <w:bottom w:w="60" w:type="dxa"/>
-              <w:end w:w="80" w:type="dxa"/>
-            </w:tcMar>
-            <w:vAlign w:val="center"/>
-          </w:tcPr>
-          <w:p>
-            <w:pPr>
-              <w:spacing w:after="0"/>
-              <w:jc w:val="left"/>
-            </w:pPr>
-            <w:r/>
-            <w:r>
-              <w:rPr>
-                <w:rFonts w:ascii="Times New Roman" w:hAnsi="Times New Roman"/>
-                <w:b w:val="0"/>
-                <w:i w:val="0"/>
-                <w:color w:val="000000"/>
-                <w:sz w:val="13"/>
-              </w:rPr>
-              <w:t>Balabied dan Eid [7]</w:t>
-            </w:r>
-          </w:p>
-        </w:tc>
-        <w:tc>
-          <w:tcPr>
-            <w:tcW w:type="dxa" w:w="1233"/>
-            <w:tcMar>
-              <w:top w:w="60" w:type="dxa"/>
-              <w:start w:w="80" w:type="dxa"/>
-              <w:bottom w:w="60" w:type="dxa"/>
-              <w:end w:w="80" w:type="dxa"/>
-            </w:tcMar>
-            <w:vAlign w:val="center"/>
-          </w:tcPr>
-          <w:p>
-            <w:pPr>
-              <w:spacing w:after="0"/>
-              <w:jc w:val="center"/>
-            </w:pPr>
-            <w:r/>
-            <w:r>
-              <w:rPr>
-                <w:rFonts w:ascii="Times New Roman" w:hAnsi="Times New Roman"/>
-                <w:b w:val="0"/>
-                <w:i w:val="0"/>
-                <w:color w:val="000000"/>
-                <w:sz w:val="13"/>
-              </w:rPr>
-              <w:t>Binary, RF</w:t>
-            </w:r>
-          </w:p>
-        </w:tc>
-        <w:tc>
-          <w:tcPr>
-            <w:tcW w:type="dxa" w:w="1233"/>
-            <w:tcMar>
-              <w:top w:w="60" w:type="dxa"/>
-              <w:start w:w="80" w:type="dxa"/>
-              <w:bottom w:w="60" w:type="dxa"/>
-              <w:end w:w="80" w:type="dxa"/>
-            </w:tcMar>
-            <w:vAlign w:val="center"/>
-          </w:tcPr>
-          <w:p>
-            <w:pPr>
-              <w:spacing w:after="0"/>
-              <w:jc w:val="center"/>
-            </w:pPr>
-            <w:r/>
-            <w:r>
-              <w:rPr>
-                <w:rFonts w:ascii="Times New Roman" w:hAnsi="Times New Roman"/>
-                <w:b w:val="0"/>
-                <w:i w:val="0"/>
-                <w:color w:val="000000"/>
-                <w:sz w:val="13"/>
-              </w:rPr>
-              <w:t>0,9000</w:t>
-            </w:r>
-          </w:p>
-        </w:tc>
-        <w:tc>
-          <w:tcPr>
-            <w:tcW w:type="dxa" w:w="1234"/>
-            <w:tcMar>
-              <w:top w:w="60" w:type="dxa"/>
-              <w:start w:w="80" w:type="dxa"/>
-              <w:bottom w:w="60" w:type="dxa"/>
-              <w:end w:w="80" w:type="dxa"/>
-            </w:tcMar>
-            <w:vAlign w:val="center"/>
-          </w:tcPr>
-          <w:p>
-            <w:pPr>
-              <w:spacing w:after="0"/>
-              <w:jc w:val="center"/>
-            </w:pPr>
-            <w:r/>
-            <w:r>
-              <w:rPr>
-                <w:rFonts w:ascii="Times New Roman" w:hAnsi="Times New Roman"/>
-                <w:b w:val="0"/>
-                <w:i w:val="0"/>
-                <w:color w:val="000000"/>
-                <w:sz w:val="13"/>
-              </w:rPr>
-              <w:t>0,9000</w:t>
-            </w:r>
-          </w:p>
-        </w:tc>
-      </w:tr>
-      <w:tr>
-        <w:tc>
-          <w:tcPr>
-            <w:tcW w:type="dxa" w:w="1100"/>
-            <w:tcMar>
-              <w:top w:w="60" w:type="dxa"/>
-              <w:start w:w="80" w:type="dxa"/>
-              <w:bottom w:w="60" w:type="dxa"/>
-              <w:end w:w="80" w:type="dxa"/>
-            </w:tcMar>
-            <w:vAlign w:val="center"/>
-          </w:tcPr>
-          <w:p>
-            <w:pPr>
-              <w:spacing w:after="0"/>
-              <w:jc w:val="left"/>
-            </w:pPr>
-            <w:r/>
-            <w:r>
-              <w:rPr>
-                <w:rFonts w:ascii="Times New Roman" w:hAnsi="Times New Roman"/>
-                <w:b w:val="0"/>
-                <w:i w:val="0"/>
-                <w:color w:val="000000"/>
-                <w:sz w:val="13"/>
-              </w:rPr>
-              <w:t>Ujkani et al. [8]</w:t>
-            </w:r>
-          </w:p>
-        </w:tc>
-        <w:tc>
-          <w:tcPr>
-            <w:tcW w:type="dxa" w:w="1233"/>
-            <w:tcMar>
-              <w:top w:w="60" w:type="dxa"/>
-              <w:start w:w="80" w:type="dxa"/>
-              <w:bottom w:w="60" w:type="dxa"/>
-              <w:end w:w="80" w:type="dxa"/>
-            </w:tcMar>
-            <w:vAlign w:val="center"/>
-          </w:tcPr>
-          <w:p>
-            <w:pPr>
-              <w:spacing w:after="0"/>
-              <w:jc w:val="center"/>
-            </w:pPr>
-            <w:r/>
-            <w:r>
-              <w:rPr>
-                <w:rFonts w:ascii="Times New Roman" w:hAnsi="Times New Roman"/>
-                <w:b w:val="0"/>
-                <w:i w:val="0"/>
-                <w:color w:val="000000"/>
-                <w:sz w:val="13"/>
-              </w:rPr>
-              <w:t>At-risk binary, custom NN</w:t>
-            </w:r>
-          </w:p>
-        </w:tc>
-        <w:tc>
-          <w:tcPr>
-            <w:tcW w:type="dxa" w:w="1233"/>
-            <w:tcMar>
-              <w:top w:w="60" w:type="dxa"/>
-              <w:start w:w="80" w:type="dxa"/>
-              <w:bottom w:w="60" w:type="dxa"/>
-              <w:end w:w="80" w:type="dxa"/>
-            </w:tcMar>
-            <w:vAlign w:val="center"/>
-          </w:tcPr>
-          <w:p>
-            <w:pPr>
-              <w:spacing w:after="0"/>
-              <w:jc w:val="center"/>
-            </w:pPr>
-            <w:r/>
-            <w:r>
-              <w:rPr>
-                <w:rFonts w:ascii="Times New Roman" w:hAnsi="Times New Roman"/>
-                <w:b w:val="0"/>
-                <w:i w:val="0"/>
-                <w:color w:val="000000"/>
-                <w:sz w:val="13"/>
-              </w:rPr>
-              <w:t>0,9300</w:t>
-            </w:r>
-          </w:p>
-        </w:tc>
-        <w:tc>
-          <w:tcPr>
-            <w:tcW w:type="dxa" w:w="1234"/>
-            <w:tcMar>
-              <w:top w:w="60" w:type="dxa"/>
-              <w:start w:w="80" w:type="dxa"/>
-              <w:bottom w:w="60" w:type="dxa"/>
-              <w:end w:w="80" w:type="dxa"/>
-            </w:tcMar>
-            <w:vAlign w:val="center"/>
-          </w:tcPr>
-          <w:p>
-            <w:pPr>
-              <w:spacing w:after="0"/>
-              <w:jc w:val="center"/>
-            </w:pPr>
-            <w:r/>
-            <w:r>
-              <w:rPr>
-                <w:rFonts w:ascii="Times New Roman" w:hAnsi="Times New Roman"/>
-                <w:b w:val="0"/>
-                <w:i w:val="0"/>
-                <w:color w:val="000000"/>
-                <w:sz w:val="13"/>
-              </w:rPr>
-              <w:t>0,9600</w:t>
-            </w:r>
-          </w:p>
-        </w:tc>
-      </w:tr>
-      <w:tr>
-        <w:tc>
-          <w:tcPr>
-            <w:tcW w:type="dxa" w:w="1100"/>
-            <w:tcMar>
-              <w:top w:w="60" w:type="dxa"/>
-              <w:start w:w="80" w:type="dxa"/>
-              <w:bottom w:w="60" w:type="dxa"/>
-              <w:end w:w="80" w:type="dxa"/>
-            </w:tcMar>
-            <w:vAlign w:val="center"/>
-          </w:tcPr>
-          <w:p>
-            <w:pPr>
-              <w:spacing w:after="0"/>
-              <w:jc w:val="left"/>
-            </w:pPr>
-            <w:r/>
-            <w:r>
-              <w:rPr>
-                <w:rFonts w:ascii="Times New Roman" w:hAnsi="Times New Roman"/>
-                <w:b w:val="0"/>
-                <w:i w:val="0"/>
-                <w:color w:val="000000"/>
-                <w:sz w:val="13"/>
-              </w:rPr>
-              <w:t>Alnasyan et al. [9]</w:t>
-            </w:r>
-          </w:p>
-        </w:tc>
-        <w:tc>
-          <w:tcPr>
-            <w:tcW w:type="dxa" w:w="1233"/>
-            <w:tcMar>
-              <w:top w:w="60" w:type="dxa"/>
-              <w:start w:w="80" w:type="dxa"/>
-              <w:bottom w:w="60" w:type="dxa"/>
-              <w:end w:w="80" w:type="dxa"/>
-            </w:tcMar>
-            <w:vAlign w:val="center"/>
-          </w:tcPr>
-          <w:p>
-            <w:pPr>
-              <w:spacing w:after="0"/>
-              <w:jc w:val="center"/>
-            </w:pPr>
-            <w:r/>
-            <w:r>
-              <w:rPr>
-                <w:rFonts w:ascii="Times New Roman" w:hAnsi="Times New Roman"/>
-                <w:b w:val="0"/>
-                <w:i w:val="0"/>
-                <w:color w:val="000000"/>
-                <w:sz w:val="13"/>
-              </w:rPr>
-              <w:t>At-risk binary, KANFormer</w:t>
-            </w:r>
-          </w:p>
-        </w:tc>
-        <w:tc>
-          <w:tcPr>
-            <w:tcW w:type="dxa" w:w="1233"/>
-            <w:tcMar>
-              <w:top w:w="60" w:type="dxa"/>
-              <w:start w:w="80" w:type="dxa"/>
-              <w:bottom w:w="60" w:type="dxa"/>
-              <w:end w:w="80" w:type="dxa"/>
-            </w:tcMar>
-            <w:vAlign w:val="center"/>
-          </w:tcPr>
-          <w:p>
-            <w:pPr>
-              <w:spacing w:after="0"/>
-              <w:jc w:val="center"/>
-            </w:pPr>
-            <w:r/>
-            <w:r>
-              <w:rPr>
-                <w:rFonts w:ascii="Times New Roman" w:hAnsi="Times New Roman"/>
-                <w:b w:val="0"/>
-                <w:i w:val="0"/>
-                <w:color w:val="000000"/>
-                <w:sz w:val="13"/>
-              </w:rPr>
-              <w:t>0,9459</w:t>
-            </w:r>
-          </w:p>
-        </w:tc>
-        <w:tc>
-          <w:tcPr>
-            <w:tcW w:type="dxa" w:w="1234"/>
-            <w:tcMar>
-              <w:top w:w="60" w:type="dxa"/>
-              <w:start w:w="80" w:type="dxa"/>
-              <w:bottom w:w="60" w:type="dxa"/>
-              <w:end w:w="80" w:type="dxa"/>
-            </w:tcMar>
-            <w:vAlign w:val="center"/>
-          </w:tcPr>
-          <w:p>
-            <w:pPr>
-              <w:spacing w:after="0"/>
-              <w:jc w:val="center"/>
-            </w:pPr>
-            <w:r/>
-            <w:r>
-              <w:rPr>
-                <w:rFonts w:ascii="Times New Roman" w:hAnsi="Times New Roman"/>
-                <w:b w:val="0"/>
-                <w:i w:val="0"/>
-                <w:color w:val="000000"/>
-                <w:sz w:val="13"/>
-              </w:rPr>
-              <w:t>0,9481</w:t>
-            </w:r>
-          </w:p>
-        </w:tc>
-      </w:tr>
-      <w:tr>
-        <w:tc>
-          <w:tcPr>
-            <w:tcW w:type="dxa" w:w="1100"/>
-            <w:tcMar>
-              <w:top w:w="60" w:type="dxa"/>
-              <w:start w:w="80" w:type="dxa"/>
-              <w:bottom w:w="60" w:type="dxa"/>
-              <w:end w:w="80" w:type="dxa"/>
-            </w:tcMar>
-            <w:vAlign w:val="center"/>
-          </w:tcPr>
-          <w:p>
-            <w:pPr>
-              <w:spacing w:after="0"/>
-              <w:jc w:val="left"/>
-            </w:pPr>
-            <w:r/>
-            <w:r>
-              <w:rPr>
-                <w:rFonts w:ascii="Times New Roman" w:hAnsi="Times New Roman"/>
-                <w:b w:val="0"/>
-                <w:i w:val="0"/>
-                <w:color w:val="000000"/>
-                <w:sz w:val="13"/>
-              </w:rPr>
-              <w:t>Penelitian ini</w:t>
-            </w:r>
-          </w:p>
-        </w:tc>
-        <w:tc>
-          <w:tcPr>
-            <w:tcW w:type="dxa" w:w="1233"/>
-            <w:tcMar>
-              <w:top w:w="60" w:type="dxa"/>
-              <w:start w:w="80" w:type="dxa"/>
-              <w:bottom w:w="60" w:type="dxa"/>
-              <w:end w:w="80" w:type="dxa"/>
-            </w:tcMar>
-            <w:vAlign w:val="center"/>
-          </w:tcPr>
-          <w:p>
-            <w:pPr>
-              <w:spacing w:after="0"/>
-              <w:jc w:val="center"/>
-            </w:pPr>
-            <w:r/>
-            <w:r>
-              <w:rPr>
-                <w:rFonts w:ascii="Times New Roman" w:hAnsi="Times New Roman"/>
-                <w:b w:val="0"/>
-                <w:i w:val="0"/>
-                <w:color w:val="000000"/>
-                <w:sz w:val="13"/>
-              </w:rPr>
-              <w:t>Hari ke-28, group split, RF</w:t>
-            </w:r>
-          </w:p>
-        </w:tc>
-        <w:tc>
-          <w:tcPr>
-            <w:tcW w:type="dxa" w:w="1233"/>
-            <w:tcMar>
-              <w:top w:w="60" w:type="dxa"/>
-              <w:start w:w="80" w:type="dxa"/>
-              <w:bottom w:w="60" w:type="dxa"/>
-              <w:end w:w="80" w:type="dxa"/>
-            </w:tcMar>
-            <w:vAlign w:val="center"/>
-          </w:tcPr>
-          <w:p>
-            <w:pPr>
-              <w:spacing w:after="0"/>
-              <w:jc w:val="center"/>
-            </w:pPr>
-            <w:r/>
-            <w:r>
-              <w:rPr>
-                <w:rFonts w:ascii="Times New Roman" w:hAnsi="Times New Roman"/>
-                <w:b w:val="0"/>
-                <w:i w:val="0"/>
-                <w:color w:val="000000"/>
-                <w:sz w:val="13"/>
-              </w:rPr>
-              <w:t>0,7594</w:t>
-            </w:r>
-          </w:p>
-        </w:tc>
-        <w:tc>
-          <w:tcPr>
-            <w:tcW w:type="dxa" w:w="1234"/>
-            <w:tcMar>
-              <w:top w:w="60" w:type="dxa"/>
-              <w:start w:w="80" w:type="dxa"/>
-              <w:bottom w:w="60" w:type="dxa"/>
-              <w:end w:w="80" w:type="dxa"/>
-            </w:tcMar>
-            <w:vAlign w:val="center"/>
-          </w:tcPr>
-          <w:p>
-            <w:pPr>
-              <w:spacing w:after="0"/>
-              <w:jc w:val="center"/>
-            </w:pPr>
-            <w:r/>
-            <w:r>
-              <w:rPr>
-                <w:rFonts w:ascii="Times New Roman" w:hAnsi="Times New Roman"/>
-                <w:b w:val="0"/>
-                <w:i w:val="0"/>
-                <w:color w:val="000000"/>
-                <w:sz w:val="13"/>
-              </w:rPr>
-              <w:t>0,7589</w:t>
-            </w:r>
-          </w:p>
-        </w:tc>
-      </w:tr>
-    </w:tbl>
     <w:p>
       <w:pPr>
-        <w:spacing w:before="0" w:after="140" w:line="240" w:lineRule="auto"/>
+        <w:keepLines/>
+        <w:spacing w:before="20" w:after="80"/>
+        <w:jc w:val="center"/>
       </w:pPr>
+      <w:r>
+        <w:rPr>
+          <w:rFonts w:ascii="Times New Roman" w:hAnsi="Times New Roman"/>
+          <w:b w:val="0"/>
+          <w:i w:val="0"/>
+          <w:color w:val="000000"/>
+          <w:sz w:val="16"/>
+        </w:rPr>
+        <w:t>Fig. 5. Benchmark accuracy dan F1-score penelitian berbasis OULAD. Perbandingan bersifat kontekstual karena perbedaan horizon, data split, balancing, dan model.</w:t>
+      </w:r>
     </w:p>
     <w:p>
       <w:pPr>
@@ -6205,7 +5386,7 @@
           <w:color w:val="000000"/>
           <w:sz w:val="16"/>
         </w:rPr>
-        <w:t>TABLE IV</w:t>
+        <w:t>TABLE III</w:t>
         <w:br/>
       </w:r>
       <w:r>
@@ -6701,7 +5882,7 @@
           <w:color w:val="000000"/>
           <w:sz w:val="20"/>
         </w:rPr>
-        <w:t xml:space="preserve">Dashboard pada Fig. 5 mengidentifikasi 3.795 student-module-presentation dalam antrean </w:t>
+        <w:t xml:space="preserve">Dashboard pada Fig. 6 mengidentifikasi 3.795 student-module-presentation dalam antrean </w:t>
       </w:r>
       <w:r>
         <w:rPr>
@@ -6774,7 +5955,7 @@
         <w:drawing>
           <wp:inline xmlns:a="http://schemas.openxmlformats.org/drawingml/2006/main" xmlns:pic="http://schemas.openxmlformats.org/drawingml/2006/picture">
             <wp:extent cx="2971800" cy="2676246"/>
-            <wp:docPr id="5" name="Picture 5" descr="Fig. 5. Dashboard early warning OULAD pada akhir minggu keempat." title="Fig"/>
+            <wp:docPr id="6" name="Picture 6" descr="Fig. 6. Dashboard early warning OULAD pada akhir minggu keempat." title="Fig"/>
             <wp:cNvGraphicFramePr>
               <a:graphicFrameLocks noChangeAspect="1"/>
             </wp:cNvGraphicFramePr>
@@ -6786,7 +5967,7 @@
                     <pic:cNvPicPr/>
                   </pic:nvPicPr>
                   <pic:blipFill>
-                    <a:blip r:embed="rId13"/>
+                    <a:blip r:embed="rId14"/>
                     <a:stretch>
                       <a:fillRect/>
                     </a:stretch>
@@ -6819,7 +6000,7 @@
           <w:color w:val="000000"/>
           <w:sz w:val="16"/>
         </w:rPr>
-        <w:t>Fig. 5. Dashboard early warning OULAD pada akhir minggu keempat.</w:t>
+        <w:t>Fig. 6. Dashboard early warning OULAD pada akhir minggu keempat.</w:t>
       </w:r>
     </w:p>
     <w:p>

</xml_diff>

<commit_message>
docs(research): align early warning title
</commit_message>
<xml_diff>
--- a/docs/artikel-ieee/Artikel IEEE - Early Warning OULAD.docx
+++ b/docs/artikel-ieee/Artikel IEEE - Early Warning OULAD.docx
@@ -13,7 +13,7 @@
           <w:color w:val="000000"/>
           <w:sz w:val="48"/>
         </w:rPr>
-        <w:t>Early Warning Risiko Gagal atau Mengundurkan Diri dari Mata Kuliah pada Minggu Keempat Menggunakan Supervised Learning dan Knowledge-Based Risk Layer pada Open University Learning Analytics Dataset</w:t>
+        <w:t>Early Warning Risiko Ketidakberhasilan Mahasiswa dalam Mata Kuliah pada Minggu Keempat Menggunakan Supervised Learning dan Knowledge-Based Risk Layer pada Open University Learning Analytics Dataset</w:t>
       </w:r>
     </w:p>
     <w:tbl>
@@ -419,7 +419,7 @@
           <w:color w:val="000000"/>
           <w:sz w:val="18"/>
         </w:rPr>
-        <w:t xml:space="preserve">Hasil akhir mata kuliah memberi informasi penting bagi monitoring akademik dan perencanaan intervensi dini. Penelitian ini mengembangkan early warning risiko gagal atau mengundurkan diri dari mata kuliah pada akhir minggu keempat menggunakan Open University Learning Analytics Dataset (OULAD). Setiap baris merepresentasikan satu mahasiswa pada satu module-presentation. Target dirumuskan sebagai klasifikasi biner, yaitu </w:t>
+        <w:t xml:space="preserve">Hasil akhir mata kuliah memberi informasi penting bagi monitoring akademik dan perencanaan intervensi dini. Penelitian ini mengembangkan early warning risiko ketidakberhasilan mahasiswa dalam mata kuliah pada akhir minggu keempat menggunakan Open University Learning Analytics Dataset (OULAD). Setiap baris merepresentasikan satu mahasiswa pada satu module-presentation. Target dirumuskan sebagai klasifikasi biner, yaitu </w:t>
       </w:r>
       <w:r>
         <w:rPr>
@@ -747,7 +747,7 @@
           <w:color w:val="000000"/>
           <w:sz w:val="20"/>
         </w:rPr>
-        <w:t>Penelitian ini bertujuan mengembangkan klasifikasi biner risiko gagal atau mengundurkan diri dari mata kuliah pada minggu keempat, mengevaluasi tiga algoritma supervised learning, dan mengintegrasikan model terpilih dengan knowledge-based risk layer. Hasil sistem diterjemahkan menjadi dashboard Business Intelligence untuk monitoring risiko dan prioritas intervensi akademik pada tingkat module-presentation.</w:t>
+        <w:t>Penelitian ini bertujuan mengembangkan klasifikasi biner risiko ketidakberhasilan mahasiswa dalam mata kuliah pada minggu keempat, mengevaluasi tiga algoritma supervised learning, dan mengintegrasikan model terpilih dengan knowledge-based risk layer. Hasil sistem diterjemahkan menjadi dashboard Business Intelligence untuk monitoring risiko dan prioritas intervensi akademik pada tingkat module-presentation.</w:t>
       </w:r>
     </w:p>
     <w:p>
@@ -1017,7 +1017,7 @@
           <w:color w:val="000000"/>
           <w:sz w:val="20"/>
         </w:rPr>
-        <w:t xml:space="preserve">Penelitian menggunakan supervised binary classification untuk mendeteksi risiko gagal atau mengundurkan diri dari mata kuliah pada akhir minggu keempat. Alurnya mencakup audit OULAD, pembentukan fitur dengan cut-off temporal, exploratory data analysis, pemisahan berbasis mahasiswa, evaluasi model, knowledge-based risk layer, dan dashboard Business Intelligence. Seluruh eksperimen menggunakan </w:t>
+        <w:t xml:space="preserve">Penelitian menggunakan supervised binary classification untuk mendeteksi risiko ketidakberhasilan mahasiswa dalam mata kuliah pada akhir minggu keempat. Alurnya mencakup audit OULAD, pembentukan fitur dengan cut-off temporal, exploratory data analysis, pemisahan berbasis mahasiswa, evaluasi model, knowledge-based risk layer, dan dashboard Business Intelligence. Seluruh eksperimen menggunakan </w:t>
       </w:r>
       <w:r>
         <w:rPr>
@@ -6139,7 +6139,7 @@
           <w:color w:val="000000"/>
           <w:sz w:val="20"/>
         </w:rPr>
-        <w:t xml:space="preserve">Penelitian ini mengembangkan early warning risiko gagal atau mengundurkan diri dari mata kuliah pada akhir minggu keempat menggunakan OULAD. Dataset dibentuk pada unit student-module-presentation dengan fitur demografis, registrasi awal, assessment, dan aktivitas VLE sampai hari ke-28. Pemisahan berbasis </w:t>
+        <w:t xml:space="preserve">Penelitian ini mengembangkan early warning risiko ketidakberhasilan mahasiswa dalam mata kuliah pada akhir minggu keempat menggunakan OULAD. Dataset dibentuk pada unit student-module-presentation dengan fitur demografis, registrasi awal, assessment, dan aktivitas VLE sampai hari ke-28. Pemisahan berbasis </w:t>
       </w:r>
       <w:r>
         <w:rPr>

</xml_diff>

<commit_message>
docs(article): unify figures from notebook output
</commit_message>
<xml_diff>
--- a/docs/artikel-ieee/Artikel IEEE - Early Warning OULAD.docx
+++ b/docs/artikel-ieee/Artikel IEEE - Early Warning OULAD.docx
@@ -4889,7 +4889,7 @@
       <w:r>
         <w:drawing>
           <wp:inline xmlns:a="http://schemas.openxmlformats.org/drawingml/2006/main" xmlns:pic="http://schemas.openxmlformats.org/drawingml/2006/picture">
-            <wp:extent cx="2971800" cy="2176023"/>
+            <wp:extent cx="2971800" cy="2286727"/>
             <wp:docPr id="2" name="Picture 2" descr="Fig. 2. Confusion matrix Random Forest pada hold-out test." title="Fig"/>
             <wp:cNvGraphicFramePr>
               <a:graphicFrameLocks noChangeAspect="1"/>
@@ -4910,7 +4910,7 @@
                   <pic:spPr>
                     <a:xfrm>
                       <a:off x="0" y="0"/>
-                      <a:ext cx="2971800" cy="2176023"/>
+                      <a:ext cx="2971800" cy="2286727"/>
                     </a:xfrm>
                     <a:prstGeom prst="rect"/>
                   </pic:spPr>
@@ -4947,7 +4947,7 @@
       <w:r>
         <w:drawing>
           <wp:inline xmlns:a="http://schemas.openxmlformats.org/drawingml/2006/main" xmlns:pic="http://schemas.openxmlformats.org/drawingml/2006/picture">
-            <wp:extent cx="2971800" cy="2172736"/>
+            <wp:extent cx="2971800" cy="2102853"/>
             <wp:docPr id="3" name="Picture 3" descr="Fig. 3. Kurva ROC model pada hold-out test." title="Fig"/>
             <wp:cNvGraphicFramePr>
               <a:graphicFrameLocks noChangeAspect="1"/>
@@ -4968,7 +4968,7 @@
                   <pic:spPr>
                     <a:xfrm>
                       <a:off x="0" y="0"/>
-                      <a:ext cx="2971800" cy="2172736"/>
+                      <a:ext cx="2971800" cy="2102853"/>
                     </a:xfrm>
                     <a:prstGeom prst="rect"/>
                   </pic:spPr>
@@ -5171,7 +5171,7 @@
       <w:r>
         <w:drawing>
           <wp:inline xmlns:a="http://schemas.openxmlformats.org/drawingml/2006/main" xmlns:pic="http://schemas.openxmlformats.org/drawingml/2006/picture">
-            <wp:extent cx="2971800" cy="2311906"/>
+            <wp:extent cx="2971800" cy="1585578"/>
             <wp:docPr id="5" name="Picture 5" descr="Fig. 5. Benchmark accuracy dan F1-score penelitian berbasis OULAD. Perbandingan bersifat kontekstual karena perbedaan horizon, data split, balancing, dan model." title="Fig"/>
             <wp:cNvGraphicFramePr>
               <a:graphicFrameLocks noChangeAspect="1"/>
@@ -5192,7 +5192,7 @@
                   <pic:spPr>
                     <a:xfrm>
                       <a:off x="0" y="0"/>
-                      <a:ext cx="2971800" cy="2311906"/>
+                      <a:ext cx="2971800" cy="1585578"/>
                     </a:xfrm>
                     <a:prstGeom prst="rect"/>
                   </pic:spPr>

</xml_diff>

<commit_message>
docs(article): restore benchmark dot plot
</commit_message>
<xml_diff>
--- a/docs/artikel-ieee/Artikel IEEE - Early Warning OULAD.docx
+++ b/docs/artikel-ieee/Artikel IEEE - Early Warning OULAD.docx
@@ -5171,7 +5171,7 @@
       <w:r>
         <w:drawing>
           <wp:inline xmlns:a="http://schemas.openxmlformats.org/drawingml/2006/main" xmlns:pic="http://schemas.openxmlformats.org/drawingml/2006/picture">
-            <wp:extent cx="2971800" cy="1585578"/>
+            <wp:extent cx="2971800" cy="2203784"/>
             <wp:docPr id="5" name="Picture 5" descr="Fig. 5. Benchmark accuracy dan F1-score penelitian berbasis OULAD. Perbandingan bersifat kontekstual karena perbedaan horizon, data split, balancing, dan model." title="Fig"/>
             <wp:cNvGraphicFramePr>
               <a:graphicFrameLocks noChangeAspect="1"/>
@@ -5192,7 +5192,7 @@
                   <pic:spPr>
                     <a:xfrm>
                       <a:off x="0" y="0"/>
-                      <a:ext cx="2971800" cy="1585578"/>
+                      <a:ext cx="2971800" cy="2203784"/>
                     </a:xfrm>
                     <a:prstGeom prst="rect"/>
                   </pic:spPr>

</xml_diff>

<commit_message>
docs(article): reorder author list
</commit_message>
<xml_diff>
--- a/docs/artikel-ieee/Artikel IEEE - Early Warning OULAD.docx
+++ b/docs/artikel-ieee/Artikel IEEE - Early Warning OULAD.docx
@@ -122,6 +122,73 @@
                 <w:color w:val="000000"/>
                 <w:sz w:val="20"/>
               </w:rPr>
+              <w:t>Heri Santosa</w:t>
+            </w:r>
+            <w:r>
+              <w:rPr>
+                <w:rFonts w:ascii="Times New Roman" w:hAnsi="Times New Roman"/>
+                <w:i w:val="0"/>
+                <w:color w:val="000000"/>
+                <w:sz w:val="18"/>
+              </w:rPr>
+              <w:br/>
+              <w:t>Department of Computer Science</w:t>
+            </w:r>
+            <w:r>
+              <w:rPr>
+                <w:rFonts w:ascii="Times New Roman" w:hAnsi="Times New Roman"/>
+                <w:i w:val="0"/>
+                <w:color w:val="000000"/>
+                <w:sz w:val="18"/>
+              </w:rPr>
+              <w:br/>
+              <w:t>Universitas Amikom Yogyakarta</w:t>
+            </w:r>
+            <w:r>
+              <w:rPr>
+                <w:rFonts w:ascii="Times New Roman" w:hAnsi="Times New Roman"/>
+                <w:i w:val="0"/>
+                <w:color w:val="000000"/>
+                <w:sz w:val="18"/>
+              </w:rPr>
+              <w:br/>
+              <w:t>Yogyakarta, Indonesia</w:t>
+            </w:r>
+            <w:r>
+              <w:rPr>
+                <w:rFonts w:ascii="Times New Roman" w:hAnsi="Times New Roman"/>
+                <w:i/>
+                <w:color w:val="000000"/>
+                <w:sz w:val="17"/>
+              </w:rPr>
+              <w:br/>
+              <w:t>heri.sant@students.amikom.ac.id</w:t>
+            </w:r>
+          </w:p>
+        </w:tc>
+        <w:tc>
+          <w:tcPr>
+            <w:tcW w:type="dxa" w:w="3420"/>
+            <w:tcMar>
+              <w:top w:w="60" w:type="dxa"/>
+              <w:start w:w="80" w:type="dxa"/>
+              <w:bottom w:w="60" w:type="dxa"/>
+              <w:end w:w="80" w:type="dxa"/>
+            </w:tcMar>
+            <w:tcBorders/>
+          </w:tcPr>
+          <w:p>
+            <w:pPr>
+              <w:spacing w:after="0"/>
+              <w:jc w:val="center"/>
+            </w:pPr>
+            <w:r>
+              <w:rPr>
+                <w:rFonts w:ascii="Times New Roman" w:hAnsi="Times New Roman"/>
+                <w:i w:val="0"/>
+                <w:color w:val="000000"/>
+                <w:sz w:val="20"/>
+              </w:rPr>
               <w:t>Alwie Muflich</w:t>
             </w:r>
             <w:r>
@@ -163,73 +230,6 @@
               </w:rPr>
               <w:br/>
               <w:t>alwiemuflich@students.amikom.ac.id</w:t>
-            </w:r>
-          </w:p>
-        </w:tc>
-        <w:tc>
-          <w:tcPr>
-            <w:tcW w:type="dxa" w:w="3420"/>
-            <w:tcMar>
-              <w:top w:w="60" w:type="dxa"/>
-              <w:start w:w="80" w:type="dxa"/>
-              <w:bottom w:w="60" w:type="dxa"/>
-              <w:end w:w="80" w:type="dxa"/>
-            </w:tcMar>
-            <w:tcBorders/>
-          </w:tcPr>
-          <w:p>
-            <w:pPr>
-              <w:spacing w:after="0"/>
-              <w:jc w:val="center"/>
-            </w:pPr>
-            <w:r>
-              <w:rPr>
-                <w:rFonts w:ascii="Times New Roman" w:hAnsi="Times New Roman"/>
-                <w:i w:val="0"/>
-                <w:color w:val="000000"/>
-                <w:sz w:val="20"/>
-              </w:rPr>
-              <w:t>Heri Santosa</w:t>
-            </w:r>
-            <w:r>
-              <w:rPr>
-                <w:rFonts w:ascii="Times New Roman" w:hAnsi="Times New Roman"/>
-                <w:i w:val="0"/>
-                <w:color w:val="000000"/>
-                <w:sz w:val="18"/>
-              </w:rPr>
-              <w:br/>
-              <w:t>Department of Computer Science</w:t>
-            </w:r>
-            <w:r>
-              <w:rPr>
-                <w:rFonts w:ascii="Times New Roman" w:hAnsi="Times New Roman"/>
-                <w:i w:val="0"/>
-                <w:color w:val="000000"/>
-                <w:sz w:val="18"/>
-              </w:rPr>
-              <w:br/>
-              <w:t>Universitas Amikom Yogyakarta</w:t>
-            </w:r>
-            <w:r>
-              <w:rPr>
-                <w:rFonts w:ascii="Times New Roman" w:hAnsi="Times New Roman"/>
-                <w:i w:val="0"/>
-                <w:color w:val="000000"/>
-                <w:sz w:val="18"/>
-              </w:rPr>
-              <w:br/>
-              <w:t>Yogyakarta, Indonesia</w:t>
-            </w:r>
-            <w:r>
-              <w:rPr>
-                <w:rFonts w:ascii="Times New Roman" w:hAnsi="Times New Roman"/>
-                <w:i/>
-                <w:color w:val="000000"/>
-                <w:sz w:val="17"/>
-              </w:rPr>
-              <w:br/>
-              <w:t>heri.sant@students.amikom.ac.id</w:t>
             </w:r>
           </w:p>
         </w:tc>

</xml_diff>